<commit_message>
Point index.html to v2; clean (non-red) submission artifacts; Table A1 polish
- index.html: now serves the v2 proposal behind the password gate, with package
  download links updated to the v2-dated files; change-marks rendered clean black.
- Submission PDF, DOCX, Word-PDF: regenerated with the red v2 change-marks
  neutralized to black (clean for submission); core 2.5.4-2.5.9 stays 10 pages
  (builder asserts it). The uploaded document correctly includes 2.5.1-2.5.3
  (title, abstract, glossary) per call section 2.5; only 2.5.4-2.5.9 is capped.
- Table A1: "deliverables" -> "artifacts" (the five artifacts are not D1-D3).

Co-Authored-By: Claude Opus 4.8 <noreply@anthropic.com>
</commit_message>
<xml_diff>
--- a/JouleFlex-proposal-v2-2026-10-01.docx
+++ b/JouleFlex-proposal-v2-2026-10-01.docx
@@ -6684,7 +6684,7 @@
       </w:r>
     </w:p>
     <w:bookmarkEnd w:id="62"/>
-    <w:bookmarkStart w:id="63" w:name="Xb70b95b8b38ded80618834689cadeac3dd55d32"/>
+    <w:bookmarkStart w:id="63" w:name="Xd95dc835a829e4216b01fbeddd3982aaee5396e"/>
     <w:p>
       <w:pPr>
         <w:keepLines w:val="0"/>
@@ -6700,7 +6700,7 @@
         <w:rPr>
           <w:color w:val="111111"/>
         </w:rPr>
-        <w:t xml:space="preserve">Table A1. The five deliverables: what each is, who uses it</w:t>
+        <w:t xml:space="preserve">Table A1. The five artifacts: what each is, who uses it</w:t>
       </w:r>
     </w:p>
     <w:p>
@@ -6750,7 +6750,7 @@
                 <w:sz w:val="21"/>
                 <w:szCs w:val="21"/>
               </w:rPr>
-              <w:t xml:space="preserve">Deliverable</w:t>
+              <w:t xml:space="preserve">Artifact</w:t>
             </w:r>
           </w:p>
         </w:tc>

</xml_diff>

<commit_message>
Publish aligned v2: C1-C4 chain, plain language, arXiv citation, 6 milestones
Rebuilt submission PDF, DOCX and Word PDF (core 2.5.4-2.5.9 = 10 pages in both
renders, clean black text), refreshed index and v2 HTML, form-guide synced
(new EN/HE abstracts, six milestones), CV and CV PDF cite arXiv:2609.27926,
checklist counts updated (EN 300 / HE 292). Sync audit: 47/47 pass.

Co-Authored-By: Claude Opus 5.5 <noreply@anthropic.com>
</commit_message>
<xml_diff>
--- a/JouleFlex-proposal-v2-2026-10-01.docx
+++ b/JouleFlex-proposal-v2-2026-10-01.docx
@@ -122,7 +122,7 @@
         <w:t xml:space="preserve">2.5.2 Abstract / תקציר</w:t>
       </w:r>
     </w:p>
-    <w:bookmarkStart w:id="22" w:name="english-299300-words"/>
+    <w:bookmarkStart w:id="22" w:name="english-300300-words"/>
     <w:p>
       <w:pPr>
         <w:keepLines w:val="0"/>
@@ -141,7 +141,7 @@
         <w:rPr>
           <w:color w:val="111111"/>
         </w:rPr>
-        <w:t xml:space="preserve">299</w:t>
+        <w:t xml:space="preserve">300</w:t>
       </w:r>
       <w:r>
         <w:rPr>
@@ -157,7 +157,7 @@
         <w:jc w:val="both"/>
       </w:pPr>
       <w:r>
-        <w:t xml:space="preserve">In July 2026 Israel's Electricity Authority froze new data-center grid-connection requests for 140 days: the queue had reached about 27,000 MW, roughly three times the country's average demand [2]. The binding limit is connection capacity, not generation. The PI's study [1] found that a GPU, the chip that runs AI, has an energy-optimal operating power, the Joule Point, well below its maximum; running at maximum, today's default and the level the grid is sized for, is the energy-worst choice. A capped GPU draws less power, so more GPUs fit behind the same connection. JouleFlex makes this a measured third option between full-power connection and refusal: connect on condition of flexibility.</w:t>
+        <w:t xml:space="preserve">In July 2026 Israel's Electricity Authority froze new data-center grid connections for 140 days, after the queue reached about 27,000 MW, three times the country's average demand [2]. One way forward, proposed in the Authority's June 2026 hearing [19], is flexible connection: the system operator may curtail its consumption at peak. Most of it goes to GPUs, the chips that run AI. Today a data center adjusts by capping their power or switching some off.</w:t>
       </w:r>
     </w:p>
     <w:p>
@@ -167,7 +167,7 @@
         <w:jc w:val="both"/>
       </w:pPr>
       <w:r>
-        <w:t xml:space="preserve">Existing approaches limit power draw or switch GPUs off; this project asks instead how much useful AI work a given power and energy budget can deliver, a question that yields different operating strategies.</w:t>
+        <w:t xml:space="preserve">The PI's study [1] shows that both are wasteful. Switching GPUs off forfeits their work. Capping too hard makes jobs run so long that the GPU's fixed baseline power adds up. Capping too little spends much more energy for very little extra speed. Energy per task is therefore U-shaped. At its bottom, the Joule Point, each unit of energy does the most AI work. Measured on 20 AI models and four GPU types, it sits well below full power and cuts energy per task by 29 to 31 percent. A fleet simulation did the same work with 18 to 45 percent less energy. Capped GPUs draw less power, so more fit behind the same connection: up to about 50 percent more AI work per megawatt of GPU power. Servers and cooling draw power that capping does not cut, so the project measures the real gain at the building's meter.</w:t>
       </w:r>
     </w:p>
     <w:p>
@@ -177,21 +177,11 @@
         <w:jc w:val="both"/>
       </w:pPr>
       <w:r>
-        <w:t xml:space="preserve">The PI's ELF dataset, the first dense enough to locate the Joule Point, holds about 5,500 measurements over 20 AI models and four GPU types; no public equivalent exists. Operating at the Joule Point uses 29 to 31 percent less energy per task at about 1.2 times the runtime; a fleet simulation on the measured curves delivers the same work with 18 to 45 percent less energy; and on the measured A100 curve a fixed connection delivers up to about 50 percent more AI work per megawatt at the chip, to be confirmed at the facility meter.</w:t>
-      </w:r>
-    </w:p>
-    <w:p>
-      <w:pPr>
-        <w:widowControl w:val="0"/>
-        <w:pStyle w:val="BodyText"/>
-        <w:jc w:val="both"/>
-      </w:pPr>
-      <w:r>
-        <w:t xml:space="preserve">The project develops models and tools for operating and planning AI data centers under constrained and variable power. These include power-control and workload-allocation methods, pricing that rewards efficient use of flexible power, fleet planning for power-variable operation, and connection-scenario analyses showing how much of the connection queue firm-plus-flexible connections could serve by region, under technical, economic and policy constraints.</w:t>
+        <w:t xml:space="preserve">Knowing this optimum turns flexibility from forced cutbacks into a design choice. This project builds the tools: control that keeps each GPU near its Joule Point and lowers power when the grid asks, pricing that rewards efficient use of flexible power, planning how many GPUs to install behind a connection, and connection scenarios showing how much of the queue flexible connections could serve, by region. This gives a measured third option between full-power connection and refusal.</w:t>
       </w:r>
     </w:p>
     <w:bookmarkEnd w:id="22"/>
-    <w:bookmarkStart w:id="23" w:name="עברית-275300-מילים"/>
+    <w:bookmarkStart w:id="23" w:name="עברית-292300-מילים"/>
     <w:p>
       <w:pPr>
         <w:keepLines w:val="0"/>
@@ -213,7 +203,7 @@
           <w:color w:val="111111"/>
           <w:rtl/>
         </w:rPr>
-        <w:t xml:space="preserve">275</w:t>
+        <w:t xml:space="preserve">292</w:t>
       </w:r>
       <w:r>
         <w:rPr>
@@ -232,9 +222,10 @@
       </w:pPr>
       <w:r>
         <w:rPr>
+          <w:lang w:val="he"/>
           <w:rtl/>
         </w:rPr>
-        <w:t xml:space="preserve">ביולי 2026 הקפיאה רשות החשמל לתקופה של 140 יום את קבלת הבקשות החדשות לחיבור חוות שרתים לרשת החשמל, לאחר שתור הבקשות הגיע לכ-27,000 מגה-וואט, פי שלושה בקירוב מהביקוש הממוצע לחשמל בישראל [2]. האילוץ הכובל הוא קיבולת החיבור, לא כושר הייצור. מחקר קודם של החוקר הראשי [1] מצא כי למעבד GPU, השבב שמריץ בינה מלאכותית, קיים הספק עבודה אופטימלי מבחינה אנרגטית, ה-Joule Point, הנמוך בהרבה מההספק המרבי שלו; הפעלה בהספק המרבי, ברירת המחדל כיום והערך שלפיו מתוכננת רשת החשמל, היא דרך ההפעלה הגרועה ביותר מבחינה אנרגטית. מעבד מוגבל-הספק צורך פחות הספק, ולכן ניתן להציב יותר מעבדים מאחורי אותו חיבור לרשת. JouleFlex הופך זאת לאפשרות שלישית ומדודה, בין חיבור בהספק מלא לבין סירוב: חיבור בתנאי של גמישות.</w:t>
+        <w:t xml:space="preserve">ביולי 2026 פרסמה רשות החשמל הוראת שעה להתליית הליכי הבחינה של בקשות חדשות ותלויות לחיבור חוות שרתים לרשת החשמל למשך 140 יום, לאחר שצבר הבקשות הגיע לכ-27,000 מגה-וואט, פי שלושה מהביקוש הממוצע לחשמל בישראל [2]. דרך אחת להתקדם היא ניהול גמיש של צריכת החשמל, כפי שמוצע בשימוע של רשות החשמל מיוני 2026 [19]: מנהל המערכת יוכל לצמצם חלק מצריכת החשמל של חוות השרתים בשעות עומס. רוב הצריכה הזו היא של מעבדי GPU, השבבים שמריצים בינה מלאכותית, וכיום חוות שרתים מסתגלת על ידי הגבלת ההספק שלהם או כיבוי חלק מהם.</w:t>
       </w:r>
     </w:p>
     <w:p>
@@ -246,9 +237,10 @@
       </w:pPr>
       <w:r>
         <w:rPr>
+          <w:lang w:val="he"/>
           <w:rtl/>
         </w:rPr>
-        <w:t xml:space="preserve">הגישות הקיימות מגבילות את צריכת ההספק או מכבות מעבדים; פרויקט זה שואל במקום זאת כמה עבודת AI שימושית ניתן להפיק מתקציב הספק ואנרגיה נתון, שאלה המובילה לאסטרטגיות הפעלה שונות.</w:t>
+        <w:t xml:space="preserve">מחקר החוקר הראשי [1] מראה ששתי הדרכים בזבזניות. כיבוי מעבדים מוותר על העבודה שלהם. הגבלה חזקה מדי מאריכה את זמן הריצה, וצריכת הבסיס הקבועה של המעבד מצטברת. הגבלה חלשה מדי מוציאה הרבה יותר אנרגיה תמורת מעט מאוד מהירות נוספת. לכן האנרגיה למשימה יוצרת עקומה בצורת U. בתחתיתה נמצאת ה-Joule Point, הנקודה שבה כל יחידת אנרגיה מבצעת את מרב עבודת ה-AI. במדידות על 20 מודלים של AI וארבעה סוגי GPU היא נמצאה הרבה מתחת להספק המלא, והפחיתה את האנרגיה למשימה ב-29 עד 31 אחוז. סימולציית צי ביצעה עבודה זהה ב-18 עד 45 אחוז פחות אנרגיה. מעבדים מוגבלים צורכים פחות הספק, ולכן יותר מהם נכנסים מאחורי אותו חיבור: עד כ-50 אחוז יותר עבודת AI לכל מגה-וואט של הספק המעבדים. שרתים וקירור צורכים חשמל שהגבלת ההספק אינה מורידה, ולכן הפרויקט מודד את הרווח האמיתי במונה של המבנה.</w:t>
       </w:r>
     </w:p>
     <w:p>
@@ -260,23 +252,10 @@
       </w:pPr>
       <w:r>
         <w:rPr>
+          <w:lang w:val="he"/>
           <w:rtl/>
         </w:rPr>
-        <w:t xml:space="preserve">מערך הנתונים ELF, המדידה הראשונה הצפופה דיה לאיתור ה-Joule Point, כולל כ-5,500 מדידות על 20 מודלים של AI וארבעה סוגי GPU, ללא מקבילה ציבורית. עבודה בנקודה זו צורכת 29 עד 31 אחוז פחות אנרגיה למשימה, בזמן ריצה ארוך פי 1.2 בקירוב; סימולציית צי על העקומות המדודות מספקת עבודה זהה ב-18 עד 45 אחוז פחות אנרגיה; ועל עקומת ה-A100 המדודה, חיבור קבוע מספק עד כ-50 אחוז יותר עבודת AI לכל מגה-וואט ברמת השבב, ממצא שייבדק במונה המתקן.</w:t>
-      </w:r>
-    </w:p>
-    <w:p>
-      <w:pPr>
-        <w:widowControl w:val="0"/>
-        <w:pStyle w:val="BodyText"/>
-        <w:bidi/>
-        <w:jc w:val="both"/>
-      </w:pPr>
-      <w:r>
-        <w:rPr>
-          <w:rtl/>
-        </w:rPr>
-        <w:t xml:space="preserve">הפרויקט יפתח מודלים וכלים להפעלה ולתכנון של חוות שרתים לבינה מלאכותית בתנאי הספק מוגבל ומשתנה: שיטות לבקרת הספק ולהקצאת עומסי חישוב, מנגנוני תמחור המתגמלים ניצול יעיל של הספק גמיש, תכנון צי GPU לעבודה בהספק משתנה, וניתוחי תרחישי חיבור המראים לרגולטור כמה מתור החיבור ניתן לספק תחת משטר חיבורים גמישים, לפי אזור, בהתחשב באילוצים טכניים, כלכליים ורגולטוריים.</w:t>
+        <w:t xml:space="preserve">הכרת הנקודה המיטבית הופכת את הגמישות מקיצוץ כפוי לבחירה תכנונית. פרויקט זה בונה את הכלים לכך: בקרה שמחזיקה כל מעבד קרוב ל-Joule Point ומורידה את ההספק כשמנהל המערכת מבקש, תמחור שמתגמל שימוש יעיל בהספק גמיש, תכנון של מספר המעבדים שכדאי להתקין מאחורי חיבור נתון, ותרחישים שמראים כמה מצבר הבקשות ניתן לאשר עם ניהול גמיש של הצריכה, לפי אזור. כך נוצרת אפשרות שלישית ומדודה בין חיבור במלוא ההספק לבין סירוב.</w:t>
       </w:r>
     </w:p>
     <w:bookmarkEnd w:id="23"/>
@@ -375,25 +354,25 @@
                 <w:sz w:val="21"/>
                 <w:szCs w:val="21"/>
               </w:rPr>
-              <w:t xml:space="preserve">Power</w:t>
-            </w:r>
-          </w:p>
-        </w:tc>
-        <w:tc>
-          <w:tcPr/>
-          <w:p>
-            <w:pPr>
-              <w:spacing w:line="317" w:lineRule="auto" w:before="20" w:after="20"/>
-              <w:widowControl w:val="0"/>
-              <w:pStyle w:val="Compact"/>
-              <w:jc w:val="both"/>
-            </w:pPr>
-            <w:r>
-              <w:rPr>
-                <w:sz w:val="21"/>
-                <w:szCs w:val="21"/>
-              </w:rPr>
-              <w:t xml:space="preserve">How fast electricity is drawn at a given moment; watts (W) or megawatts (MW). The grid connection is sized by peak power.</w:t>
+              <w:t xml:space="preserve">Power cap</w:t>
+            </w:r>
+          </w:p>
+        </w:tc>
+        <w:tc>
+          <w:tcPr/>
+          <w:p>
+            <w:pPr>
+              <w:spacing w:line="317" w:lineRule="auto" w:before="20" w:after="20"/>
+              <w:widowControl w:val="0"/>
+              <w:pStyle w:val="Compact"/>
+              <w:jc w:val="both"/>
+            </w:pPr>
+            <w:r>
+              <w:rPr>
+                <w:sz w:val="21"/>
+                <w:szCs w:val="21"/>
+              </w:rPr>
+              <w:t xml:space="preserve">A software limit on a GPU's power draw. It is set with one command and takes effect in about 0.2 seconds. The control knob of this project.</w:t>
             </w:r>
           </w:p>
         </w:tc>
@@ -414,25 +393,25 @@
                 <w:sz w:val="21"/>
                 <w:szCs w:val="21"/>
               </w:rPr>
-              <w:t xml:space="preserve">Energy</w:t>
-            </w:r>
-          </w:p>
-        </w:tc>
-        <w:tc>
-          <w:tcPr/>
-          <w:p>
-            <w:pPr>
-              <w:spacing w:line="317" w:lineRule="auto" w:before="20" w:after="20"/>
-              <w:widowControl w:val="0"/>
-              <w:pStyle w:val="Compact"/>
-              <w:jc w:val="both"/>
-            </w:pPr>
-            <w:r>
-              <w:rPr>
-                <w:sz w:val="21"/>
-                <w:szCs w:val="21"/>
-              </w:rPr>
-              <w:t xml:space="preserve">The total electricity consumed: power × time; joules or kilowatt-hours. The bill and the carbon footprint are set by energy.</w:t>
+              <w:t xml:space="preserve">TDP</w:t>
+            </w:r>
+          </w:p>
+        </w:tc>
+        <w:tc>
+          <w:tcPr/>
+          <w:p>
+            <w:pPr>
+              <w:spacing w:line="317" w:lineRule="auto" w:before="20" w:after="20"/>
+              <w:widowControl w:val="0"/>
+              <w:pStyle w:val="Compact"/>
+              <w:jc w:val="both"/>
+            </w:pPr>
+            <w:r>
+              <w:rPr>
+                <w:sz w:val="21"/>
+                <w:szCs w:val="21"/>
+              </w:rPr>
+              <w:t xml:space="preserve">A GPU's full rated power. Running at TDP is today's default.</w:t>
             </w:r>
           </w:p>
         </w:tc>
@@ -453,25 +432,25 @@
                 <w:sz w:val="21"/>
                 <w:szCs w:val="21"/>
               </w:rPr>
-              <w:t xml:space="preserve">Power cap</w:t>
-            </w:r>
-          </w:p>
-        </w:tc>
-        <w:tc>
-          <w:tcPr/>
-          <w:p>
-            <w:pPr>
-              <w:spacing w:line="317" w:lineRule="auto" w:before="20" w:after="20"/>
-              <w:widowControl w:val="0"/>
-              <w:pStyle w:val="Compact"/>
-              <w:jc w:val="both"/>
-            </w:pPr>
-            <w:r>
-              <w:rPr>
-                <w:sz w:val="21"/>
-                <w:szCs w:val="21"/>
-              </w:rPr>
-              <w:t xml:space="preserve">A software limit on a GPU's power draw. Set with one command; takes effect in ~0.2 seconds. The control knob of this project.</w:t>
+              <w:t xml:space="preserve">Joule Point (JP)</w:t>
+            </w:r>
+          </w:p>
+        </w:tc>
+        <w:tc>
+          <w:tcPr/>
+          <w:p>
+            <w:pPr>
+              <w:spacing w:line="317" w:lineRule="auto" w:before="20" w:after="20"/>
+              <w:widowControl w:val="0"/>
+              <w:pStyle w:val="Compact"/>
+              <w:jc w:val="both"/>
+            </w:pPr>
+            <w:r>
+              <w:rPr>
+                <w:sz w:val="21"/>
+                <w:szCs w:val="21"/>
+              </w:rPr>
+              <w:t xml:space="preserve">The power cap at which energy per task is lowest for a given card. Measured at 43–46% of TDP on large GPUs.</w:t>
             </w:r>
           </w:p>
         </w:tc>
@@ -492,25 +471,25 @@
                 <w:sz w:val="21"/>
                 <w:szCs w:val="21"/>
               </w:rPr>
-              <w:t xml:space="preserve">TDP</w:t>
-            </w:r>
-          </w:p>
-        </w:tc>
-        <w:tc>
-          <w:tcPr/>
-          <w:p>
-            <w:pPr>
-              <w:spacing w:line="317" w:lineRule="auto" w:before="20" w:after="20"/>
-              <w:widowControl w:val="0"/>
-              <w:pStyle w:val="Compact"/>
-              <w:jc w:val="both"/>
-            </w:pPr>
-            <w:r>
-              <w:rPr>
-                <w:sz w:val="21"/>
-                <w:szCs w:val="21"/>
-              </w:rPr>
-              <w:t xml:space="preserve">A GPU's full rated power. Running at TDP is today's default.</w:t>
+              <w:t xml:space="preserve">Operating point</w:t>
+            </w:r>
+          </w:p>
+        </w:tc>
+        <w:tc>
+          <w:tcPr/>
+          <w:p>
+            <w:pPr>
+              <w:spacing w:line="317" w:lineRule="auto" w:before="20" w:after="20"/>
+              <w:widowControl w:val="0"/>
+              <w:pStyle w:val="Compact"/>
+              <w:jc w:val="both"/>
+            </w:pPr>
+            <w:r>
+              <w:rPr>
+                <w:sz w:val="21"/>
+                <w:szCs w:val="21"/>
+              </w:rPr>
+              <w:t xml:space="preserve">The pair (GPU, power cap) a job runs at.</w:t>
             </w:r>
           </w:p>
         </w:tc>
@@ -531,25 +510,25 @@
                 <w:sz w:val="21"/>
                 <w:szCs w:val="21"/>
               </w:rPr>
-              <w:t xml:space="preserve">Joule Point (JP)</w:t>
-            </w:r>
-          </w:p>
-        </w:tc>
-        <w:tc>
-          <w:tcPr/>
-          <w:p>
-            <w:pPr>
-              <w:spacing w:line="317" w:lineRule="auto" w:before="20" w:after="20"/>
-              <w:widowControl w:val="0"/>
-              <w:pStyle w:val="Compact"/>
-              <w:jc w:val="both"/>
-            </w:pPr>
-            <w:r>
-              <w:rPr>
-                <w:sz w:val="21"/>
-                <w:szCs w:val="21"/>
-              </w:rPr>
-              <w:t xml:space="preserve">The power cap at which energy per task is lowest for a given card; measured at 43–46% of TDP on large GPUs.</w:t>
+              <w:t xml:space="preserve">Power limit</w:t>
+            </w:r>
+          </w:p>
+        </w:tc>
+        <w:tc>
+          <w:tcPr/>
+          <w:p>
+            <w:pPr>
+              <w:spacing w:line="317" w:lineRule="auto" w:before="20" w:after="20"/>
+              <w:widowControl w:val="0"/>
+              <w:pStyle w:val="Compact"/>
+              <w:jc w:val="both"/>
+            </w:pPr>
+            <w:r>
+              <w:rPr>
+                <w:sz w:val="21"/>
+                <w:szCs w:val="21"/>
+              </w:rPr>
+              <w:t xml:space="preserve">A limit on a facility's total power draw that can change over time, set by a budget, a price or carbon signal, or a grid instruction.</w:t>
             </w:r>
           </w:p>
         </w:tc>
@@ -570,25 +549,25 @@
                 <w:sz w:val="21"/>
                 <w:szCs w:val="21"/>
               </w:rPr>
-              <w:t xml:space="preserve">Operating point</w:t>
-            </w:r>
-          </w:p>
-        </w:tc>
-        <w:tc>
-          <w:tcPr/>
-          <w:p>
-            <w:pPr>
-              <w:spacing w:line="317" w:lineRule="auto" w:before="20" w:after="20"/>
-              <w:widowControl w:val="0"/>
-              <w:pStyle w:val="Compact"/>
-              <w:jc w:val="both"/>
-            </w:pPr>
-            <w:r>
-              <w:rPr>
-                <w:sz w:val="21"/>
-                <w:szCs w:val="21"/>
-              </w:rPr>
-              <w:t xml:space="preserve">The pair (GPU, power cap) a job runs at.</w:t>
+              <w:t xml:space="preserve">Digital twin / simulator</w:t>
+            </w:r>
+          </w:p>
+        </w:tc>
+        <w:tc>
+          <w:tcPr/>
+          <w:p>
+            <w:pPr>
+              <w:spacing w:line="317" w:lineRule="auto" w:before="20" w:after="20"/>
+              <w:widowControl w:val="0"/>
+              <w:pStyle w:val="Compact"/>
+              <w:jc w:val="both"/>
+            </w:pPr>
+            <w:r>
+              <w:rPr>
+                <w:sz w:val="21"/>
+                <w:szCs w:val="21"/>
+              </w:rPr>
+              <w:t xml:space="preserve">A simulator that replays the measured power-versus-rate curves of a described fleet to evaluate any policy or power envelope.</w:t>
             </w:r>
           </w:p>
         </w:tc>
@@ -609,25 +588,25 @@
                 <w:sz w:val="21"/>
                 <w:szCs w:val="21"/>
               </w:rPr>
-              <w:t xml:space="preserve">Power envelope</w:t>
-            </w:r>
-          </w:p>
-        </w:tc>
-        <w:tc>
-          <w:tcPr/>
-          <w:p>
-            <w:pPr>
-              <w:spacing w:line="317" w:lineRule="auto" w:before="20" w:after="20"/>
-              <w:widowControl w:val="0"/>
-              <w:pStyle w:val="Compact"/>
-              <w:jc w:val="both"/>
-            </w:pPr>
-            <w:r>
-              <w:rPr>
-                <w:sz w:val="21"/>
-                <w:szCs w:val="21"/>
-              </w:rPr>
-              <w:t xml:space="preserve">A limit on a facility's total power draw that can change over time, set by a budget, a price or carbon signal, or a grid instruction.</w:t>
+              <w:t xml:space="preserve">ELF</w:t>
+            </w:r>
+          </w:p>
+        </w:tc>
+        <w:tc>
+          <w:tcPr/>
+          <w:p>
+            <w:pPr>
+              <w:spacing w:line="317" w:lineRule="auto" w:before="20" w:after="20"/>
+              <w:widowControl w:val="0"/>
+              <w:pStyle w:val="Compact"/>
+              <w:jc w:val="both"/>
+            </w:pPr>
+            <w:r>
+              <w:rPr>
+                <w:sz w:val="21"/>
+                <w:szCs w:val="21"/>
+              </w:rPr>
+              <w:t xml:space="preserve">The PI's released dataset and measurement software: dense power-cap sweeps of 20 AI models on 4 GPUs, ~5,500 measured rows.</w:t>
             </w:r>
           </w:p>
         </w:tc>
@@ -648,25 +627,25 @@
                 <w:sz w:val="21"/>
                 <w:szCs w:val="21"/>
               </w:rPr>
-              <w:t xml:space="preserve">Digital twin / simulator</w:t>
-            </w:r>
-          </w:p>
-        </w:tc>
-        <w:tc>
-          <w:tcPr/>
-          <w:p>
-            <w:pPr>
-              <w:spacing w:line="317" w:lineRule="auto" w:before="20" w:after="20"/>
-              <w:widowControl w:val="0"/>
-              <w:pStyle w:val="Compact"/>
-              <w:jc w:val="both"/>
-            </w:pPr>
-            <w:r>
-              <w:rPr>
-                <w:sz w:val="21"/>
-                <w:szCs w:val="21"/>
-              </w:rPr>
-              <w:t xml:space="preserve">A simulator that replays the measured power-versus-rate curves of a described fleet to evaluate any policy or power envelope.</w:t>
+              <w:t xml:space="preserve">SLO</w:t>
+            </w:r>
+          </w:p>
+        </w:tc>
+        <w:tc>
+          <w:tcPr/>
+          <w:p>
+            <w:pPr>
+              <w:spacing w:line="317" w:lineRule="auto" w:before="20" w:after="20"/>
+              <w:widowControl w:val="0"/>
+              <w:pStyle w:val="Compact"/>
+              <w:jc w:val="both"/>
+            </w:pPr>
+            <w:r>
+              <w:rPr>
+                <w:sz w:val="21"/>
+                <w:szCs w:val="21"/>
+              </w:rPr>
+              <w:t xml:space="preserve">Service level objective: the deadline or latency a job must meet.</w:t>
             </w:r>
           </w:p>
         </w:tc>
@@ -687,25 +666,25 @@
                 <w:sz w:val="21"/>
                 <w:szCs w:val="21"/>
               </w:rPr>
-              <w:t xml:space="preserve">ELF</w:t>
-            </w:r>
-          </w:p>
-        </w:tc>
-        <w:tc>
-          <w:tcPr/>
-          <w:p>
-            <w:pPr>
-              <w:spacing w:line="317" w:lineRule="auto" w:before="20" w:after="20"/>
-              <w:widowControl w:val="0"/>
-              <w:pStyle w:val="Compact"/>
-              <w:jc w:val="both"/>
-            </w:pPr>
-            <w:r>
-              <w:rPr>
-                <w:sz w:val="21"/>
-                <w:szCs w:val="21"/>
-              </w:rPr>
-              <w:t xml:space="preserve">The PI's released dataset and measurement software: dense power-cap sweeps of 20 AI models on 4 GPUs, ~5,500 measured rows.</w:t>
+              <w:t xml:space="preserve">Firm / flexible capacity</w:t>
+            </w:r>
+          </w:p>
+        </w:tc>
+        <w:tc>
+          <w:tcPr/>
+          <w:p>
+            <w:pPr>
+              <w:spacing w:line="317" w:lineRule="auto" w:before="20" w:after="20"/>
+              <w:widowControl w:val="0"/>
+              <w:pStyle w:val="Compact"/>
+              <w:jc w:val="both"/>
+            </w:pPr>
+            <w:r>
+              <w:rPr>
+                <w:sz w:val="21"/>
+                <w:szCs w:val="21"/>
+              </w:rPr>
+              <w:t xml:space="preserve">Grid connection capacity guaranteed at all times, versus capacity given on condition that the facility reduces power when instructed.</w:t>
             </w:r>
           </w:p>
         </w:tc>
@@ -726,25 +705,25 @@
                 <w:sz w:val="21"/>
                 <w:szCs w:val="21"/>
               </w:rPr>
-              <w:t xml:space="preserve">SLO</w:t>
-            </w:r>
-          </w:p>
-        </w:tc>
-        <w:tc>
-          <w:tcPr/>
-          <w:p>
-            <w:pPr>
-              <w:spacing w:line="317" w:lineRule="auto" w:before="20" w:after="20"/>
-              <w:widowControl w:val="0"/>
-              <w:pStyle w:val="Compact"/>
-              <w:jc w:val="both"/>
-            </w:pPr>
-            <w:r>
-              <w:rPr>
-                <w:sz w:val="21"/>
-                <w:szCs w:val="21"/>
-              </w:rPr>
-              <w:t xml:space="preserve">Service level objective: the deadline or latency a job must meet.</w:t>
+              <w:t xml:space="preserve">Firm-plus-flexible connection</w:t>
+            </w:r>
+          </w:p>
+        </w:tc>
+        <w:tc>
+          <w:tcPr/>
+          <w:p>
+            <w:pPr>
+              <w:spacing w:line="317" w:lineRule="auto" w:before="20" w:after="20"/>
+              <w:widowControl w:val="0"/>
+              <w:pStyle w:val="Compact"/>
+              <w:jc w:val="both"/>
+            </w:pPr>
+            <w:r>
+              <w:rPr>
+                <w:sz w:val="21"/>
+                <w:szCs w:val="21"/>
+              </w:rPr>
+              <w:t xml:space="preserve">A grid connection combining a guaranteed (firm) part with a curtailable (flexible) part.</w:t>
             </w:r>
           </w:p>
         </w:tc>
@@ -765,25 +744,25 @@
                 <w:sz w:val="21"/>
                 <w:szCs w:val="21"/>
               </w:rPr>
-              <w:t xml:space="preserve">Firm / flexible capacity</w:t>
-            </w:r>
-          </w:p>
-        </w:tc>
-        <w:tc>
-          <w:tcPr/>
-          <w:p>
-            <w:pPr>
-              <w:spacing w:line="317" w:lineRule="auto" w:before="20" w:after="20"/>
-              <w:widowControl w:val="0"/>
-              <w:pStyle w:val="Compact"/>
-              <w:jc w:val="both"/>
-            </w:pPr>
-            <w:r>
-              <w:rPr>
-                <w:sz w:val="21"/>
-                <w:szCs w:val="21"/>
-              </w:rPr>
-              <w:t xml:space="preserve">Grid connection capacity guaranteed at all times, versus capacity given on condition that the facility reduces power when instructed.</w:t>
+              <w:t xml:space="preserve">Energy-worst point</w:t>
+            </w:r>
+          </w:p>
+        </w:tc>
+        <w:tc>
+          <w:tcPr/>
+          <w:p>
+            <w:pPr>
+              <w:spacing w:line="317" w:lineRule="auto" w:before="20" w:after="20"/>
+              <w:widowControl w:val="0"/>
+              <w:pStyle w:val="Compact"/>
+              <w:jc w:val="both"/>
+            </w:pPr>
+            <w:r>
+              <w:rPr>
+                <w:sz w:val="21"/>
+                <w:szCs w:val="21"/>
+              </w:rPr>
+              <w:t xml:space="preserve">The operating point with the highest energy per task: full power (TDP).</w:t>
             </w:r>
           </w:p>
         </w:tc>
@@ -804,25 +783,25 @@
                 <w:sz w:val="21"/>
                 <w:szCs w:val="21"/>
               </w:rPr>
-              <w:t xml:space="preserve">Noga</w:t>
-            </w:r>
-          </w:p>
-        </w:tc>
-        <w:tc>
-          <w:tcPr/>
-          <w:p>
-            <w:pPr>
-              <w:spacing w:line="317" w:lineRule="auto" w:before="20" w:after="20"/>
-              <w:widowControl w:val="0"/>
-              <w:pStyle w:val="Compact"/>
-              <w:jc w:val="both"/>
-            </w:pPr>
-            <w:r>
-              <w:rPr>
-                <w:sz w:val="21"/>
-                <w:szCs w:val="21"/>
-              </w:rPr>
-              <w:t xml:space="preserve">Israel's independent electricity system operator, which dispatches generation and would call on flexible loads.</w:t>
+              <w:t xml:space="preserve">Card / board</w:t>
+            </w:r>
+          </w:p>
+        </w:tc>
+        <w:tc>
+          <w:tcPr/>
+          <w:p>
+            <w:pPr>
+              <w:spacing w:line="317" w:lineRule="auto" w:before="20" w:after="20"/>
+              <w:widowControl w:val="0"/>
+              <w:pStyle w:val="Compact"/>
+              <w:jc w:val="both"/>
+            </w:pPr>
+            <w:r>
+              <w:rPr>
+                <w:sz w:val="21"/>
+                <w:szCs w:val="21"/>
+              </w:rPr>
+              <w:t xml:space="preserve">Card: one GPU. Board power is the GPU's own draw, from its built-in meter, excluding the host server, cooling and building losses.</w:t>
             </w:r>
           </w:p>
         </w:tc>
@@ -843,25 +822,25 @@
                 <w:sz w:val="21"/>
                 <w:szCs w:val="21"/>
               </w:rPr>
-              <w:t xml:space="preserve">Firm-plus-flexible connection</w:t>
-            </w:r>
-          </w:p>
-        </w:tc>
-        <w:tc>
-          <w:tcPr/>
-          <w:p>
-            <w:pPr>
-              <w:spacing w:line="317" w:lineRule="auto" w:before="20" w:after="20"/>
-              <w:widowControl w:val="0"/>
-              <w:pStyle w:val="Compact"/>
-              <w:jc w:val="both"/>
-            </w:pPr>
-            <w:r>
-              <w:rPr>
-                <w:sz w:val="21"/>
-                <w:szCs w:val="21"/>
-              </w:rPr>
-              <w:t xml:space="preserve">A grid connection combining a guaranteed (firm) part with a curtailable (flexible) part.</w:t>
+              <w:t xml:space="preserve">Server input (BMC)</w:t>
+            </w:r>
+          </w:p>
+        </w:tc>
+        <w:tc>
+          <w:tcPr/>
+          <w:p>
+            <w:pPr>
+              <w:spacing w:line="317" w:lineRule="auto" w:before="20" w:after="20"/>
+              <w:widowControl w:val="0"/>
+              <w:pStyle w:val="Compact"/>
+              <w:jc w:val="both"/>
+            </w:pPr>
+            <w:r>
+              <w:rPr>
+                <w:sz w:val="21"/>
+                <w:szCs w:val="21"/>
+              </w:rPr>
+              <w:t xml:space="preserve">The power entering the server, read by its management controller (BMC). This is what the grid meters, before cooling and building losses.</w:t>
             </w:r>
           </w:p>
         </w:tc>
@@ -882,25 +861,25 @@
                 <w:sz w:val="21"/>
                 <w:szCs w:val="21"/>
               </w:rPr>
-              <w:t xml:space="preserve">Energy-worst point</w:t>
-            </w:r>
-          </w:p>
-        </w:tc>
-        <w:tc>
-          <w:tcPr/>
-          <w:p>
-            <w:pPr>
-              <w:spacing w:line="317" w:lineRule="auto" w:before="20" w:after="20"/>
-              <w:widowControl w:val="0"/>
-              <w:pStyle w:val="Compact"/>
-              <w:jc w:val="both"/>
-            </w:pPr>
-            <w:r>
-              <w:rPr>
-                <w:sz w:val="21"/>
-                <w:szCs w:val="21"/>
-              </w:rPr>
-              <w:t xml:space="preserve">The operating point with the highest energy per task: full power (TDP).</w:t>
+              <w:t xml:space="preserve">Cap binds</w:t>
+            </w:r>
+          </w:p>
+        </w:tc>
+        <w:tc>
+          <w:tcPr/>
+          <w:p>
+            <w:pPr>
+              <w:spacing w:line="317" w:lineRule="auto" w:before="20" w:after="20"/>
+              <w:widowControl w:val="0"/>
+              <w:pStyle w:val="Compact"/>
+              <w:jc w:val="both"/>
+            </w:pPr>
+            <w:r>
+              <w:rPr>
+                <w:sz w:val="21"/>
+                <w:szCs w:val="21"/>
+              </w:rPr>
+              <w:t xml:space="preserve">The power cap actually limits the GPU (the GPU is busy enough to reach it).</w:t>
             </w:r>
           </w:p>
         </w:tc>
@@ -921,25 +900,25 @@
                 <w:sz w:val="21"/>
                 <w:szCs w:val="21"/>
               </w:rPr>
-              <w:t xml:space="preserve">Card / board</w:t>
-            </w:r>
-          </w:p>
-        </w:tc>
-        <w:tc>
-          <w:tcPr/>
-          <w:p>
-            <w:pPr>
-              <w:spacing w:line="317" w:lineRule="auto" w:before="20" w:after="20"/>
-              <w:widowControl w:val="0"/>
-              <w:pStyle w:val="Compact"/>
-              <w:jc w:val="both"/>
-            </w:pPr>
-            <w:r>
-              <w:rPr>
-                <w:sz w:val="21"/>
-                <w:szCs w:val="21"/>
-              </w:rPr>
-              <w:t xml:space="preserve">Card: one GPU. Board power is the GPU's own draw, from its built-in meter, excluding the host server, cooling and building losses.</w:t>
+              <w:t xml:space="preserve">LLM</w:t>
+            </w:r>
+          </w:p>
+        </w:tc>
+        <w:tc>
+          <w:tcPr/>
+          <w:p>
+            <w:pPr>
+              <w:spacing w:line="317" w:lineRule="auto" w:before="20" w:after="20"/>
+              <w:widowControl w:val="0"/>
+              <w:pStyle w:val="Compact"/>
+              <w:jc w:val="both"/>
+            </w:pPr>
+            <w:r>
+              <w:rPr>
+                <w:sz w:val="21"/>
+                <w:szCs w:val="21"/>
+              </w:rPr>
+              <w:t xml:space="preserve">Large language model: the AI model class behind chat and text services.</w:t>
             </w:r>
           </w:p>
         </w:tc>
@@ -960,25 +939,25 @@
                 <w:sz w:val="21"/>
                 <w:szCs w:val="21"/>
               </w:rPr>
-              <w:t xml:space="preserve">Server input (BMC)</w:t>
-            </w:r>
-          </w:p>
-        </w:tc>
-        <w:tc>
-          <w:tcPr/>
-          <w:p>
-            <w:pPr>
-              <w:spacing w:line="317" w:lineRule="auto" w:before="20" w:after="20"/>
-              <w:widowControl w:val="0"/>
-              <w:pStyle w:val="Compact"/>
-              <w:jc w:val="both"/>
-            </w:pPr>
-            <w:r>
-              <w:rPr>
-                <w:sz w:val="21"/>
-                <w:szCs w:val="21"/>
-              </w:rPr>
-              <w:t xml:space="preserve">The power entering the server, read by its management controller (BMC); what the grid meters, before cooling and building losses.</w:t>
+              <w:t xml:space="preserve">FTE</w:t>
+            </w:r>
+          </w:p>
+        </w:tc>
+        <w:tc>
+          <w:tcPr/>
+          <w:p>
+            <w:pPr>
+              <w:spacing w:line="317" w:lineRule="auto" w:before="20" w:after="20"/>
+              <w:widowControl w:val="0"/>
+              <w:pStyle w:val="Compact"/>
+              <w:jc w:val="both"/>
+            </w:pPr>
+            <w:r>
+              <w:rPr>
+                <w:sz w:val="21"/>
+                <w:szCs w:val="21"/>
+              </w:rPr>
+              <w:t xml:space="preserve">Full-time-equivalent: one full-time researcher's work.</w:t>
             </w:r>
           </w:p>
         </w:tc>
@@ -999,162 +978,6 @@
                 <w:sz w:val="21"/>
                 <w:szCs w:val="21"/>
               </w:rPr>
-              <w:t xml:space="preserve">Cap binds</w:t>
-            </w:r>
-          </w:p>
-        </w:tc>
-        <w:tc>
-          <w:tcPr/>
-          <w:p>
-            <w:pPr>
-              <w:spacing w:line="317" w:lineRule="auto" w:before="20" w:after="20"/>
-              <w:widowControl w:val="0"/>
-              <w:pStyle w:val="Compact"/>
-              <w:jc w:val="both"/>
-            </w:pPr>
-            <w:r>
-              <w:rPr>
-                <w:sz w:val="21"/>
-                <w:szCs w:val="21"/>
-              </w:rPr>
-              <w:t xml:space="preserve">The power cap actually limits the GPU (the GPU is busy enough to reach it).</w:t>
-            </w:r>
-          </w:p>
-        </w:tc>
-      </w:tr>
-      <w:tr>
-        <w:trPr/>
-        <w:tc>
-          <w:tcPr/>
-          <w:p>
-            <w:pPr>
-              <w:spacing w:line="317" w:lineRule="auto" w:before="20" w:after="20"/>
-              <w:widowControl w:val="0"/>
-              <w:pStyle w:val="Compact"/>
-              <w:jc w:val="both"/>
-            </w:pPr>
-            <w:r>
-              <w:rPr>
-                <w:sz w:val="21"/>
-                <w:szCs w:val="21"/>
-              </w:rPr>
-              <w:t xml:space="preserve">LLM</w:t>
-            </w:r>
-          </w:p>
-        </w:tc>
-        <w:tc>
-          <w:tcPr/>
-          <w:p>
-            <w:pPr>
-              <w:spacing w:line="317" w:lineRule="auto" w:before="20" w:after="20"/>
-              <w:widowControl w:val="0"/>
-              <w:pStyle w:val="Compact"/>
-              <w:jc w:val="both"/>
-            </w:pPr>
-            <w:r>
-              <w:rPr>
-                <w:sz w:val="21"/>
-                <w:szCs w:val="21"/>
-              </w:rPr>
-              <w:t xml:space="preserve">Large language model: the AI model class behind chat and text services.</w:t>
-            </w:r>
-          </w:p>
-        </w:tc>
-      </w:tr>
-      <w:tr>
-        <w:trPr/>
-        <w:tc>
-          <w:tcPr/>
-          <w:p>
-            <w:pPr>
-              <w:spacing w:line="317" w:lineRule="auto" w:before="20" w:after="20"/>
-              <w:widowControl w:val="0"/>
-              <w:pStyle w:val="Compact"/>
-              <w:jc w:val="both"/>
-            </w:pPr>
-            <w:r>
-              <w:rPr>
-                <w:sz w:val="21"/>
-                <w:szCs w:val="21"/>
-              </w:rPr>
-              <w:t xml:space="preserve">TAOZ</w:t>
-            </w:r>
-          </w:p>
-        </w:tc>
-        <w:tc>
-          <w:tcPr/>
-          <w:p>
-            <w:pPr>
-              <w:spacing w:line="317" w:lineRule="auto" w:before="20" w:after="20"/>
-              <w:widowControl w:val="0"/>
-              <w:pStyle w:val="Compact"/>
-              <w:jc w:val="both"/>
-            </w:pPr>
-            <w:r>
-              <w:rPr>
-                <w:sz w:val="21"/>
-                <w:szCs w:val="21"/>
-              </w:rPr>
-              <w:t xml:space="preserve">Israel's time-of-use electricity tariff.</w:t>
-            </w:r>
-          </w:p>
-        </w:tc>
-      </w:tr>
-      <w:tr>
-        <w:trPr/>
-        <w:tc>
-          <w:tcPr/>
-          <w:p>
-            <w:pPr>
-              <w:spacing w:line="317" w:lineRule="auto" w:before="20" w:after="20"/>
-              <w:widowControl w:val="0"/>
-              <w:pStyle w:val="Compact"/>
-              <w:jc w:val="both"/>
-            </w:pPr>
-            <w:r>
-              <w:rPr>
-                <w:sz w:val="21"/>
-                <w:szCs w:val="21"/>
-              </w:rPr>
-              <w:t xml:space="preserve">FTE</w:t>
-            </w:r>
-          </w:p>
-        </w:tc>
-        <w:tc>
-          <w:tcPr/>
-          <w:p>
-            <w:pPr>
-              <w:spacing w:line="317" w:lineRule="auto" w:before="20" w:after="20"/>
-              <w:widowControl w:val="0"/>
-              <w:pStyle w:val="Compact"/>
-              <w:jc w:val="both"/>
-            </w:pPr>
-            <w:r>
-              <w:rPr>
-                <w:sz w:val="21"/>
-                <w:szCs w:val="21"/>
-              </w:rPr>
-              <w:t xml:space="preserve">Full-time-equivalent: one full-time researcher's work.</w:t>
-            </w:r>
-          </w:p>
-        </w:tc>
-      </w:tr>
-      <w:tr>
-        <w:trPr/>
-        <w:tc>
-          <w:tcPr/>
-          <w:p>
-            <w:pPr>
-              <w:spacing w:line="317" w:lineRule="auto" w:before="20" w:after="20"/>
-              <w:widowControl w:val="0"/>
-              <w:pStyle w:val="Compact"/>
-              <w:jc w:val="both"/>
-            </w:pPr>
-            <w:r>
-              <w:rPr>
-                <w:sz w:val="21"/>
-                <w:szCs w:val="21"/>
-              </w:rPr>
               <w:t xml:space="preserve">Bounding result</w:t>
             </w:r>
           </w:p>
@@ -1173,7 +996,7 @@
                 <w:sz w:val="21"/>
                 <w:szCs w:val="21"/>
               </w:rPr>
-              <w:t xml:space="preserve">A documented limit on where the law or the JP holds; itself a deliverable.</w:t>
+              <w:t xml:space="preserve">A documented limit on where the law or the JP holds. Itself a deliverable.</w:t>
             </w:r>
           </w:p>
         </w:tc>
@@ -1233,56 +1056,60 @@
         <w:t xml:space="preserve"> </w:t>
       </w:r>
       <w:r>
-        <w:t xml:space="preserve">In July 2026 the Electricity Authority stopped accepting new data-center connection requests for 140 days: the connection queue had reached about 27,000 MW, roughly three times Israel's average electricity consumption [2]. The binding limit is connection capacity at specific substations, not generation.</w:t>
-      </w:r>
-      <w:r>
-        <w:t xml:space="preserve"> </w:t>
-      </w:r>
+        <w:t xml:space="preserve">In July 2026 the Electricity Authority stopped accepting new data-center connection requests for 140 days. The queue had reached about 27,000 MW, three times Israel's average demand [2].AI data centers are the fastest-growing load in that queue, and most of their power goes to GPUs (the chips that run AI).</w:t>
+      </w:r>
+    </w:p>
+    <w:p>
+      <w:pPr>
+        <w:widowControl w:val="0"/>
+        <w:pStyle w:val="BodyText"/>
+        <w:jc w:val="both"/>
+      </w:pPr>
       <w:r>
         <w:rPr>
           <w:b/>
           <w:bCs/>
         </w:rPr>
-        <w:t xml:space="preserve">The Joule Point.</w:t>
-      </w:r>
-      <w:r>
-        <w:t xml:space="preserve"> </w:t>
-      </w:r>
-      <w:r>
-        <w:t xml:space="preserve">A GPU (the chip that runs AI) does its most work per joule below full power: lower its power cap (a software ceiling on its electricity draw) and output falls more slowly than power, so energy per task reaches a minimum, the</w:t>
-      </w:r>
-      <w:r>
-        <w:t xml:space="preserve"> </w:t>
-      </w:r>
+        <w:t xml:space="preserve">GPU power control.</w:t>
+      </w:r>
+      <w:r>
+        <w:t xml:space="preserve"> </w:t>
+      </w:r>
+      <w:r>
+        <w:t xml:space="preserve">Today a data center adjusts its AI load by capping GPU power or by switching GPUs off. A GPU's power draw is a software setting: one command sets a cap, and within about 0.2 s the GPU uses less power and runs a little slower. Capping lets a facility fit its load to the power it has, and fit more GPUs behind one connection. Switching off forfeits work, and capping blindly throws away work too.</w:t>
+      </w:r>
+    </w:p>
+    <w:p>
+      <w:pPr>
+        <w:widowControl w:val="0"/>
+        <w:pStyle w:val="BodyText"/>
+        <w:jc w:val="both"/>
+      </w:pPr>
       <w:r>
         <w:rPr>
           <w:b/>
           <w:bCs/>
         </w:rPr>
-        <w:t xml:space="preserve">Joule Point (JP)</w:t>
-      </w:r>
-      <w:r>
-        <w:t xml:space="preserve">, before rising again. The PI's study [1] measured the JP across 20 models and 4 GPUs: well below the thermal design power (TDP, the card's full rated power), near-constant per card, and 29–31 percent less energy per task at about 1.2 times the runtime. A capped card draws less power, so more cards fit behind the same connection: on the measured A100 curve, up to about 50 percent more AI work per connected megawatt at the chip. Data centers still run cards at maximum power, the energy-worst point, and Israel's grid is sized for it.</w:t>
-      </w:r>
-    </w:p>
-    <w:p>
-      <w:pPr>
-        <w:widowControl w:val="0"/>
-        <w:pStyle w:val="BodyText"/>
-        <w:jc w:val="both"/>
-      </w:pPr>
+        <w:t xml:space="preserve">The Joule Point.</w:t>
+      </w:r>
+      <w:r>
+        <w:t xml:space="preserve"> </w:t>
+      </w:r>
+      <w:r>
+        <w:t xml:space="preserve">There is a best cap. The PI's study [1] measured 20 AI models on 4 GPUs. It found a simple rule, the</w:t>
+      </w:r>
+      <w:r>
+        <w:t xml:space="preserve"> </w:t>
+      </w:r>
       <w:r>
         <w:rPr>
           <w:b/>
           <w:bCs/>
         </w:rPr>
-        <w:t xml:space="preserve">The objective</w:t>
-      </w:r>
-      <w:r>
-        <w:t xml:space="preserve"> </w:t>
-      </w:r>
-      <w:r>
-        <w:t xml:space="preserve">is to give the Ministry (policy) and the Electricity Authority (connection licensing) measured tools to license AI load on condition of flexibility, so that</w:t>
+        <w:t xml:space="preserve">power-response law</w:t>
+      </w:r>
+      <w:r>
+        <w:t xml:space="preserve">: when the cap is lowered, the GPU's output drops more slowly than its power. Energy per task therefore drops to a minimum, the</w:t>
       </w:r>
       <w:r>
         <w:t xml:space="preserve"> </w:t>
@@ -1292,23 +1119,30 @@
           <w:b/>
           <w:bCs/>
         </w:rPr>
-        <w:t xml:space="preserve">each connected megawatt does more useful AI work</w:t>
-      </w:r>
-      <w:r>
-        <w:t xml:space="preserve">. The instrument is</w:t>
-      </w:r>
-      <w:r>
-        <w:t xml:space="preserve"> </w:t>
-      </w:r>
+        <w:t xml:space="preserve">Joule Point (JP)</w:t>
+      </w:r>
+      <w:r>
+        <w:t xml:space="preserve">, and rises again below it. Airlines face the same trade-off: flying faster burns fuel much faster, but flying too slowly keeps the engines running longer, so planes cruise at the speed that uses the least fuel per kilometer. The Joule Point is the GPU's cruising speed. Measured at the GPU board, the JP sits well below rated power (TDP) and is nearly the same for every job on a given card. At the JP a GPU uses 29–31 percent less energy per task and takes about 1.2 times longer. Run at the JP, a fixed connection delivers up to about 50 percent more AI work per connected megawatt (measured A100 curve, at the chip, to be confirmed at the facility meter). Running at maximum, today's default, is the energy-worst point, and it is the point the grid is being sized for.</w:t>
+      </w:r>
+    </w:p>
+    <w:p>
+      <w:pPr>
+        <w:widowControl w:val="0"/>
+        <w:pStyle w:val="BodyText"/>
+        <w:jc w:val="both"/>
+      </w:pPr>
       <w:r>
         <w:rPr>
           <w:b/>
           <w:bCs/>
         </w:rPr>
-        <w:t xml:space="preserve">JouleFlex</w:t>
-      </w:r>
-      <w:r>
-        <w:t xml:space="preserve">: models and tools for operating and planning AI data centers under constrained and variable power. Within 24 months the project extends the measured foundation to current hardware, builds the control engine and a simulator that replays the measurements, measures the flexibility a facility can offer, and analyzes the pricing and connection rules, with a stated minimum-success path (2.5.7.1); multi-site deployment follows the grant. Four capabilities, each built on the JP:</w:t>
+        <w:t xml:space="preserve">The objective</w:t>
+      </w:r>
+      <w:r>
+        <w:t xml:space="preserve"> </w:t>
+      </w:r>
+      <w:r>
+        <w:t xml:space="preserve">is to research, validate and develop a set of models and methods for controlling, pricing, planning and allocating power in AI data centers whose power is limited and changes over time. With them, a data center can be connected on condition of flexibility: it runs its GPUs near the Joule Point and lowers their power further when the grid asks.</w:t>
       </w:r>
       <w:r>
         <w:t xml:space="preserve"> </w:t>
@@ -1318,29 +1152,33 @@
           <w:b/>
           <w:bCs/>
         </w:rPr>
-        <w:t xml:space="preserve">(C1) Power-control and workload-allocation methods:</w:t>
-      </w:r>
-      <w:r>
-        <w:t xml:space="preserve"> </w:t>
-      </w:r>
-      <w:r>
-        <w:t xml:space="preserve">the power-response law validated on current hardware and whole servers; job and transfer models that place the energy-optimal cap for any workload or unmeasured GPU; and a control engine that assigns jobs and caps together to hold a facility inside its power envelope while meeting deadlines.</w:t>
-      </w:r>
-      <w:r>
-        <w:t xml:space="preserve"> </w:t>
-      </w:r>
+        <w:t xml:space="preserve">Each connected megawatt then does more useful AI work.</w:t>
+      </w:r>
+      <w:r>
+        <w:t xml:space="preserve"> </w:t>
+      </w:r>
+      <w:r>
+        <w:t xml:space="preserve">This is a third option between full-power connection and refusal.</w:t>
+      </w:r>
+    </w:p>
+    <w:p>
+      <w:pPr>
+        <w:widowControl w:val="0"/>
+        <w:pStyle w:val="BodyText"/>
+        <w:jc w:val="both"/>
+      </w:pPr>
       <w:r>
         <w:rPr>
           <w:b/>
           <w:bCs/>
         </w:rPr>
-        <w:t xml:space="preserve">(C2) Pricing rules evaluated in the simulator</w:t>
-      </w:r>
-      <w:r>
-        <w:t xml:space="preserve"> </w:t>
-      </w:r>
-      <w:r>
-        <w:t xml:space="preserve">that reward efficient use of flexible power instead of per-hour billing, which rewards the energy-worst point.</w:t>
+        <w:t xml:space="preserve">Deliverables.</w:t>
+      </w:r>
+      <w:r>
+        <w:t xml:space="preserve"> </w:t>
+      </w:r>
+      <w:r>
+        <w:t xml:space="preserve">Within 24 months the project delivers</w:t>
       </w:r>
       <w:r>
         <w:t xml:space="preserve"> </w:t>
@@ -1350,35 +1188,10 @@
           <w:b/>
           <w:bCs/>
         </w:rPr>
-        <w:t xml:space="preserve">(C3) Fleet-planning methods for power-variable operation:</w:t>
-      </w:r>
-      <w:r>
-        <w:t xml:space="preserve"> </w:t>
-      </w:r>
-      <w:r>
-        <w:t xml:space="preserve">which cards, how many, with what power headroom, deliver the most work behind a variable connection.</w:t>
-      </w:r>
-      <w:r>
-        <w:t xml:space="preserve"> </w:t>
-      </w:r>
-      <w:r>
-        <w:rPr>
-          <w:b/>
-          <w:bCs/>
-        </w:rPr>
-        <w:t xml:space="preserve">(C4) Connection-scenario analysis for the regulator:</w:t>
-      </w:r>
-      <w:r>
-        <w:t xml:space="preserve"> </w:t>
-      </w:r>
-      <w:r>
-        <w:t xml:space="preserve">by transmission region, how much of the connection queue could be served under firm-plus-flexible connections at each flexibility level, under technical, economic and policy constraints.</w:t>
-      </w:r>
-      <w:r>
-        <w:t xml:space="preserve"> </w:t>
-      </w:r>
-      <w:r>
-        <w:t xml:space="preserve">A simulator replaying the measured curves evaluates all four; C3 and C4 are scenario analyses run in the simulator on public Noga and Electricity Authority data (milestones in 2.5.7.1); they are studies, not deployed systems; everything is released openly with ELF-2, the extended dataset.</w:t>
+        <w:t xml:space="preserve">JouleFlex</w:t>
+      </w:r>
+      <w:r>
+        <w:t xml:space="preserve">, an open software toolkit built on the JP (minimum-success path in 2.5.7.1). At its core is a control engine (C1). It predicts the best power cap for each job and each GPU, decides which GPU runs which job, and keeps the facility within its power limit while jobs meet their deadlines. Around it, the toolkit sets prices that reward efficient use of flexible power, instead of today's per-hour billing that pushes renters to full power (C2). It designs the fleet: for an expected workload and power limit, it picks which GPUs to buy, and how many, by weighing their cost against the revenue they earn when each runs at its estimated Joule Point (C3). And it shows, region by region, how much of the queue could be connected if part of each connection were flexible (C4). A simulator built from the measurements tests all four. C3 and C4 are studies on public data, not deployed systems, and everything is released openly (2.5.6.1).</w:t>
       </w:r>
     </w:p>
     <w:bookmarkEnd w:id="26"/>
@@ -1405,17 +1218,7 @@
         <w:jc w:val="both"/>
       </w:pPr>
       <w:r>
-        <w:t xml:space="preserve">Can an AI data center run as a controllable electrical load under Israeli grid constraints: each GPU near its energy-optimal cap, the facility inside a power limit that changes over time, more AI work per unit of energy and of connected power, and every admitted job meeting its deadline?</w:t>
-      </w:r>
-    </w:p>
-    <w:p>
-      <w:pPr>
-        <w:widowControl w:val="0"/>
-        <w:pStyle w:val="BodyText"/>
-        <w:jc w:val="both"/>
-      </w:pPr>
-      <w:r>
-        <w:t xml:space="preserve">Six sub-questions structure the work plan:</w:t>
+        <w:t xml:space="preserve">The central question is whether an AI data center can act as a flexible electrical load: one that runs efficiently, follows a power limit that changes over time, and still finishes its work on time. Four research questions follow. Each answers one knowledge gap (2.5.5.3), is worked on in the work packages named with it (2.5.5.5), and yields one deliverable (2.5.4.1).</w:t>
       </w:r>
     </w:p>
     <w:p>
@@ -1433,13 +1236,13 @@
           <w:b/>
           <w:bCs/>
         </w:rPr>
-        <w:t xml:space="preserve">Does the law generalize?</w:t>
-      </w:r>
-      <w:r>
-        <w:t xml:space="preserve"> </w:t>
-      </w:r>
-      <w:r>
-        <w:t xml:space="preserve">Do the power law and JP (measured on 20 models, 4 GPUs) hold on H100/L40S-class hardware, production inference software (running a trained AI model to answer requests), and shared GPUs?</w:t>
+        <w:t xml:space="preserve">Control (C1).</w:t>
+      </w:r>
+      <w:r>
+        <w:t xml:space="preserve"> </w:t>
+      </w:r>
+      <w:r>
+        <w:t xml:space="preserve">Can the Joule Point be predicted for any job and GPU, and can a controller keep a whole facility near it under a changing power limit while meeting deadlines? (WP1–WP3)</w:t>
       </w:r>
     </w:p>
     <w:p>
@@ -1457,13 +1260,13 @@
           <w:b/>
           <w:bCs/>
         </w:rPr>
-        <w:t xml:space="preserve">When is one cap per card enough,</w:t>
-      </w:r>
-      <w:r>
-        <w:t xml:space="preserve"> </w:t>
-      </w:r>
-      <w:r>
-        <w:t xml:space="preserve">and where must a job model replace the near-constant per-card JP?</w:t>
+        <w:t xml:space="preserve">Pricing (C2).</w:t>
+      </w:r>
+      <w:r>
+        <w:t xml:space="preserve"> </w:t>
+      </w:r>
+      <w:r>
+        <w:t xml:space="preserve">Which prices reward a data center for using flexible power efficiently instead of running at full power? (WP5)</w:t>
       </w:r>
     </w:p>
     <w:p>
@@ -1481,13 +1284,13 @@
           <w:b/>
           <w:bCs/>
         </w:rPr>
-        <w:t xml:space="preserve">Where is the true optimum at the wall?</w:t>
-      </w:r>
-      <w:r>
-        <w:t xml:space="preserve"> </w:t>
-      </w:r>
-      <w:r>
-        <w:t xml:space="preserve">What is the JP at the server's electrical input, which the grid meters, not just the board?</w:t>
+        <w:t xml:space="preserve">Planning (C3).</w:t>
+      </w:r>
+      <w:r>
+        <w:t xml:space="preserve"> </w:t>
+      </w:r>
+      <w:r>
+        <w:t xml:space="preserve">For an expected workload and a limited, changing power supply, which GPUs, and how many, give the best return once hardware cost, energy cost and revenue are counted? (WP2–WP3)</w:t>
       </w:r>
     </w:p>
     <w:p>
@@ -1505,67 +1308,13 @@
           <w:b/>
           <w:bCs/>
         </w:rPr>
-        <w:t xml:space="preserve">Can we skip the measurement?</w:t>
-      </w:r>
-      <w:r>
-        <w:t xml:space="preserve"> </w:t>
-      </w:r>
-      <w:r>
-        <w:t xml:space="preserve">Can an unmeasured GPU's JP be predicted from published specs plus at most one short test?</w:t>
-      </w:r>
-    </w:p>
-    <w:p>
-      <w:pPr>
-        <w:widowControl w:val="0"/>
-        <w:pStyle w:val="Compact"/>
-        <w:numPr>
-          <w:ilvl w:val="0"/>
-          <w:numId w:val="1001"/>
-        </w:numPr>
-        <w:jc w:val="both"/>
-      </w:pPr>
-      <w:r>
-        <w:rPr>
-          <w:b/>
-          <w:bCs/>
-        </w:rPr>
-        <w:t xml:space="preserve">Can allocation and power be optimized together?</w:t>
-      </w:r>
-      <w:r>
-        <w:t xml:space="preserve"> </w:t>
-      </w:r>
-      <w:r>
-        <w:t xml:space="preserve">Can job placement and per-card caps be chosen jointly under a time-varying power limit with every deadline met, and which card mix and power headroom deliver the most work behind a variable connection (C1, C3)?</w:t>
-      </w:r>
-    </w:p>
-    <w:p>
-      <w:pPr>
-        <w:widowControl w:val="0"/>
-        <w:pStyle w:val="Compact"/>
-        <w:numPr>
-          <w:ilvl w:val="0"/>
-          <w:numId w:val="1001"/>
-        </w:numPr>
-        <w:jc w:val="both"/>
-      </w:pPr>
-      <w:r>
-        <w:rPr>
-          <w:b/>
-          <w:bCs/>
-        </w:rPr>
-        <w:t xml:space="preserve">How much flexibility can a facility sell?</w:t>
-      </w:r>
-      <w:r>
-        <w:t xml:space="preserve"> </w:t>
-      </w:r>
-      <w:r>
-        <w:t xml:space="preserve">How much power can be shed, how fast, for how long, at what notice and cost; which pricing rules make flexibility profitable;</w:t>
-      </w:r>
-      <w:r>
-        <w:t xml:space="preserve"> </w:t>
-      </w:r>
-      <w:r>
-        <w:t xml:space="preserve">and how much of the queue, by transmission region, firm-plus-flexible connections could serve (C2, C4)?</w:t>
+        <w:t xml:space="preserve">Allocation (C4).</w:t>
+      </w:r>
+      <w:r>
+        <w:t xml:space="preserve"> </w:t>
+      </w:r>
+      <w:r>
+        <w:t xml:space="preserve">How much power can a facility give back to the grid, and how much of the connection queue could flexible connections serve, region by region? (WP4–WP5)</w:t>
       </w:r>
     </w:p>
     <w:bookmarkEnd w:id="27"/>
@@ -1622,10 +1371,7 @@
         <w:t xml:space="preserve"> </w:t>
       </w:r>
       <w:r>
-        <w:t xml:space="preserve">Data centers, with AI the main growth driver, approach 945 TWh of electricity demand by 2030 [3]</w:t>
-      </w:r>
-      <w:r>
-        <w:t xml:space="preserve">; Israel's grid is isolated, with no cross-border connections, so the 27,000 MW queue [2] makes connected megawatts, not energy, the binding national limit; today's operating decisions think in watts, not joules.</w:t>
+        <w:t xml:space="preserve">Data centers, with AI the main growth driver, approach 945 TWh of electricity demand by 2030 [3]. On Israel's island grid, the 27,000 MW queue [2] makes connected megawatts, not energy, the binding national limit. Yet how much AI work a connected megawatt delivers is set by the energy each task uses. Today's operating decisions think in watts, not joules.</w:t>
       </w:r>
     </w:p>
     <w:p>
@@ -1645,7 +1391,7 @@
         <w:t xml:space="preserve"> </w:t>
       </w:r>
       <w:r>
-        <w:t xml:space="preserve">The PI's study [1] (the ELF dataset) mapped how energy per task depends on the power cap: board power follows a simple empirical law in the computing rate θ,</w:t>
+        <w:t xml:space="preserve">The PI's study [1] (the ELF dataset) measured how energy per task depends on the power cap. Board power follows a simple empirical law in the computing rate θ,</w:t>
       </w:r>
     </w:p>
     <w:p>
@@ -1757,7 +1503,7 @@
         <w:jc w:val="both"/>
       </w:pPr>
       <w:r>
-        <w:t xml:space="preserve">a fixed floor P₀ plus a superlinear term, so energy per task, E = P/θ, is U-shaped in the cap with its minimum, the</w:t>
+        <w:t xml:space="preserve">a fixed floor P₀ plus a term that grows faster than the rate. Energy per task, E = P/θ, is therefore U-shaped in the cap. Its minimum, the</w:t>
       </w:r>
       <w:r>
         <w:t xml:space="preserve"> </w:t>
@@ -1770,7 +1516,7 @@
         <w:t xml:space="preserve">JP</w:t>
       </w:r>
       <w:r>
-        <w:t xml:space="preserve">, at 43 to 46 percent of rated power on the large GPUs; the cap is one software command, fast enough to follow grid signals [1]. These are GPU board numbers; server-input (BMC) power adds host overhead but excludes cooling and building losses (PUE), so WP1 and WP4 confirm the facility megawatt the grid sees.</w:t>
+        <w:t xml:space="preserve">, sits at 43 to 46 percent of rated power on the large GPUs. These are GPU board numbers. The grid meters further up a chain: the board, then the server input (adding the host's own power), then the facility (adding cooling and building losses, PUE). WP1 measures the board-to-server step. WP4 carries it to the facility megawatt the grid sees.</w:t>
       </w:r>
     </w:p>
     <w:bookmarkEnd w:id="29"/>
@@ -1813,7 +1559,7 @@
         <w:t xml:space="preserve"> </w:t>
       </w:r>
       <w:r>
-        <w:t xml:space="preserve">[4] named the fixed, work-independent part of server power the central inefficiency; our floor P₀ measures it for GPUs.</w:t>
+        <w:t xml:space="preserve">[4] identified the power a server draws even when idle as the main waste. Our floor P₀ measures this idle draw for GPUs.</w:t>
       </w:r>
       <w:r>
         <w:t xml:space="preserve"> </w:t>
@@ -1829,7 +1575,7 @@
         <w:t xml:space="preserve"> </w:t>
       </w:r>
       <w:r>
-        <w:t xml:space="preserve">proved that energy is minimized at a sub-maximal speed [5,6,7]; ELF gives the measured form for GPU inference.</w:t>
+        <w:t xml:space="preserve">proved that energy is minimized at a speed below maximum [5,6,7]. ELF gives the measured form for GPU inference.</w:t>
       </w:r>
       <w:r>
         <w:t xml:space="preserve"> </w:t>
@@ -1842,7 +1588,7 @@
         <w:t xml:space="preserve">GPU energy systems</w:t>
       </w:r>
       <w:r>
-        <w:t xml:space="preserve">, Zeus [8] and the ML.ENERGY benchmarks [9,10], search for a setting per job at runtime; the per-card-constant JP replaces the search with one measurement.</w:t>
+        <w:t xml:space="preserve">: Zeus [8] and the ML.ENERGY benchmarks [9,10] search for the best GPU setting for each job while it runs. Because the JP is nearly the same for every job on a given card, one measurement replaces that search.</w:t>
       </w:r>
       <w:r>
         <w:t xml:space="preserve"> </w:t>
@@ -1855,7 +1601,7 @@
         <w:t xml:space="preserve">Production context</w:t>
       </w:r>
       <w:r>
-        <w:t xml:space="preserve">: cluster studies [11] and public traces [12] supply job arrivals; energy-aware GPU schedulers [13,14] leave device power at its default; methodology reviews [15] motivate the fixed protocol. Recent work power-caps inference servers at one recommended cap [20], finds capping ineffective for memory-bound decode [23], and runs AI data centers as grid assets by following a facility power target [21]; 2.5.5.6 states where JouleFlex departs from each.</w:t>
+        <w:t xml:space="preserve">: cluster studies [11] and public traces [12] show how jobs arrive. Energy-aware GPU schedulers [13,14] leave GPU power at its default. Method reviews [15] support our fixed measurement protocol. Recent work caps inference servers at one fixed power [20]. Other work finds capping does little during decode [23], the step where a language model writes its answer word by word and is slowed by memory, not computation. A third line runs AI data centers as grid assets that follow a facility power target [21].</w:t>
       </w:r>
     </w:p>
     <w:bookmarkEnd w:id="30"/>
@@ -1890,13 +1636,13 @@
           <w:b/>
           <w:bCs/>
         </w:rPr>
-        <w:t xml:space="preserve">The law's reach and job dependence are unmapped.</w:t>
-      </w:r>
-      <w:r>
-        <w:t xml:space="preserve"> </w:t>
-      </w:r>
-      <w:r>
-        <w:t xml:space="preserve">The law is established for single jobs at fixed settings on three finely swept GPUs (A100, A10G, L4); its persistence on H100 and B200-class hardware, production serving software and shared cards is unknown; the per-card constant holds only when the GPU is busy enough that the cap binds, no model predicts a job's operating point from its features, and placing the JP on a new GPU still requires a full sweep [1].</w:t>
+        <w:t xml:space="preserve">Control (C1): the optimum is mapped only in the lab.</w:t>
+      </w:r>
+      <w:r>
+        <w:t xml:space="preserve"> </w:t>
+      </w:r>
+      <w:r>
+        <w:t xml:space="preserve">The Joule Point is established for single jobs at fixed settings on three GPUs (A100, A10G, L4) [1]. Whether it holds on newer hardware, on production AI software and on shared GPUs is unknown. No model yet predicts the best cap for a new job or GPU without a full measurement sweep. And no controller yet chooses job placement and power caps together under one changing power limit: the 18 to 45 percent fleet saving used a fixed placement and caps chosen afterward.</w:t>
       </w:r>
     </w:p>
     <w:p>
@@ -1914,13 +1660,13 @@
           <w:b/>
           <w:bCs/>
         </w:rPr>
-        <w:t xml:space="preserve">All published numbers are board numbers.</w:t>
-      </w:r>
-      <w:r>
-        <w:t xml:space="preserve"> </w:t>
-      </w:r>
-      <w:r>
-        <w:t xml:space="preserve">The grid meters the facility; host overhead and power-supply losses shift the optimum upward by an amount WP1 measures; the chip-level megawatt figure awaits facility confirmation.</w:t>
+        <w:t xml:space="preserve">Pricing (C2): the incentive points the wrong way.</w:t>
+      </w:r>
+      <w:r>
+        <w:t xml:space="preserve"> </w:t>
+      </w:r>
+      <w:r>
+        <w:t xml:space="preserve">Under per-hour billing, full power is the renter's cheapest option. A per-joule surcharge is too small to change that, because energy is a small part of the hourly rent [1]. Which prices do work is open.</w:t>
       </w:r>
     </w:p>
     <w:p>
@@ -1938,13 +1684,13 @@
           <w:b/>
           <w:bCs/>
         </w:rPr>
-        <w:t xml:space="preserve">Allocation and power control are not jointly optimized.</w:t>
-      </w:r>
-      <w:r>
-        <w:t xml:space="preserve"> </w:t>
-      </w:r>
-      <w:r>
-        <w:t xml:space="preserve">The 18 to 45 percent fleet saving used a fixed budget, a fixed placement rule and caps chosen afterward; the joint problem, coupling discrete scheduling to continuous control through one power budget, is unsolved.</w:t>
+        <w:t xml:space="preserve">Planning (C3): fleets are sized for full power.</w:t>
+      </w:r>
+      <w:r>
+        <w:t xml:space="preserve"> </w:t>
+      </w:r>
+      <w:r>
+        <w:t xml:space="preserve">Data centers choose GPUs as if each runs at full power and power were unlimited. No method yet picks the GPU mix that earns the most for an expected workload under a power limit, using each card's own optimum.</w:t>
       </w:r>
     </w:p>
     <w:p>
@@ -1962,70 +1708,56 @@
           <w:b/>
           <w:bCs/>
         </w:rPr>
-        <w:t xml:space="preserve">Flexibility is unquantified.</w:t>
-      </w:r>
-      <w:r>
-        <w:t xml:space="preserve"> </w:t>
-      </w:r>
-      <w:r>
-        <w:t xml:space="preserve">How much power an AI facility can shed, how fast, for how long, at what cost has never been measured or standardized;</w:t>
-      </w:r>
-      <w:r>
-        <w:t xml:space="preserve"> </w:t>
-      </w:r>
-      <w:r>
-        <w:t xml:space="preserve">the Authority's hearing [19] is open and these numbers are not yet in it.</w:t>
-      </w:r>
-    </w:p>
-    <w:p>
-      <w:pPr>
-        <w:widowControl w:val="0"/>
-        <w:pStyle w:val="Compact"/>
-        <w:numPr>
-          <w:ilvl w:val="0"/>
-          <w:numId w:val="1002"/>
-        </w:numPr>
-        <w:jc w:val="both"/>
-      </w:pPr>
+        <w:t xml:space="preserve">Allocation (C4): flexibility is unmeasured.</w:t>
+      </w:r>
+      <w:r>
+        <w:t xml:space="preserve"> </w:t>
+      </w:r>
+      <w:r>
+        <w:t xml:space="preserve">All published numbers are GPU-board numbers, while the grid meters the whole facility, where server and power-supply losses add to the fixed power floor and move the optimum. How much power an AI facility can give back, how fast, for how long and at what cost has never been measured. The Authority's open hearing on the large-load connection track [19] does not yet have these numbers.</w:t>
+      </w:r>
+    </w:p>
+    <w:bookmarkEnd w:id="31"/>
+    <w:bookmarkStart w:id="32" w:name="description-of-the-proposed-research"/>
+    <w:p>
+      <w:pPr>
+        <w:keepLines w:val="0"/>
+        <w:keepNext w:val="0"/>
+        <w:widowControl w:val="0"/>
+        <w:pStyle w:val="Heading3"/>
+        <w:jc w:val="left"/>
+      </w:pPr>
+      <w:r>
+        <w:rPr>
+          <w:color w:val="111111"/>
+        </w:rPr>
+        <w:t xml:space="preserve">2.5.5.4 Description of the proposed research</w:t>
+      </w:r>
+    </w:p>
+    <w:p>
+      <w:pPr>
+        <w:widowControl w:val="0"/>
+        <w:pStyle w:val="FirstParagraph"/>
+        <w:jc w:val="both"/>
+      </w:pPr>
+      <w:r>
+        <w:t xml:space="preserve">JouleFlex builds one measured foundation and four tools on it.</w:t>
+      </w:r>
+      <w:r>
+        <w:t xml:space="preserve"> </w:t>
+      </w:r>
       <w:r>
         <w:rPr>
           <w:b/>
           <w:bCs/>
         </w:rPr>
-        <w:t xml:space="preserve">The incentive problem is identified but unsolved.</w:t>
-      </w:r>
-      <w:r>
-        <w:t xml:space="preserve"> </w:t>
-      </w:r>
-      <w:r>
-        <w:t xml:space="preserve">Per-hour billing makes the renter's cheapest choice the energy-worst point, and a per-joule surcharge is too weak [1]; which structural instruments work is open.</w:t>
-      </w:r>
-    </w:p>
-    <w:bookmarkEnd w:id="31"/>
-    <w:bookmarkStart w:id="32" w:name="description-of-the-proposed-research"/>
-    <w:p>
-      <w:pPr>
-        <w:keepLines w:val="0"/>
-        <w:keepNext w:val="0"/>
-        <w:widowControl w:val="0"/>
-        <w:pStyle w:val="Heading3"/>
-        <w:jc w:val="left"/>
-      </w:pPr>
-      <w:r>
-        <w:rPr>
-          <w:color w:val="111111"/>
-        </w:rPr>
-        <w:t xml:space="preserve">2.5.5.4 Description of the proposed research</w:t>
-      </w:r>
-    </w:p>
-    <w:p>
-      <w:pPr>
-        <w:widowControl w:val="0"/>
-        <w:pStyle w:val="FirstParagraph"/>
-        <w:jc w:val="both"/>
-      </w:pPr>
-      <w:r>
-        <w:t xml:space="preserve">JouleFlex builds one measured foundation and four tools on it:</w:t>
+        <w:t xml:space="preserve">WP1 and WP2 measure and predict</w:t>
+      </w:r>
+      <w:r>
+        <w:t xml:space="preserve"> </w:t>
+      </w:r>
+      <w:r>
+        <w:t xml:space="preserve">the best cap for each job and card.</w:t>
       </w:r>
       <w:r>
         <w:t xml:space="preserve"> </w:t>
@@ -2035,13 +1767,13 @@
           <w:b/>
           <w:bCs/>
         </w:rPr>
-        <w:t xml:space="preserve">WP1–WP2 measure and predict</w:t>
-      </w:r>
-      <w:r>
-        <w:t xml:space="preserve"> </w:t>
-      </w:r>
-      <w:r>
-        <w:t xml:space="preserve">the energy-optimal operating point per job and card;</w:t>
+        <w:t xml:space="preserve">WP3 controls</w:t>
+      </w:r>
+      <w:r>
+        <w:t xml:space="preserve"> </w:t>
+      </w:r>
+      <w:r>
+        <w:t xml:space="preserve">job placement and power in real time, tested in a digital twin (a simulator replaying the measurements).</w:t>
       </w:r>
       <w:r>
         <w:t xml:space="preserve"> </w:t>
@@ -2051,26 +1783,10 @@
           <w:b/>
           <w:bCs/>
         </w:rPr>
-        <w:t xml:space="preserve">WP3 controls</w:t>
-      </w:r>
-      <w:r>
-        <w:t xml:space="preserve"> </w:t>
-      </w:r>
-      <w:r>
-        <w:t xml:space="preserve">allocation and power in real time in a digital twin;</w:t>
-      </w:r>
-      <w:r>
-        <w:t xml:space="preserve"> </w:t>
-      </w:r>
-      <w:r>
-        <w:rPr>
-          <w:b/>
-          <w:bCs/>
-        </w:rPr>
-        <w:t xml:space="preserve">WP4–WP5 connect to the grid</w:t>
-      </w:r>
-      <w:r>
-        <w:t xml:space="preserve">, defining the flexibility a facility can offer and the rules that reward it.</w:t>
+        <w:t xml:space="preserve">WP4 and WP5 connect to the grid</w:t>
+      </w:r>
+      <w:r>
+        <w:t xml:space="preserve">: the flexibility a facility can offer, and the rules that reward it.</w:t>
       </w:r>
     </w:p>
     <w:bookmarkEnd w:id="32"/>
@@ -2201,28 +1917,12 @@
             </w:pPr>
             <w:r>
               <w:rPr>
-                <w:sz w:val="21"/>
-                <w:szCs w:val="21"/>
-              </w:rPr>
-              <w:t xml:space="preserve">Extend the energy-versus-power measurements to current GPUs, production software, and whole-server power.</w:t>
-            </w:r>
-          </w:p>
-        </w:tc>
-        <w:tc>
-          <w:tcPr/>
-          <w:p>
-            <w:pPr>
-              <w:spacing w:line="317" w:lineRule="auto" w:before="20" w:after="20"/>
-              <w:widowControl w:val="0"/>
-              <w:pStyle w:val="Compact"/>
-              <w:jc w:val="both"/>
-            </w:pPr>
-            <w:r>
-              <w:rPr>
-                <w:sz w:val="21"/>
-                <w:szCs w:val="21"/>
-              </w:rPr>
-              <w:t xml:space="preserve">Re-run the study's measurement sweep on current GPUs (H100/L40S class) and production serving engines (vLLM [16] and TensorRT-LLM,</w:t>
+                <w:b/>
+                <w:bCs/>
+                <w:sz w:val="21"/>
+                <w:szCs w:val="21"/>
+              </w:rPr>
+              <w:t xml:space="preserve">Foundation for C1–C4.</w:t>
             </w:r>
             <w:r>
               <w:rPr>
@@ -2236,84 +1936,25 @@
                 <w:sz w:val="21"/>
                 <w:szCs w:val="21"/>
               </w:rPr>
-              <w:t xml:space="preserve">the software that runs AI models for users</w:t>
-            </w:r>
-            <w:r>
-              <w:rPr>
-                <w:sz w:val="21"/>
-                <w:szCs w:val="21"/>
-              </w:rPr>
-              <w:t xml:space="preserve">), reading power at three tiers: GPU board (NVML,</w:t>
-            </w:r>
-            <w:r>
-              <w:rPr>
-                <w:sz w:val="21"/>
-                <w:szCs w:val="21"/>
-              </w:rPr>
-              <w:t xml:space="preserve"> </w:t>
-            </w:r>
-            <w:r>
-              <w:rPr>
-                <w:sz w:val="21"/>
-                <w:szCs w:val="21"/>
-              </w:rPr>
-              <w:t xml:space="preserve">the GPU's built-in power meter</w:t>
-            </w:r>
-            <w:r>
-              <w:rPr>
-                <w:sz w:val="21"/>
-                <w:szCs w:val="21"/>
-              </w:rPr>
-              <w:t xml:space="preserve">), host CPU (RAPL,</w:t>
-            </w:r>
-            <w:r>
-              <w:rPr>
-                <w:sz w:val="21"/>
-                <w:szCs w:val="21"/>
-              </w:rPr>
-              <w:t xml:space="preserve"> </w:t>
-            </w:r>
-            <w:r>
-              <w:rPr>
-                <w:sz w:val="21"/>
-                <w:szCs w:val="21"/>
-              </w:rPr>
-              <w:t xml:space="preserve">the CPU's built-in meter</w:t>
-            </w:r>
-            <w:r>
-              <w:rPr>
-                <w:sz w:val="21"/>
-                <w:szCs w:val="21"/>
-              </w:rPr>
-              <w:t xml:space="preserve">), and server input, the wall tier (</w:t>
-            </w:r>
-            <w:r>
-              <w:rPr>
-                <w:sz w:val="21"/>
-                <w:szCs w:val="21"/>
-              </w:rPr>
-              <w:t xml:space="preserve">BMC, the server's management controller</w:t>
-            </w:r>
-            <w:r>
-              <w:rPr>
-                <w:sz w:val="21"/>
-                <w:szCs w:val="21"/>
-              </w:rPr>
-              <w:t xml:space="preserve">).</w:t>
-            </w:r>
-            <w:r>
-              <w:rPr>
-                <w:sz w:val="21"/>
-                <w:szCs w:val="21"/>
-              </w:rPr>
-              <w:t xml:space="preserve"> </w:t>
-            </w:r>
-            <w:r>
-              <w:rPr>
-                <w:sz w:val="21"/>
-                <w:szCs w:val="21"/>
-              </w:rPr>
-              <w:t xml:space="preserve">The JP is where the tangent from the origin meets P(θ) (dE/dθ = 0); a meter gain error leaves it unchanged and an additive offset shifts it, so JP location and per-card savings are gain-robust while absolute board-to-wall and megawatt figures carry the offset caveat.</w:t>
+              <w:t xml:space="preserve">Repeat the energy-versus-power measurements on current GPUs, production software and whole servers.</w:t>
+            </w:r>
+          </w:p>
+        </w:tc>
+        <w:tc>
+          <w:tcPr/>
+          <w:p>
+            <w:pPr>
+              <w:spacing w:line="317" w:lineRule="auto" w:before="20" w:after="20"/>
+              <w:widowControl w:val="0"/>
+              <w:pStyle w:val="Compact"/>
+              <w:jc w:val="both"/>
+            </w:pPr>
+            <w:r>
+              <w:rPr>
+                <w:sz w:val="21"/>
+                <w:szCs w:val="21"/>
+              </w:rPr>
+              <w:t xml:space="preserve">WP1 re-runs the study's cap sweep (how much power and energy a GPU uses at each cap) on current GPUs (H100/L40S class) and on production serving engines (vLLM [16] and TensorRT-LLM, the software that runs AI models for users). Power is read at three points: the GPU board (NVML, the GPU's built-in meter), the host CPU (RAPL, the CPU's built-in meter), and the server input, the wall (BMC, the server's management controller). Meter error matters little: the JP is where a line from the origin touches the power curve P(θ) (dE/dθ = 0), so a meter that reads a few percent high or low leaves it unchanged. Only a fixed offset moves it, and WP1 states that caveat for absolute megawatt figures.</w:t>
             </w:r>
             <w:r>
               <w:rPr>
@@ -2381,28 +2022,12 @@
             </w:pPr>
             <w:r>
               <w:rPr>
-                <w:sz w:val="21"/>
-                <w:szCs w:val="21"/>
-              </w:rPr>
-              <w:t xml:space="preserve">Predict any new card's or job's efficient operating point without a full measurement sweep.</w:t>
-            </w:r>
-          </w:p>
-        </w:tc>
-        <w:tc>
-          <w:tcPr/>
-          <w:p>
-            <w:pPr>
-              <w:spacing w:line="317" w:lineRule="auto" w:before="20" w:after="20"/>
-              <w:widowControl w:val="0"/>
-              <w:pStyle w:val="Compact"/>
-              <w:jc w:val="both"/>
-            </w:pPr>
-            <w:r>
-              <w:rPr>
-                <w:sz w:val="21"/>
-                <w:szCs w:val="21"/>
-              </w:rPr>
-              <w:t xml:space="preserve">A job model predicts a job's best power cap from its features;</w:t>
+                <w:b/>
+                <w:bCs/>
+                <w:sz w:val="21"/>
+                <w:szCs w:val="21"/>
+              </w:rPr>
+              <w:t xml:space="preserve">Control (C1).</w:t>
             </w:r>
             <w:r>
               <w:rPr>
@@ -2416,21 +2041,25 @@
                 <w:sz w:val="21"/>
                 <w:szCs w:val="21"/>
               </w:rPr>
-              <w:t xml:space="preserve">a transfer model, a parametric per-card scaling rule calibrated by one short test, places a new card's curve and is validated leave-one-out across the measured cards.</w:t>
-            </w:r>
-            <w:r>
-              <w:rPr>
-                <w:sz w:val="21"/>
-                <w:szCs w:val="21"/>
-              </w:rPr>
-              <w:t xml:space="preserve"> </w:t>
-            </w:r>
-            <w:r>
-              <w:rPr>
-                <w:sz w:val="21"/>
-                <w:szCs w:val="21"/>
-              </w:rPr>
-              <w:t xml:space="preserve">Both report error bars and a range of validity; a short proof bounds the penalty of one cap per card.</w:t>
+              <w:t xml:space="preserve">Predict the best cap for a new card or a new job without a full measurement sweep.</w:t>
+            </w:r>
+          </w:p>
+        </w:tc>
+        <w:tc>
+          <w:tcPr/>
+          <w:p>
+            <w:pPr>
+              <w:spacing w:line="317" w:lineRule="auto" w:before="20" w:after="20"/>
+              <w:widowControl w:val="0"/>
+              <w:pStyle w:val="Compact"/>
+              <w:jc w:val="both"/>
+            </w:pPr>
+            <w:r>
+              <w:rPr>
+                <w:sz w:val="21"/>
+                <w:szCs w:val="21"/>
+              </w:rPr>
+              <w:t xml:space="preserve">A job model predicts a job's best cap from the job's features. A transfer model scales a measured card's curve to a new card after one short test. It is validated by predicting each measured card from the others. Both report error bars and a range of validity. A short proof bounds how much is lost by using one cap per card.</w:t>
             </w:r>
             <w:r>
               <w:rPr>
@@ -2498,28 +2127,44 @@
             </w:pPr>
             <w:r>
               <w:rPr>
-                <w:sz w:val="21"/>
-                <w:szCs w:val="21"/>
-              </w:rPr>
-              <w:t xml:space="preserve">Decide, in real time, which job runs on which card and at what power cap, to do the most useful work within a changing power limit.</w:t>
-            </w:r>
-          </w:p>
-        </w:tc>
-        <w:tc>
-          <w:tcPr/>
-          <w:p>
-            <w:pPr>
-              <w:spacing w:line="317" w:lineRule="auto" w:before="20" w:after="20"/>
-              <w:widowControl w:val="0"/>
-              <w:pStyle w:val="Compact"/>
-              <w:jc w:val="both"/>
-            </w:pPr>
-            <w:r>
-              <w:rPr>
-                <w:sz w:val="21"/>
-                <w:szCs w:val="21"/>
-              </w:rPr>
-              <w:t xml:space="preserve">A controller that makes both choices together, since moving a job changes others' power budget, tested in a digital twin that replays measured curves against exact baselines. When power is tight it defers low-priority work and reports the cost. Per-card capping is already solved exactly [1]; the joint step is a heuristic scored against that bound.</w:t>
+                <w:b/>
+                <w:bCs/>
+                <w:sz w:val="21"/>
+                <w:szCs w:val="21"/>
+              </w:rPr>
+              <w:t xml:space="preserve">Control and planning (C1, C3).</w:t>
+            </w:r>
+            <w:r>
+              <w:rPr>
+                <w:sz w:val="21"/>
+                <w:szCs w:val="21"/>
+              </w:rPr>
+              <w:t xml:space="preserve"> </w:t>
+            </w:r>
+            <w:r>
+              <w:rPr>
+                <w:sz w:val="21"/>
+                <w:szCs w:val="21"/>
+              </w:rPr>
+              <w:t xml:space="preserve">Decide, in real time, which job runs on which card and at what cap, to do the most useful work within a changing power limit. Then use the simulator to design the fleet: for an expected workload and power limit, compare each GPU option's cost with the revenue it earns at its estimated JP.</w:t>
+            </w:r>
+          </w:p>
+        </w:tc>
+        <w:tc>
+          <w:tcPr/>
+          <w:p>
+            <w:pPr>
+              <w:spacing w:line="317" w:lineRule="auto" w:before="20" w:after="20"/>
+              <w:widowControl w:val="0"/>
+              <w:pStyle w:val="Compact"/>
+              <w:jc w:val="both"/>
+            </w:pPr>
+            <w:r>
+              <w:rPr>
+                <w:sz w:val="21"/>
+                <w:szCs w:val="21"/>
+              </w:rPr>
+              <w:t xml:space="preserve">The controller makes both choices together, because moving a job changes the power left for the others. It is tested in a digital twin that replays the measured curves, against baselines with known exact answers. When power is tight it defers low-priority work and reports the cost. For a fixed placement, the best cap per card is already solved exactly [1]. That exact solution is the floor the joint heuristic must beat.</w:t>
             </w:r>
             <w:r>
               <w:rPr>
@@ -2587,28 +2232,44 @@
             </w:pPr>
             <w:r>
               <w:rPr>
-                <w:sz w:val="21"/>
-                <w:szCs w:val="21"/>
-              </w:rPr>
-              <w:t xml:space="preserve">Measure and characterize the flexibility a controlled facility can offer, in grid-contract form.</w:t>
-            </w:r>
-          </w:p>
-        </w:tc>
-        <w:tc>
-          <w:tcPr/>
-          <w:p>
-            <w:pPr>
-              <w:spacing w:line="317" w:lineRule="auto" w:before="20" w:after="20"/>
-              <w:widowControl w:val="0"/>
-              <w:pStyle w:val="Compact"/>
-              <w:jc w:val="both"/>
-            </w:pPr>
-            <w:r>
-              <w:rPr>
-                <w:sz w:val="21"/>
-                <w:szCs w:val="21"/>
-              </w:rPr>
-              <w:t xml:space="preserve">Measure the contractable quantities: a committed power envelope; a flexibility offer stated as MW shed of facility load measured at the connection point, ramp (seconds), hold duration (hours, through the evening peak), notice time, maximum events per season, recovery, work lost and cost; and an auditable delivery record. Demonstrate them on a rented metered server, no operator site required, and at fleet scale in the twin under an Israeli firm-plus-flexible scenario. WP4 measures both instruments defined in 2.5.6.2 (the connection coefficient and the two-tier curtailment product) at the connection point, against a stated baseline, with the work lost per MW shed.</w:t>
+                <w:b/>
+                <w:bCs/>
+                <w:sz w:val="21"/>
+                <w:szCs w:val="21"/>
+              </w:rPr>
+              <w:t xml:space="preserve">Allocation (C4).</w:t>
+            </w:r>
+            <w:r>
+              <w:rPr>
+                <w:sz w:val="21"/>
+                <w:szCs w:val="21"/>
+              </w:rPr>
+              <w:t xml:space="preserve"> </w:t>
+            </w:r>
+            <w:r>
+              <w:rPr>
+                <w:sz w:val="21"/>
+                <w:szCs w:val="21"/>
+              </w:rPr>
+              <w:t xml:space="preserve">Measure how much power a controlled facility can give up, how fast and for how long, in the form a grid contract needs.</w:t>
+            </w:r>
+          </w:p>
+        </w:tc>
+        <w:tc>
+          <w:tcPr/>
+          <w:p>
+            <w:pPr>
+              <w:spacing w:line="317" w:lineRule="auto" w:before="20" w:after="20"/>
+              <w:widowControl w:val="0"/>
+              <w:pStyle w:val="Compact"/>
+              <w:jc w:val="both"/>
+            </w:pPr>
+            <w:r>
+              <w:rPr>
+                <w:sz w:val="21"/>
+                <w:szCs w:val="21"/>
+              </w:rPr>
+              <w:t xml:space="preserve">WP4 defines three contract terms. First, a committed power limit. Second, a flexibility offer: how many MW the facility sheds at the connection point, how fast (seconds), for how long (hours, through the evening peak), with how much notice, how many times per season, and how fast it recovers, with the work lost and the cost. Third, an auditable record of delivery. It demonstrates them on a rented metered server, so no operator site is needed, and at fleet scale in the twin under an Israeli firm-plus-flexible scenario.</w:t>
             </w:r>
             <w:r>
               <w:rPr>
@@ -2676,28 +2337,12 @@
             </w:pPr>
             <w:r>
               <w:rPr>
-                <w:sz w:val="21"/>
-                <w:szCs w:val="21"/>
-              </w:rPr>
-              <w:t xml:space="preserve">Evaluate, in the simulator, which pricing and connection rules reward efficient operation, and release everything openly.</w:t>
-            </w:r>
-          </w:p>
-        </w:tc>
-        <w:tc>
-          <w:tcPr/>
-          <w:p>
-            <w:pPr>
-              <w:spacing w:line="317" w:lineRule="auto" w:before="20" w:after="20"/>
-              <w:widowControl w:val="0"/>
-              <w:pStyle w:val="Compact"/>
-              <w:jc w:val="both"/>
-            </w:pPr>
-            <w:r>
-              <w:rPr>
-                <w:sz w:val="21"/>
-                <w:szCs w:val="21"/>
-              </w:rPr>
-              <w:t xml:space="preserve">An incentive model showing why per-hour billing rewards the energy-worst point and what changes fix it;</w:t>
+                <w:b/>
+                <w:bCs/>
+                <w:sz w:val="21"/>
+                <w:szCs w:val="21"/>
+              </w:rPr>
+              <w:t xml:space="preserve">Pricing and allocation (C2, C4).</w:t>
             </w:r>
             <w:r>
               <w:rPr>
@@ -2711,14 +2356,25 @@
                 <w:sz w:val="21"/>
                 <w:szCs w:val="21"/>
               </w:rPr>
-              <w:t xml:space="preserve">a simulation-based valuation of the flexible-connection option from public figures (the TAOZ tariff, Noga marginal price, the Authority's capacity-holding payment and curtailment right [19]), reviewed by the advisor for energy-economics validity</w:t>
-            </w:r>
-            <w:r>
-              <w:rPr>
-                <w:sz w:val="21"/>
-                <w:szCs w:val="21"/>
-              </w:rPr>
-              <w:t xml:space="preserve">; each rule tested in the WP3 twin.</w:t>
+              <w:t xml:space="preserve">Test, in the simulator, which pricing and connection rules reward efficient operation, and release everything openly.</w:t>
+            </w:r>
+          </w:p>
+        </w:tc>
+        <w:tc>
+          <w:tcPr/>
+          <w:p>
+            <w:pPr>
+              <w:spacing w:line="317" w:lineRule="auto" w:before="20" w:after="20"/>
+              <w:widowControl w:val="0"/>
+              <w:pStyle w:val="Compact"/>
+              <w:jc w:val="both"/>
+            </w:pPr>
+            <w:r>
+              <w:rPr>
+                <w:sz w:val="21"/>
+                <w:szCs w:val="21"/>
+              </w:rPr>
+              <w:t xml:space="preserve">An incentive model shows why per-hour billing rewards the energy-worst point and which changes fix it. A simulation puts a value, in shekels per megawatt, on the flexible-connection option, using public figures: the TAOZ tariff, the Noga marginal price, and the Authority's capacity payment and curtailment right [19]. The project's energy-systems advisor (2.5.8) reviews the economics. Each rule is tested in the WP3 twin.</w:t>
             </w:r>
             <w:r>
               <w:rPr>
@@ -2792,19 +2448,7 @@
         <w:t xml:space="preserve"> </w:t>
       </w:r>
       <w:r>
-        <w:t xml:space="preserve">Unlike grid-following curtailment to a power target [21], JouleFlex runs each card at its measured energy-optimal cap and makes the resulting flexibility contractable and audited, quantified in MW, ramp,</w:t>
-      </w:r>
-      <w:r>
-        <w:t xml:space="preserve"> </w:t>
-      </w:r>
-      <w:r>
-        <w:t xml:space="preserve">hold duration</w:t>
-      </w:r>
-      <w:r>
-        <w:t xml:space="preserve"> </w:t>
-      </w:r>
-      <w:r>
-        <w:t xml:space="preserve">and recovery.</w:t>
+        <w:t xml:space="preserve">Grid-following controllers [21] cut a facility to whatever power target the grid sets. JouleFlex instead runs each card at its measured best cap, and turns the flexibility that results into a contract: MW shed, ramp, hold duration and recovery, measured and audited.</w:t>
       </w:r>
     </w:p>
     <w:p>
@@ -2828,7 +2472,7 @@
         <w:t xml:space="preserve"> </w:t>
       </w:r>
       <w:r>
-        <w:t xml:space="preserve">Inference power-capping saves energy at a chosen cap [20] and can be ineffective for memory-bound decode [23]; JouleFlex sets power to the computed energy optimum per (card, job) where the cap binds, and every recommendation carries its capital cost in extra cards.</w:t>
+        <w:t xml:space="preserve">Published inference capping saves energy at one chosen cap [20] and can fail for memory-bound decode [23]. JouleFlex sets each card and job to its computed energy minimum where the cap binds. Every recommendation also states its capital cost: the extra cards needed to cover the 1.2 times longer runtime.</w:t>
       </w:r>
     </w:p>
     <w:p>
@@ -2852,7 +2496,7 @@
         <w:t xml:space="preserve"> </w:t>
       </w:r>
       <w:r>
-        <w:t xml:space="preserve">WattGPU [22] and ML.ENERGY [9,10] report inference power at one operating point and open power-cap sweeps cover training or HPC; no sweep dense enough to locate the inference energy optimum existed before ELF.</w:t>
+        <w:t xml:space="preserve">WattGPU [22] and ML.ENERGY [9,10] report inference power at one setting, and open power-cap sweeps cover training or HPC. No sweep dense enough to locate the inference energy minimum existed before ELF.</w:t>
       </w:r>
     </w:p>
     <w:p>
@@ -2870,13 +2514,13 @@
           <w:b/>
           <w:bCs/>
         </w:rPr>
-        <w:t xml:space="preserve">The joint allocation-and-capping problem, to the measured optimum.</w:t>
-      </w:r>
-      <w:r>
-        <w:t xml:space="preserve"> </w:t>
-      </w:r>
-      <w:r>
-        <w:t xml:space="preserve">Placing jobs and setting every cap at the energy optimum is a joint problem grid-following controllers [21] do not address; the JouleFlex engine is a first solution on measured curves.</w:t>
+        <w:t xml:space="preserve">Job placement and capping solved together, to the measured optimum.</w:t>
+      </w:r>
+      <w:r>
+        <w:t xml:space="preserve"> </w:t>
+      </w:r>
+      <w:r>
+        <w:t xml:space="preserve">Placing jobs and setting every cap at the energy minimum is one joint problem, which grid-following controllers [21] do not address. The JouleFlex engine is a first solution on measured curves.</w:t>
       </w:r>
     </w:p>
     <w:bookmarkEnd w:id="34"/>
@@ -2903,7 +2547,13 @@
         <w:jc w:val="both"/>
       </w:pPr>
       <w:r>
-        <w:t xml:space="preserve">Submitted under topic 16.2 (AI and energy for data centers) of the Ministry's 2026 R&amp;D policy [17], call 34/2026 [18]; the core deliverable answers 16.2 and the methods land on three 2026 priorities (8, 16.1, 6.3). Clause by clause (Chapter 1 numbering):</w:t>
+        <w:t xml:space="preserve">Submitted under topic 16.2 (AI and energy for data centers) of the Ministry's 2026 R&amp;D policy [17], call 34/2026 [18].</w:t>
+      </w:r>
+      <w:r>
+        <w:t xml:space="preserve"> </w:t>
+      </w:r>
+      <w:r>
+        <w:t xml:space="preserve">The core deliverable answers 16.2, and the methods land on three 2026 priorities (8, 16.1, 6.3). Clause by clause (Chapter 1 numbering):</w:t>
       </w:r>
     </w:p>
     <w:tbl>
@@ -3019,7 +2669,7 @@
                 <w:sz w:val="21"/>
                 <w:szCs w:val="21"/>
               </w:rPr>
-              <w:t xml:space="preserve">The core deliverable: the control engine manages a farm's energy supply in real time (each card at its optimum, the fleet held to a committed envelope); the twin sizes how many cards run behind a connection and how much power can be shed.</w:t>
+              <w:t xml:space="preserve">The core deliverable: the control engine manages a farm's power in real time, keeping each card at its best setting and the whole fleet under its committed power limit. The simulator shows how many cards fit behind a connection and how much power can be shed.</w:t>
             </w:r>
           </w:p>
         </w:tc>
@@ -3169,7 +2819,7 @@
                 <w:sz w:val="21"/>
                 <w:szCs w:val="21"/>
               </w:rPr>
-              <w:t xml:space="preserve">Machine learning as the instrument: the WP2 job model predicts a job's energy-optimal cap from its features, the scaling rule places a new card's curve from one short test, and the WP3 controller solves joint allocation-and-capping over the learned curves.</w:t>
+              <w:t xml:space="preserve">Machine learning as a tool: the WP2 job model predicts each job's best cap from its features. The scaling rule predicts a new card's curve from one short test. The WP3 controller decides job placement and caps together, using the learned curves.</w:t>
             </w:r>
           </w:p>
         </w:tc>
@@ -3244,21 +2894,7 @@
                 <w:sz w:val="21"/>
                 <w:szCs w:val="21"/>
               </w:rPr>
-              <w:t xml:space="preserve">Demand management: cap actuation settles in about 0.2 s at the card and the demonstration targets a 60-second facility ramp;</w:t>
-            </w:r>
-            <w:r>
-              <w:rPr>
-                <w:sz w:val="21"/>
-                <w:szCs w:val="21"/>
-              </w:rPr>
-              <w:t xml:space="preserve"> </w:t>
-            </w:r>
-            <w:r>
-              <w:rPr>
-                <w:sz w:val="21"/>
-                <w:szCs w:val="21"/>
-              </w:rPr>
-              <w:t xml:space="preserve">the project supplies the ramp, hold-duration and notice numbers the Authority's hearing [19] needs to define a curtailment product for AI load on an isolated grid.</w:t>
+              <w:t xml:space="preserve">Demand management: a cap takes effect in about 0.2 s on one card, and the demonstration targets a 60-second ramp for a whole facility. The project supplies the ramp, hold-time and notice numbers that the Authority's hearing [19] needs to define a curtailment product for AI load.</w:t>
             </w:r>
           </w:p>
         </w:tc>
@@ -3363,7 +2999,7 @@
         <w:t xml:space="preserve"> </w:t>
       </w:r>
       <w:r>
-        <w:t xml:space="preserve">[1] and its ELF dataset: about 5,500 instrumented measurements over 20 models and four GPUs (A100, A10G, L4 swept finely, T4 coarsely). Headline numbers:</w:t>
+        <w:t xml:space="preserve">[1] and its ELF dataset: about 5,500 instrumented measurements over 20 models and four GPUs (A100, A10G, L4 swept finely, T4 coarsely). Headline numbers: at the JP (43 to 46 percent of TDP), energy per task drops</w:t>
       </w:r>
       <w:r>
         <w:t xml:space="preserve"> </w:t>
@@ -3379,7 +3015,7 @@
         <w:t xml:space="preserve"> </w:t>
       </w:r>
       <w:r>
-        <w:t xml:space="preserve">less energy per task at the JP (43 to 46 percent of TDP, runs 1.2 times longer);</w:t>
+        <w:t xml:space="preserve">while jobs run 1.2 times longer. In a fleet simulation on the measured curves, energy per served job drops</w:t>
       </w:r>
       <w:r>
         <w:t xml:space="preserve"> </w:t>
@@ -3392,10 +3028,7 @@
         <w:t xml:space="preserve">18 to 45 percent</w:t>
       </w:r>
       <w:r>
-        <w:t xml:space="preserve"> </w:t>
-      </w:r>
-      <w:r>
-        <w:t xml:space="preserve">less energy per served job in a measured-curve fleet simulation at equal-or-better deadline compliance; cap actuation settling in</w:t>
+        <w:t xml:space="preserve">, with deadlines met as well or better. A cap takes effect in</w:t>
       </w:r>
       <w:r>
         <w:t xml:space="preserve"> </w:t>
@@ -3411,7 +3044,7 @@
         <w:t xml:space="preserve"> </w:t>
       </w:r>
       <w:r>
-        <w:t xml:space="preserve">(191 ms measured). Supporting: law fit median R² = 0.99 per fixed-setting sweep (pooled per-card fits 0.88 to 0.92, Fig. A1); one static cap per card serves all twenty workloads at under one percent mean penalty; under strict deadlines capping saved 28 percent of energy while keeping 95 percent of workload value; under per-instance-hour billing the renter's cost optimum is the energy-worst operating point. The measurement software, the P(θ) fitting pipeline, the exact per-card capping solver and the fleet simulator behind these numbers are the PI's working code, and ELF is openly released, so every figure here is independently reproducible; WP1–WP3 extend this foundation.</w:t>
+        <w:t xml:space="preserve">(191 ms measured). Supporting: the law fits with median R² = 0.99 per fixed-setting sweep (pooled per-card fits 0.88 to 0.92, Fig. A1). One fixed cap per card serves all twenty workloads, losing under one percent on average. Under strict deadlines, capping still saved 28 percent of energy while keeping 95 percent of the work's value. Under per-hour billing, the renter's cheapest choice is the most wasteful one. ELF and the code behind these numbers are openly released, so every figure is reproducible. WP1–WP3 extend them.</w:t>
       </w:r>
     </w:p>
     <w:bookmarkEnd w:id="36"/>
@@ -3458,7 +3091,59 @@
         <w:jc w:val="both"/>
       </w:pPr>
       <w:r>
-        <w:t xml:space="preserve">The project delivers five open artifacts: the ELF-2 dataset, the operating-point models with their one-test protocol, the control engine, the simulator built from the measurements, and the grid interfaces and policy report (Appendix Table A1: what each is, who uses it). They carry C1 (models, engine, simulator), C2 (policy report), C3 (simulator-based fleet planning) and C4 (queue scenario analysis by transmission region); all are released openly on delivery, crediting the Ministry's R&amp;D program under call 34/2026 [18].</w:t>
+        <w:t xml:space="preserve">The project delivers JouleFlex, the toolkit of 2.5.4.1, as concrete pieces others can use. For</w:t>
+      </w:r>
+      <w:r>
+        <w:t xml:space="preserve"> </w:t>
+      </w:r>
+      <w:r>
+        <w:rPr>
+          <w:b/>
+          <w:bCs/>
+        </w:rPr>
+        <w:t xml:space="preserve">control (C1)</w:t>
+      </w:r>
+      <w:r>
+        <w:t xml:space="preserve">: the control engine, with the ELF-2 dataset and the cap-prediction models it runs on. For</w:t>
+      </w:r>
+      <w:r>
+        <w:t xml:space="preserve"> </w:t>
+      </w:r>
+      <w:r>
+        <w:rPr>
+          <w:b/>
+          <w:bCs/>
+        </w:rPr>
+        <w:t xml:space="preserve">pricing (C2)</w:t>
+      </w:r>
+      <w:r>
+        <w:t xml:space="preserve">: pricing rules and the incentive model behind them. For</w:t>
+      </w:r>
+      <w:r>
+        <w:t xml:space="preserve"> </w:t>
+      </w:r>
+      <w:r>
+        <w:rPr>
+          <w:b/>
+          <w:bCs/>
+        </w:rPr>
+        <w:t xml:space="preserve">planning (C3)</w:t>
+      </w:r>
+      <w:r>
+        <w:t xml:space="preserve">: a fleet-design tool, built on the simulator, that weighs each GPU option's cost against its expected revenue for a given workload and power limit. For</w:t>
+      </w:r>
+      <w:r>
+        <w:t xml:space="preserve"> </w:t>
+      </w:r>
+      <w:r>
+        <w:rPr>
+          <w:b/>
+          <w:bCs/>
+        </w:rPr>
+        <w:t xml:space="preserve">allocation (C4)</w:t>
+      </w:r>
+      <w:r>
+        <w:t xml:space="preserve">: connection scenarios by region. The pricing and allocation results also appear in a policy report. Appendix Table A1 lists each piece and who uses it. Everything is released openly on delivery, crediting the Ministry's R&amp;D program under call 34/2026 [18].</w:t>
       </w:r>
     </w:p>
     <w:bookmarkEnd w:id="38"/>
@@ -3489,23 +3174,13 @@
           <w:b/>
           <w:bCs/>
         </w:rPr>
-        <w:t xml:space="preserve">For the Israeli grid and regulator (the primary benefit).</w:t>
-      </w:r>
-      <w:r>
-        <w:t xml:space="preserve"> </w:t>
-      </w:r>
-      <w:r>
-        <w:t xml:space="preserve">The freeze [2] affects four parties. The Ministry owns the policy and the freeze decision, with no measured basis for how much AI load can flex. The Electricity Authority (רשות החשמל), which licenses connections, must either grant connections the grid cannot back at specific substations, or keep the queue closed and block growth. Noga, the system operator, must hold the grid stable against a large, new and unmeasured load. The operators in the queue cannot build. None has the numbers to license AI load on condition of flexibility: how much it can shed, how fast, for how long, at what notice and cost. JouleFlex produces exactly those numbers.</w:t>
-      </w:r>
-    </w:p>
-    <w:p>
-      <w:pPr>
-        <w:widowControl w:val="0"/>
-        <w:pStyle w:val="BodyText"/>
-        <w:jc w:val="both"/>
-      </w:pPr>
-      <w:r>
-        <w:t xml:space="preserve">The third option rests on one fact: more work per joule is more work per connected megawatt, if the operator fills the same connection with more cards. A fixed-connection calculation on the measured A100 curve implies up to about 50 percent more AI work per megawatt at the GPU [1], to be confirmed at server input and facility level before any coefficient is recommended; the 27,000 MW queue includes speculative and duplicated applications, so any coefficient applies to approved capacity. WP5 puts a shekel-per-megawatt value on the flexible-connection option from public data, feeding the Authority's open hearing [19] while the rules are written. Connection constraints are locational, per substation and transmission region, so C4 is a scenario analysis by region of how much of the queue could be served under firm-plus-flexible connections at each flexibility level; with flexibility measured, committed and audited (WP4), the closed queue stops being all-or-nothing.</w:t>
+        <w:t xml:space="preserve">Scientific contribution.</w:t>
+      </w:r>
+      <w:r>
+        <w:t xml:space="preserve"> </w:t>
+      </w:r>
+      <w:r>
+        <w:t xml:space="preserve">The project turns a measured property of GPUs, the Joule Point, into a quantitative basis for treating AI computing as a flexible electrical load. It establishes how far the optimum holds across hardware, software and whole servers, and how much of a facility's power can be reduced, how quickly and for how long, while useful work is preserved. Today AI load is treated as fixed. These measurements, released as the open ELF-2 dataset, give the first evidence on how flexible it can be.</w:t>
       </w:r>
     </w:p>
     <w:p>
@@ -3519,39 +3194,13 @@
           <w:b/>
           <w:bCs/>
         </w:rPr>
-        <w:t xml:space="preserve">What the Authority could write into the 50 MVA connection track [19].</w:t>
-      </w:r>
-      <w:r>
-        <w:t xml:space="preserve"> </w:t>
-      </w:r>
-      <w:r>
-        <w:rPr>
-          <w:i/>
-          <w:iCs/>
-        </w:rPr>
-        <w:t xml:space="preserve">Connection coefficient.</w:t>
-      </w:r>
-      <w:r>
-        <w:t xml:space="preserve"> </w:t>
-      </w:r>
-      <w:r>
-        <w:t xml:space="preserve">A facility committing to Joule-Point operation is licensed at k times the nameplate of its installed hardware, where k is its measured power at the Joule Point as a fraction of nameplate; WP1 measures k at server input and carries it to the facility meter with cooling and building losses (PUE), and the WP4 delivery record verifies it in operation. Worked example: a 100 MW applicant that commits to JP operation keeps a 100 MW connection and installs 100/k MW of nameplate; at the board value k = 0.45 [1] that is about 220 MW of hardware, delivering on the measured A100 curve up to about 50 percent more AI work than 100 MW uncapped. The facility k is higher, since host and cooling power do not fall with the cap.</w:t>
-      </w:r>
-      <w:r>
-        <w:t xml:space="preserve"> </w:t>
-      </w:r>
-      <w:r>
-        <w:rPr>
-          <w:i/>
-          <w:iCs/>
-        </w:rPr>
-        <w:t xml:space="preserve">Curtailment product in the system operator's direction.</w:t>
-      </w:r>
-      <w:r>
-        <w:t xml:space="preserve"> </w:t>
-      </w:r>
-      <w:r>
-        <w:t xml:space="preserve">A facility drops from its uncapped operating draw to the Joule Point on Noga's instruction, giving up roughly 40 percent of its operating power for about 20 percent of its speed, specified by MW shed against the measured uncapped draw (the MS0 memo fixes the exact per-card fraction), ramp (seconds), hold duration (hours, through the evening peak), notice time, maximum events per season, recovery, work lost and cost; the JP-and-below shed is a smaller second tier, each quantity measured by WP4 at the connection point and audited by the delivery record.</w:t>
+        <w:t xml:space="preserve">Impact on the grid.</w:t>
+      </w:r>
+      <w:r>
+        <w:t xml:space="preserve"> </w:t>
+      </w:r>
+      <w:r>
+        <w:t xml:space="preserve">The recent freeze on data-center connections [2] shows that grid connection is becoming a constraint on AI computing in Israel. Near its Joule Point a GPU does nearly the same work at much lower power, so the same connection can host more computing: up to about 50 percent more work per megawatt at the GPU, with the facility-level figure measured in WP1 and WP4. The same reduction can be applied on request at peak times. This is the kind of evidence that flexible-connection rules under discussion [19] depend on. Those rules envisage reduced supply for 100 to 200 hours a year, down to 60 percent of a connection, and a GPU at its Joule Point already draws about 40 percent less than its normal uncapped power. Regional scenario analysis (C4) then estimates how much of the connection queue such connections could serve. All savings and reductions quoted are relative to a GPU's normal uncapped draw.</w:t>
       </w:r>
     </w:p>
     <w:p>
@@ -3565,13 +3214,13 @@
           <w:b/>
           <w:bCs/>
         </w:rPr>
-        <w:t xml:space="preserve">Training and human capital.</w:t>
-      </w:r>
-      <w:r>
-        <w:t xml:space="preserve"> </w:t>
-      </w:r>
-      <w:r>
-        <w:t xml:space="preserve">The project builds research capacity at the AI-energy interface, which Israel lacks: a postdoctoral researcher trained across GPU energy measurement, ML-systems control and energy-market analysis; the open ELF-2 dataset, simulator and control engine as teaching material at HIT; and the Hebrew M4, M8 and M21 briefings to Ministry, Authority, Noga and operators.</w:t>
+        <w:t xml:space="preserve">Impact on data centers.</w:t>
+      </w:r>
+      <w:r>
+        <w:t xml:space="preserve"> </w:t>
+      </w:r>
+      <w:r>
+        <w:t xml:space="preserve">Operators gain lower energy per unit of work on existing hardware, through software alone: 29 to 31 percent per task, and 18 to 45 percent per served job in simulation (C1). Fleet-design methods (C3) show, before capital is committed, which GPUs give the best return under a power limit. Pricing models (C2) show how customers can be rewarded for efficient use of flexible power.</w:t>
       </w:r>
     </w:p>
     <w:p>
@@ -3585,13 +3234,13 @@
           <w:b/>
           <w:bCs/>
         </w:rPr>
-        <w:t xml:space="preserve">For operators and planners.</w:t>
-      </w:r>
-      <w:r>
-        <w:t xml:space="preserve"> </w:t>
-      </w:r>
-      <w:r>
-        <w:t xml:space="preserve">Operators (C1): one software command delivers 29 to 31 percent lower energy per task (measured) and 18 to 45 percent lower energy per served job (fleet simulation) on installed hardware; C2 pricing in place of per-hour billing lets a customer who accepts JP operation or curtailment windows pay less per unit of work. Planners (C3): the simulator shows, before capital is committed, which fleet delivers the most work behind a variable connection.</w:t>
+        <w:t xml:space="preserve">Training and human capital.</w:t>
+      </w:r>
+      <w:r>
+        <w:t xml:space="preserve"> </w:t>
+      </w:r>
+      <w:r>
+        <w:t xml:space="preserve">The project and its open data will support multiple student projects at HIT, in computer science and other departments. These projects teach students how computing and energy are linked, preparing them for careers in AI, data centers and the energy sector.</w:t>
       </w:r>
     </w:p>
     <w:bookmarkEnd w:id="39"/>
@@ -3762,92 +3411,43 @@
                 <w:sz w:val="21"/>
                 <w:szCs w:val="21"/>
               </w:rPr>
-              <w:t xml:space="preserve">WP1:</w:t>
-            </w:r>
-            <w:r>
-              <w:rPr>
-                <w:sz w:val="21"/>
-                <w:szCs w:val="21"/>
-              </w:rPr>
-              <w:t xml:space="preserve"> </w:t>
-            </w:r>
-            <w:r>
-              <w:rPr>
-                <w:sz w:val="21"/>
-                <w:szCs w:val="21"/>
-              </w:rPr>
-              <w:t xml:space="preserve">existing measurement software extended;</w:t>
-            </w:r>
-            <w:r>
-              <w:rPr>
-                <w:sz w:val="21"/>
-                <w:szCs w:val="21"/>
-              </w:rPr>
-              <w:t xml:space="preserve"> </w:t>
-            </w:r>
-            <w:r>
-              <w:rPr>
-                <w:sz w:val="21"/>
-                <w:szCs w:val="21"/>
-              </w:rPr>
-              <w:t xml:space="preserve">H100/L40S and vLLM sweeps</w:t>
-            </w:r>
-            <w:r>
-              <w:rPr>
-                <w:sz w:val="21"/>
-                <w:szCs w:val="21"/>
-              </w:rPr>
-              <w:t xml:space="preserve">; board and server-input instrumentation</w:t>
-            </w:r>
-          </w:p>
-        </w:tc>
-        <w:tc>
-          <w:tcPr/>
-          <w:p>
-            <w:pPr>
-              <w:spacing w:line="317" w:lineRule="auto" w:before="20" w:after="20"/>
-              <w:widowControl w:val="0"/>
-              <w:pStyle w:val="Compact"/>
-              <w:jc w:val="both"/>
-            </w:pPr>
-            <w:r>
-              <w:rPr>
-                <w:sz w:val="21"/>
-                <w:szCs w:val="21"/>
-              </w:rPr>
-              <w:t xml:space="preserve">D1: ELF-2 v1</w:t>
-            </w:r>
-          </w:p>
-        </w:tc>
-        <w:tc>
-          <w:tcPr/>
-          <w:p>
-            <w:pPr>
-              <w:spacing w:line="317" w:lineRule="auto" w:before="20" w:after="20"/>
-              <w:widowControl w:val="0"/>
-              <w:pStyle w:val="Compact"/>
-              <w:jc w:val="both"/>
-            </w:pPr>
-            <w:r>
-              <w:rPr>
-                <w:sz w:val="21"/>
-                <w:szCs w:val="21"/>
-              </w:rPr>
-              <w:t xml:space="preserve">Law fit R² ≥ 0.95 per sweep (median 0.99 [1]);</w:t>
-            </w:r>
-            <w:r>
-              <w:rPr>
-                <w:sz w:val="21"/>
-                <w:szCs w:val="21"/>
-              </w:rPr>
-              <w:t xml:space="preserve"> </w:t>
-            </w:r>
-            <w:r>
-              <w:rPr>
-                <w:sz w:val="21"/>
-                <w:szCs w:val="21"/>
-              </w:rPr>
-              <w:t xml:space="preserve">JP located, or its absence documented as a bounding result, per platform at board and server-input power</w:t>
+              <w:t xml:space="preserve">WP1: extend the existing measurement software. Run H100/L40S and vLLM sweeps. Instrument board and server-input power.</w:t>
+            </w:r>
+          </w:p>
+        </w:tc>
+        <w:tc>
+          <w:tcPr/>
+          <w:p>
+            <w:pPr>
+              <w:spacing w:line="317" w:lineRule="auto" w:before="20" w:after="20"/>
+              <w:widowControl w:val="0"/>
+              <w:pStyle w:val="Compact"/>
+              <w:jc w:val="both"/>
+            </w:pPr>
+            <w:r>
+              <w:rPr>
+                <w:sz w:val="21"/>
+                <w:szCs w:val="21"/>
+              </w:rPr>
+              <w:t xml:space="preserve">D1: ELF-2 v1 and the M4 regulator memo</w:t>
+            </w:r>
+          </w:p>
+        </w:tc>
+        <w:tc>
+          <w:tcPr/>
+          <w:p>
+            <w:pPr>
+              <w:spacing w:line="317" w:lineRule="auto" w:before="20" w:after="20"/>
+              <w:widowControl w:val="0"/>
+              <w:pStyle w:val="Compact"/>
+              <w:jc w:val="both"/>
+            </w:pPr>
+            <w:r>
+              <w:rPr>
+                <w:sz w:val="21"/>
+                <w:szCs w:val="21"/>
+              </w:rPr>
+              <w:t xml:space="preserve">Law fit R² ≥ 0.95 per sweep (median 0.99 [1]). JP located per platform at board and server-input power, or its absence documented as a bounding result. M4 memo: the measured power reduction at the Joule Point, from the existing ELF curves (board level).</w:t>
             </w:r>
           </w:p>
         </w:tc>
@@ -3868,61 +3468,61 @@
                 <w:sz w:val="21"/>
                 <w:szCs w:val="21"/>
               </w:rPr>
-              <w:t xml:space="preserve">M3–M4</w:t>
-            </w:r>
-          </w:p>
-        </w:tc>
-        <w:tc>
-          <w:tcPr/>
-          <w:p>
-            <w:pPr>
-              <w:spacing w:line="317" w:lineRule="auto" w:before="20" w:after="20"/>
-              <w:widowControl w:val="0"/>
-              <w:pStyle w:val="Compact"/>
-              <w:jc w:val="both"/>
-            </w:pPr>
-            <w:r>
-              <w:rPr>
-                <w:sz w:val="21"/>
-                <w:szCs w:val="21"/>
-              </w:rPr>
-              <w:t xml:space="preserve">Preliminary regulator memo from the existing ELF data</w:t>
-            </w:r>
-          </w:p>
-        </w:tc>
-        <w:tc>
-          <w:tcPr/>
-          <w:p>
-            <w:pPr>
-              <w:spacing w:line="317" w:lineRule="auto" w:before="20" w:after="20"/>
-              <w:widowControl w:val="0"/>
-              <w:pStyle w:val="Compact"/>
-              <w:jc w:val="both"/>
-            </w:pPr>
-            <w:r>
-              <w:rPr>
-                <w:sz w:val="21"/>
-                <w:szCs w:val="21"/>
-              </w:rPr>
-              <w:t xml:space="preserve">MS0 (M4): memo (Hebrew)</w:t>
-            </w:r>
-          </w:p>
-        </w:tc>
-        <w:tc>
-          <w:tcPr/>
-          <w:p>
-            <w:pPr>
-              <w:spacing w:line="317" w:lineRule="auto" w:before="20" w:after="20"/>
-              <w:widowControl w:val="0"/>
-              <w:pStyle w:val="Compact"/>
-              <w:jc w:val="both"/>
-            </w:pPr>
-            <w:r>
-              <w:rPr>
-                <w:sz w:val="21"/>
-                <w:szCs w:val="21"/>
-              </w:rPr>
-              <w:t xml:space="preserve">Connection coefficient k and the full-power-to-JP shed fraction on the measured A100, A10G and L4 curves, board-level caveat stated, in the Authority's hands during the hearing [19] rule-writing window</w:t>
+              <w:t xml:space="preserve">M5–M8</w:t>
+            </w:r>
+          </w:p>
+        </w:tc>
+        <w:tc>
+          <w:tcPr/>
+          <w:p>
+            <w:pPr>
+              <w:spacing w:line="317" w:lineRule="auto" w:before="20" w:after="20"/>
+              <w:widowControl w:val="0"/>
+              <w:pStyle w:val="Compact"/>
+              <w:jc w:val="both"/>
+            </w:pPr>
+            <w:r>
+              <w:rPr>
+                <w:sz w:val="21"/>
+                <w:szCs w:val="21"/>
+              </w:rPr>
+              <w:t xml:space="preserve">WP1: shared GPUs, LLM phases, fine-tuning. Sweeps where the constant should break.</w:t>
+            </w:r>
+          </w:p>
+        </w:tc>
+        <w:tc>
+          <w:tcPr/>
+          <w:p>
+            <w:pPr>
+              <w:spacing w:line="317" w:lineRule="auto" w:before="20" w:after="20"/>
+              <w:widowControl w:val="0"/>
+              <w:pStyle w:val="Compact"/>
+              <w:jc w:val="both"/>
+            </w:pPr>
+            <w:r>
+              <w:rPr>
+                <w:sz w:val="21"/>
+                <w:szCs w:val="21"/>
+              </w:rPr>
+              <w:t xml:space="preserve">MS1: validity map (where the law holds) and M8 brief (Hebrew)</w:t>
+            </w:r>
+          </w:p>
+        </w:tc>
+        <w:tc>
+          <w:tcPr/>
+          <w:p>
+            <w:pPr>
+              <w:spacing w:line="317" w:lineRule="auto" w:before="20" w:after="20"/>
+              <w:widowControl w:val="0"/>
+              <w:pStyle w:val="Compact"/>
+              <w:jc w:val="both"/>
+            </w:pPr>
+            <w:r>
+              <w:rPr>
+                <w:sz w:val="21"/>
+                <w:szCs w:val="21"/>
+              </w:rPr>
+              <w:t xml:space="preserve">Server-input (BMC) wall tier validated. Validity domain documented, including the JP shift (in percentage points of TDP) at which the per-card constant breaks, set in advance.</w:t>
             </w:r>
           </w:p>
         </w:tc>
@@ -3943,61 +3543,61 @@
                 <w:sz w:val="21"/>
                 <w:szCs w:val="21"/>
               </w:rPr>
-              <w:t xml:space="preserve">M5–M8</w:t>
-            </w:r>
-          </w:p>
-        </w:tc>
-        <w:tc>
-          <w:tcPr/>
-          <w:p>
-            <w:pPr>
-              <w:spacing w:line="317" w:lineRule="auto" w:before="20" w:after="20"/>
-              <w:widowControl w:val="0"/>
-              <w:pStyle w:val="Compact"/>
-              <w:jc w:val="both"/>
-            </w:pPr>
-            <w:r>
-              <w:rPr>
-                <w:sz w:val="21"/>
-                <w:szCs w:val="21"/>
-              </w:rPr>
-              <w:t xml:space="preserve">WP1: shared GPUs, LLM phases, fine-tuning; sweeps where the constant should break</w:t>
-            </w:r>
-          </w:p>
-        </w:tc>
-        <w:tc>
-          <w:tcPr/>
-          <w:p>
-            <w:pPr>
-              <w:spacing w:line="317" w:lineRule="auto" w:before="20" w:after="20"/>
-              <w:widowControl w:val="0"/>
-              <w:pStyle w:val="Compact"/>
-              <w:jc w:val="both"/>
-            </w:pPr>
-            <w:r>
-              <w:rPr>
-                <w:sz w:val="21"/>
-                <w:szCs w:val="21"/>
-              </w:rPr>
-              <w:t xml:space="preserve">MS1: regime map; M8 brief (Hebrew)</w:t>
-            </w:r>
-          </w:p>
-        </w:tc>
-        <w:tc>
-          <w:tcPr/>
-          <w:p>
-            <w:pPr>
-              <w:spacing w:line="317" w:lineRule="auto" w:before="20" w:after="20"/>
-              <w:widowControl w:val="0"/>
-              <w:pStyle w:val="Compact"/>
-              <w:jc w:val="both"/>
-            </w:pPr>
-            <w:r>
-              <w:rPr>
-                <w:sz w:val="21"/>
-                <w:szCs w:val="21"/>
-              </w:rPr>
-              <w:t xml:space="preserve">Server-input (BMC) wall tier validated; validity domain documented, including the pre-registered JP shift (percentage points of TDP) at which the per-card constant breaks</w:t>
+              <w:t xml:space="preserve">M7–M12</w:t>
+            </w:r>
+          </w:p>
+        </w:tc>
+        <w:tc>
+          <w:tcPr/>
+          <w:p>
+            <w:pPr>
+              <w:spacing w:line="317" w:lineRule="auto" w:before="20" w:after="20"/>
+              <w:widowControl w:val="0"/>
+              <w:pStyle w:val="Compact"/>
+              <w:jc w:val="both"/>
+            </w:pPr>
+            <w:r>
+              <w:rPr>
+                <w:sz w:val="21"/>
+                <w:szCs w:val="21"/>
+              </w:rPr>
+              <w:t xml:space="preserve">WP2: job model, transfer model, and one-test characterization protocol</w:t>
+            </w:r>
+          </w:p>
+        </w:tc>
+        <w:tc>
+          <w:tcPr/>
+          <w:p>
+            <w:pPr>
+              <w:spacing w:line="317" w:lineRule="auto" w:before="20" w:after="20"/>
+              <w:widowControl w:val="0"/>
+              <w:pStyle w:val="Compact"/>
+              <w:jc w:val="both"/>
+            </w:pPr>
+            <w:r>
+              <w:rPr>
+                <w:sz w:val="21"/>
+                <w:szCs w:val="21"/>
+              </w:rPr>
+              <w:t xml:space="preserve">MS2: models result</w:t>
+            </w:r>
+          </w:p>
+        </w:tc>
+        <w:tc>
+          <w:tcPr/>
+          <w:p>
+            <w:pPr>
+              <w:spacing w:line="317" w:lineRule="auto" w:before="20" w:after="20"/>
+              <w:widowControl w:val="0"/>
+              <w:pStyle w:val="Compact"/>
+              <w:jc w:val="both"/>
+            </w:pPr>
+            <w:r>
+              <w:rPr>
+                <w:sz w:val="21"/>
+                <w:szCs w:val="21"/>
+              </w:rPr>
+              <w:t xml:space="preserve">The job model places the cap within 5 percentage points of TDP where the constant breaks. The scaling rule places it within 5 points, validated by predicting each measured card from the others. Protocol cost ≤ 8 hours and ≤ ₪1,500 per card model.</w:t>
             </w:r>
           </w:p>
         </w:tc>
@@ -4018,82 +3618,61 @@
                 <w:sz w:val="21"/>
                 <w:szCs w:val="21"/>
               </w:rPr>
-              <w:t xml:space="preserve">M7–M12</w:t>
-            </w:r>
-          </w:p>
-        </w:tc>
-        <w:tc>
-          <w:tcPr/>
-          <w:p>
-            <w:pPr>
-              <w:spacing w:line="317" w:lineRule="auto" w:before="20" w:after="20"/>
-              <w:widowControl w:val="0"/>
-              <w:pStyle w:val="Compact"/>
-              <w:jc w:val="both"/>
-            </w:pPr>
-            <w:r>
-              <w:rPr>
-                <w:sz w:val="21"/>
-                <w:szCs w:val="21"/>
-              </w:rPr>
-              <w:t xml:space="preserve">WP2: job model; transfer model; one-test characterization protocol</w:t>
-            </w:r>
-          </w:p>
-        </w:tc>
-        <w:tc>
-          <w:tcPr/>
-          <w:p>
-            <w:pPr>
-              <w:spacing w:line="317" w:lineRule="auto" w:before="20" w:after="20"/>
-              <w:widowControl w:val="0"/>
-              <w:pStyle w:val="Compact"/>
-              <w:jc w:val="both"/>
-            </w:pPr>
-            <w:r>
-              <w:rPr>
-                <w:sz w:val="21"/>
-                <w:szCs w:val="21"/>
-              </w:rPr>
-              <w:t xml:space="preserve">MS2: models result</w:t>
-            </w:r>
-          </w:p>
-        </w:tc>
-        <w:tc>
-          <w:tcPr/>
-          <w:p>
-            <w:pPr>
-              <w:spacing w:line="317" w:lineRule="auto" w:before="20" w:after="20"/>
-              <w:widowControl w:val="0"/>
-              <w:pStyle w:val="Compact"/>
-              <w:jc w:val="both"/>
-            </w:pPr>
-            <w:r>
-              <w:rPr>
-                <w:sz w:val="21"/>
-                <w:szCs w:val="21"/>
-              </w:rPr>
-              <w:t xml:space="preserve">Job-model placement within 5 percentage points of TDP where the constant breaks,</w:t>
-            </w:r>
-            <w:r>
-              <w:rPr>
-                <w:sz w:val="21"/>
-                <w:szCs w:val="21"/>
-              </w:rPr>
-              <w:t xml:space="preserve"> </w:t>
-            </w:r>
-            <w:r>
-              <w:rPr>
-                <w:sz w:val="21"/>
-                <w:szCs w:val="21"/>
-              </w:rPr>
-              <w:t xml:space="preserve">scaling-rule placement within 5 points, validated leave-one-out across the measured cards</w:t>
-            </w:r>
-            <w:r>
-              <w:rPr>
-                <w:sz w:val="21"/>
-                <w:szCs w:val="21"/>
-              </w:rPr>
-              <w:t xml:space="preserve">; protocol cost ≤ 8 hours and ≤ ₪1,500 per card model</w:t>
+              <w:t xml:space="preserve">M9–M16</w:t>
+            </w:r>
+          </w:p>
+        </w:tc>
+        <w:tc>
+          <w:tcPr/>
+          <w:p>
+            <w:pPr>
+              <w:spacing w:line="317" w:lineRule="auto" w:before="20" w:after="20"/>
+              <w:widowControl w:val="0"/>
+              <w:pStyle w:val="Compact"/>
+              <w:jc w:val="both"/>
+            </w:pPr>
+            <w:r>
+              <w:rPr>
+                <w:sz w:val="21"/>
+                <w:szCs w:val="21"/>
+              </w:rPr>
+              <w:t xml:space="preserve">WP3: twin, and joint controller under fixed, price, carbon and curtailment power limits</w:t>
+            </w:r>
+          </w:p>
+        </w:tc>
+        <w:tc>
+          <w:tcPr/>
+          <w:p>
+            <w:pPr>
+              <w:spacing w:line="317" w:lineRule="auto" w:before="20" w:after="20"/>
+              <w:widowControl w:val="0"/>
+              <w:pStyle w:val="Compact"/>
+              <w:jc w:val="both"/>
+            </w:pPr>
+            <w:r>
+              <w:rPr>
+                <w:sz w:val="21"/>
+                <w:szCs w:val="21"/>
+              </w:rPr>
+              <w:t xml:space="preserve">MS3: controller result</w:t>
+            </w:r>
+          </w:p>
+        </w:tc>
+        <w:tc>
+          <w:tcPr/>
+          <w:p>
+            <w:pPr>
+              <w:spacing w:line="317" w:lineRule="auto" w:before="20" w:after="20"/>
+              <w:widowControl w:val="0"/>
+              <w:pStyle w:val="Compact"/>
+              <w:jc w:val="both"/>
+            </w:pPr>
+            <w:r>
+              <w:rPr>
+                <w:sz w:val="21"/>
+                <w:szCs w:val="21"/>
+              </w:rPr>
+              <w:t xml:space="preserve">Energy per served job and on-time rate versus uncapped, single-cap and cap-only baselines. Target set in advance: at least 10 percent below cap-only at the same on-time rate (a gain over an already-capped fleet). No power overruns beyond WP1's meter noise in committed periods, and short violations in under 1 percent of intervals.</w:t>
             </w:r>
           </w:p>
         </w:tc>
@@ -4114,96 +3693,61 @@
                 <w:sz w:val="21"/>
                 <w:szCs w:val="21"/>
               </w:rPr>
-              <w:t xml:space="preserve">M9–M16</w:t>
-            </w:r>
-          </w:p>
-        </w:tc>
-        <w:tc>
-          <w:tcPr/>
-          <w:p>
-            <w:pPr>
-              <w:spacing w:line="317" w:lineRule="auto" w:before="20" w:after="20"/>
-              <w:widowControl w:val="0"/>
-              <w:pStyle w:val="Compact"/>
-              <w:jc w:val="both"/>
-            </w:pPr>
-            <w:r>
-              <w:rPr>
-                <w:sz w:val="21"/>
-                <w:szCs w:val="21"/>
-              </w:rPr>
-              <w:t xml:space="preserve">WP3: twin; joint controller under fixed, price, carbon and curtailment envelopes</w:t>
-            </w:r>
-          </w:p>
-        </w:tc>
-        <w:tc>
-          <w:tcPr/>
-          <w:p>
-            <w:pPr>
-              <w:spacing w:line="317" w:lineRule="auto" w:before="20" w:after="20"/>
-              <w:widowControl w:val="0"/>
-              <w:pStyle w:val="Compact"/>
-              <w:jc w:val="both"/>
-            </w:pPr>
-            <w:r>
-              <w:rPr>
-                <w:sz w:val="21"/>
-                <w:szCs w:val="21"/>
-              </w:rPr>
-              <w:t xml:space="preserve">MS3: controller result</w:t>
-            </w:r>
-          </w:p>
-        </w:tc>
-        <w:tc>
-          <w:tcPr/>
-          <w:p>
-            <w:pPr>
-              <w:spacing w:line="317" w:lineRule="auto" w:before="20" w:after="20"/>
-              <w:widowControl w:val="0"/>
-              <w:pStyle w:val="Compact"/>
-              <w:jc w:val="both"/>
-            </w:pPr>
-            <w:r>
-              <w:rPr>
-                <w:sz w:val="21"/>
-                <w:szCs w:val="21"/>
-              </w:rPr>
-              <w:t xml:space="preserve">Energy per served job and SLO compliance versus uncapped, static-cap and cap-only baselines, with a pre-registered floor of at least 10 percent below cap-only at equal compliance</w:t>
-            </w:r>
-            <w:r>
-              <w:rPr>
-                <w:sz w:val="21"/>
-                <w:szCs w:val="21"/>
-              </w:rPr>
-              <w:t xml:space="preserve"> </w:t>
-            </w:r>
-            <w:r>
-              <w:rPr>
-                <w:sz w:val="21"/>
-                <w:szCs w:val="21"/>
-              </w:rPr>
-              <w:t xml:space="preserve">(gain over an already-capped fleet)</w:t>
-            </w:r>
-            <w:r>
-              <w:rPr>
-                <w:sz w:val="21"/>
-                <w:szCs w:val="21"/>
-              </w:rPr>
-              <w:t xml:space="preserve">; zero exceedance beyond the WP1 noise band in committed windows,</w:t>
-            </w:r>
-            <w:r>
-              <w:rPr>
-                <w:sz w:val="21"/>
-                <w:szCs w:val="21"/>
-              </w:rPr>
-              <w:t xml:space="preserve"> </w:t>
-            </w:r>
-            <w:r>
-              <w:rPr>
-                <w:sz w:val="21"/>
-                <w:szCs w:val="21"/>
-              </w:rPr>
-              <w:t xml:space="preserve">transient violations under 1 percent of intervals</w:t>
+              <w:t xml:space="preserve">M14–M21</w:t>
+            </w:r>
+          </w:p>
+        </w:tc>
+        <w:tc>
+          <w:tcPr/>
+          <w:p>
+            <w:pPr>
+              <w:spacing w:line="317" w:lineRule="auto" w:before="20" w:after="20"/>
+              <w:widowControl w:val="0"/>
+              <w:pStyle w:val="Compact"/>
+              <w:jc w:val="both"/>
+            </w:pPr>
+            <w:r>
+              <w:rPr>
+                <w:sz w:val="21"/>
+                <w:szCs w:val="21"/>
+              </w:rPr>
+              <w:t xml:space="preserve">WP4–WP5: flexibility products, BMC-metered demonstration, incentive model, connection valuation on published Israeli data, and Israel scenario</w:t>
+            </w:r>
+          </w:p>
+        </w:tc>
+        <w:tc>
+          <w:tcPr/>
+          <w:p>
+            <w:pPr>
+              <w:spacing w:line="317" w:lineRule="auto" w:before="20" w:after="20"/>
+              <w:widowControl w:val="0"/>
+              <w:pStyle w:val="Compact"/>
+              <w:jc w:val="both"/>
+            </w:pPr>
+            <w:r>
+              <w:rPr>
+                <w:sz w:val="21"/>
+                <w:szCs w:val="21"/>
+              </w:rPr>
+              <w:t xml:space="preserve">MS4: flexibility demonstration and policy report</w:t>
+            </w:r>
+          </w:p>
+        </w:tc>
+        <w:tc>
+          <w:tcPr/>
+          <w:p>
+            <w:pPr>
+              <w:spacing w:line="317" w:lineRule="auto" w:before="20" w:after="20"/>
+              <w:widowControl w:val="0"/>
+              <w:pStyle w:val="Compact"/>
+              <w:jc w:val="both"/>
+            </w:pPr>
+            <w:r>
+              <w:rPr>
+                <w:sz w:val="21"/>
+                <w:szCs w:val="21"/>
+              </w:rPr>
+              <w:t xml:space="preserve">Sheddable power in MW of facility load at the connection point, and as a fraction of the measured uncapped draw. Full-power-to-JP tier: about 40 percent (exact fraction fixed by the M4 memo). JP-and-below tier: a floor set in advance of at least 15 percent of the committed JP power limit, reached within the ramp deadline at bounded SLO loss. Measured on a BMC-metered server and projected to fleet scale in the twin. Ramp within 60 seconds, hold time in hours through the evening peak, notice time, and recovery within 5 minutes, compatible with the curtailment right in the hearing [19]. Delivery-record compliance and service cost. C3 check: a twin-recommended fleet beats a same-cost uncapped design by a work margin stated in advance. Alignment condition per billing structure, confirmed in the twin. Option value per MW and break-even curtailment frequency, with sensitivity to every price input. C4 check: a scenario analysis on at least 3 transmission regions from public queue data, stating how much of each region's queue is served at each flexibility level.</w:t>
             </w:r>
           </w:p>
         </w:tc>
@@ -4224,205 +3768,6 @@
                 <w:sz w:val="21"/>
                 <w:szCs w:val="21"/>
               </w:rPr>
-              <w:t xml:space="preserve">M14–M20</w:t>
-            </w:r>
-          </w:p>
-        </w:tc>
-        <w:tc>
-          <w:tcPr/>
-          <w:p>
-            <w:pPr>
-              <w:spacing w:line="317" w:lineRule="auto" w:before="20" w:after="20"/>
-              <w:widowControl w:val="0"/>
-              <w:pStyle w:val="Compact"/>
-              <w:jc w:val="both"/>
-            </w:pPr>
-            <w:r>
-              <w:rPr>
-                <w:sz w:val="21"/>
-                <w:szCs w:val="21"/>
-              </w:rPr>
-              <w:t xml:space="preserve">WP4: flexibility products;</w:t>
-            </w:r>
-            <w:r>
-              <w:rPr>
-                <w:sz w:val="21"/>
-                <w:szCs w:val="21"/>
-              </w:rPr>
-              <w:t xml:space="preserve"> </w:t>
-            </w:r>
-            <w:r>
-              <w:rPr>
-                <w:sz w:val="21"/>
-                <w:szCs w:val="21"/>
-              </w:rPr>
-              <w:t xml:space="preserve">BMC-metered demonstration</w:t>
-            </w:r>
-            <w:r>
-              <w:rPr>
-                <w:sz w:val="21"/>
-                <w:szCs w:val="21"/>
-              </w:rPr>
-              <w:t xml:space="preserve">; Israel scenario</w:t>
-            </w:r>
-          </w:p>
-        </w:tc>
-        <w:tc>
-          <w:tcPr/>
-          <w:p>
-            <w:pPr>
-              <w:spacing w:line="317" w:lineRule="auto" w:before="20" w:after="20"/>
-              <w:widowControl w:val="0"/>
-              <w:pStyle w:val="Compact"/>
-              <w:jc w:val="both"/>
-            </w:pPr>
-            <w:r>
-              <w:rPr>
-                <w:sz w:val="21"/>
-                <w:szCs w:val="21"/>
-              </w:rPr>
-              <w:t xml:space="preserve">MS4: flexibility demonstration</w:t>
-            </w:r>
-          </w:p>
-        </w:tc>
-        <w:tc>
-          <w:tcPr/>
-          <w:p>
-            <w:pPr>
-              <w:spacing w:line="317" w:lineRule="auto" w:before="20" w:after="20"/>
-              <w:widowControl w:val="0"/>
-              <w:pStyle w:val="Compact"/>
-              <w:jc w:val="both"/>
-            </w:pPr>
-            <w:r>
-              <w:rPr>
-                <w:sz w:val="21"/>
-                <w:szCs w:val="21"/>
-              </w:rPr>
-              <w:t xml:space="preserve">Sheddable power in MW of facility load at the connection point and as a fraction of the measured uncapped draw: full-power-to-JP tier about 40 percent (exact fraction fixed by the MS0 memo); JP-and-below tier a pre-registered floor of at least 15 percent of the committed JP envelope within the ramp deadline at bounded SLO loss; measured on a BMC-metered server, projected to fleet scale in the twin; ramp within 60 seconds, hold duration in hours through the evening peak, notice time, recovery within 5 minutes, compatible with the curtailment right in the hearing [19]; delivery-record compliance and service cost;</w:t>
-            </w:r>
-            <w:r>
-              <w:rPr>
-                <w:sz w:val="21"/>
-                <w:szCs w:val="21"/>
-              </w:rPr>
-              <w:t xml:space="preserve"> </w:t>
-            </w:r>
-            <w:r>
-              <w:rPr>
-                <w:sz w:val="21"/>
-                <w:szCs w:val="21"/>
-              </w:rPr>
-              <w:t xml:space="preserve">C3 check: a twin-recommended fleet beats a same-cost uncapped design by a pre-stated work margin</w:t>
-            </w:r>
-          </w:p>
-        </w:tc>
-      </w:tr>
-      <w:tr>
-        <w:trPr/>
-        <w:tc>
-          <w:tcPr/>
-          <w:p>
-            <w:pPr>
-              <w:spacing w:line="317" w:lineRule="auto" w:before="20" w:after="20"/>
-              <w:widowControl w:val="0"/>
-              <w:pStyle w:val="Compact"/>
-              <w:jc w:val="both"/>
-            </w:pPr>
-            <w:r>
-              <w:rPr>
-                <w:sz w:val="21"/>
-                <w:szCs w:val="21"/>
-              </w:rPr>
-              <w:t xml:space="preserve">M17–M21</w:t>
-            </w:r>
-          </w:p>
-        </w:tc>
-        <w:tc>
-          <w:tcPr/>
-          <w:p>
-            <w:pPr>
-              <w:spacing w:line="317" w:lineRule="auto" w:before="20" w:after="20"/>
-              <w:widowControl w:val="0"/>
-              <w:pStyle w:val="Compact"/>
-              <w:jc w:val="both"/>
-            </w:pPr>
-            <w:r>
-              <w:rPr>
-                <w:sz w:val="21"/>
-                <w:szCs w:val="21"/>
-              </w:rPr>
-              <w:t xml:space="preserve">WP5: incentive model; connection valuation on published Israeli data; twin evaluation</w:t>
-            </w:r>
-          </w:p>
-        </w:tc>
-        <w:tc>
-          <w:tcPr/>
-          <w:p>
-            <w:pPr>
-              <w:spacing w:line="317" w:lineRule="auto" w:before="20" w:after="20"/>
-              <w:widowControl w:val="0"/>
-              <w:pStyle w:val="Compact"/>
-              <w:jc w:val="both"/>
-            </w:pPr>
-            <w:r>
-              <w:rPr>
-                <w:sz w:val="21"/>
-                <w:szCs w:val="21"/>
-              </w:rPr>
-              <w:t xml:space="preserve">MS5: policy report draft</w:t>
-            </w:r>
-          </w:p>
-        </w:tc>
-        <w:tc>
-          <w:tcPr/>
-          <w:p>
-            <w:pPr>
-              <w:spacing w:line="317" w:lineRule="auto" w:before="20" w:after="20"/>
-              <w:widowControl w:val="0"/>
-              <w:pStyle w:val="Compact"/>
-              <w:jc w:val="both"/>
-            </w:pPr>
-            <w:r>
-              <w:rPr>
-                <w:sz w:val="21"/>
-                <w:szCs w:val="21"/>
-              </w:rPr>
-              <w:t xml:space="preserve">Alignment condition per billing structure, confirmed in the twin; option value per MW and break-even curtailment frequency, with sensitivity to every price input;</w:t>
-            </w:r>
-            <w:r>
-              <w:rPr>
-                <w:sz w:val="21"/>
-                <w:szCs w:val="21"/>
-              </w:rPr>
-              <w:t xml:space="preserve"> </w:t>
-            </w:r>
-            <w:r>
-              <w:rPr>
-                <w:sz w:val="21"/>
-                <w:szCs w:val="21"/>
-              </w:rPr>
-              <w:t xml:space="preserve">C4 check: a scenario analysis on at least 3 transmission regions built from public queue data, stating how much of each region's queue is served under firm-plus-flexible connections at each flexibility level</w:t>
-            </w:r>
-          </w:p>
-        </w:tc>
-      </w:tr>
-      <w:tr>
-        <w:trPr/>
-        <w:tc>
-          <w:tcPr/>
-          <w:p>
-            <w:pPr>
-              <w:spacing w:line="317" w:lineRule="auto" w:before="20" w:after="20"/>
-              <w:widowControl w:val="0"/>
-              <w:pStyle w:val="Compact"/>
-              <w:jc w:val="both"/>
-            </w:pPr>
-            <w:r>
-              <w:rPr>
-                <w:sz w:val="21"/>
-                <w:szCs w:val="21"/>
-              </w:rPr>
               <w:t xml:space="preserve">M21–M24</w:t>
             </w:r>
           </w:p>
@@ -4459,25 +3804,25 @@
                 <w:sz w:val="21"/>
                 <w:szCs w:val="21"/>
               </w:rPr>
-              <w:t xml:space="preserve">D2: open release; D3: final report</w:t>
-            </w:r>
-          </w:p>
-        </w:tc>
-        <w:tc>
-          <w:tcPr/>
-          <w:p>
-            <w:pPr>
-              <w:spacing w:line="317" w:lineRule="auto" w:before="20" w:after="20"/>
-              <w:widowControl w:val="0"/>
-              <w:pStyle w:val="Compact"/>
-              <w:jc w:val="both"/>
-            </w:pPr>
-            <w:r>
-              <w:rPr>
-                <w:sz w:val="21"/>
-                <w:szCs w:val="21"/>
-              </w:rPr>
-              <w:t xml:space="preserve">Public repositories with reproducing pipelines; metered validation; final scientific and policy reports</w:t>
+              <w:t xml:space="preserve">D2: open release. D3: final report</w:t>
+            </w:r>
+          </w:p>
+        </w:tc>
+        <w:tc>
+          <w:tcPr/>
+          <w:p>
+            <w:pPr>
+              <w:spacing w:line="317" w:lineRule="auto" w:before="20" w:after="20"/>
+              <w:widowControl w:val="0"/>
+              <w:pStyle w:val="Compact"/>
+              <w:jc w:val="both"/>
+            </w:pPr>
+            <w:r>
+              <w:rPr>
+                <w:sz w:val="21"/>
+                <w:szCs w:val="21"/>
+              </w:rPr>
+              <w:t xml:space="preserve">Public repositories with reproducing pipelines. Metered validation. Final scientific and policy reports.</w:t>
             </w:r>
           </w:p>
         </w:tc>
@@ -4490,13 +3835,7 @@
         <w:jc w:val="both"/>
       </w:pPr>
       <w:r>
-        <w:t xml:space="preserve">The M4 preliminary memo, the M8 technical brief and the M21 policy draft are named deliverables, in Hebrew, circulable to the Ministry, the Authority and Noga [19]; a bounding result is itself a deliverable.</w:t>
-      </w:r>
-      <w:r>
-        <w:t xml:space="preserve"> </w:t>
-      </w:r>
-      <w:r>
-        <w:t xml:space="preserve">Minimum-success path: H100/L40S validation, one serving engine, BMC wall measurement, the job and transfer models, the joint controller, and one Israeli flexibility scenario; B200-class cards, a second engine, fine-tuning and shared GPUs are extensions as access allows.</w:t>
+        <w:t xml:space="preserve">The M4 preliminary memo, the M8 technical brief and the M21 policy draft are named deliverables, written in Hebrew for the Ministry, the Authority and Noga [19]. A result that shows where the method stops working also counts as a deliverable. Minimum-success path: H100/L40S validation, one serving engine, BMC wall measurement, the job and transfer models, the joint controller, and one Israeli flexibility scenario. B200-class cards, a second engine, fine-tuning and shared GPUs are extensions as access allows.</w:t>
       </w:r>
     </w:p>
     <w:bookmarkEnd w:id="41"/>
@@ -4629,7 +3968,7 @@
                 <w:sz w:val="21"/>
                 <w:szCs w:val="21"/>
               </w:rPr>
-              <w:t xml:space="preserve">M1–M8 (WP1; WP2 begins)</w:t>
+              <w:t xml:space="preserve">M1–M8 (WP1, WP2 begins)</w:t>
             </w:r>
           </w:p>
         </w:tc>
@@ -4683,7 +4022,7 @@
                 <w:sz w:val="21"/>
                 <w:szCs w:val="21"/>
               </w:rPr>
-              <w:t xml:space="preserve">Postdoctoral researcher; GPU rentals for cap sweeps</w:t>
+              <w:t xml:space="preserve">Postdoctoral researcher. GPU rentals for cap sweeps.</w:t>
             </w:r>
           </w:p>
         </w:tc>
@@ -4704,7 +4043,7 @@
                 <w:sz w:val="21"/>
                 <w:szCs w:val="21"/>
               </w:rPr>
-              <w:t xml:space="preserve">M9–M16 (WP2 ends; WP3; WP4 begins)</w:t>
+              <w:t xml:space="preserve">M9–M16 (WP2 ends, WP3, WP4 begins)</w:t>
             </w:r>
           </w:p>
         </w:tc>
@@ -4758,7 +4097,7 @@
                 <w:sz w:val="21"/>
                 <w:szCs w:val="21"/>
               </w:rPr>
-              <w:t xml:space="preserve">Postdoctoral researcher; card-model rentals for transfer validation; twin and controller work</w:t>
+              <w:t xml:space="preserve">Postdoctoral researcher. Card-model rentals for transfer validation. Twin and controller work.</w:t>
             </w:r>
           </w:p>
         </w:tc>
@@ -4779,7 +4118,7 @@
                 <w:sz w:val="21"/>
                 <w:szCs w:val="21"/>
               </w:rPr>
-              <w:t xml:space="preserve">M17–M21 (WP4 ends; WP5)</w:t>
+              <w:t xml:space="preserve">M17–M21 (WP4 ends, WP5)</w:t>
             </w:r>
           </w:p>
         </w:tc>
@@ -4833,7 +4172,7 @@
                 <w:sz w:val="21"/>
                 <w:szCs w:val="21"/>
               </w:rPr>
-              <w:t xml:space="preserve">Postdoctoral researcher; BMC-metered rentals; flexibility campaign</w:t>
+              <w:t xml:space="preserve">Postdoctoral researcher. BMC-metered rentals. Flexibility campaign.</w:t>
             </w:r>
           </w:p>
         </w:tc>
@@ -4908,7 +4247,7 @@
                 <w:sz w:val="21"/>
                 <w:szCs w:val="21"/>
               </w:rPr>
-              <w:t xml:space="preserve">Postdoctoral researcher; metered validation runs; documentation; dissemination and publication</w:t>
+              <w:t xml:space="preserve">Postdoctoral researcher. Metered validation runs. Documentation, dissemination and publication.</w:t>
             </w:r>
           </w:p>
         </w:tc>
@@ -5088,57 +4427,43 @@
                 <w:sz w:val="21"/>
                 <w:szCs w:val="21"/>
               </w:rPr>
-              <w:t xml:space="preserve">Production serving software (</w:t>
-            </w:r>
-            <w:r>
-              <w:rPr>
-                <w:sz w:val="21"/>
-                <w:szCs w:val="21"/>
-              </w:rPr>
-              <w:t xml:space="preserve">requests batched as they arrive</w:t>
-            </w:r>
-            <w:r>
-              <w:rPr>
-                <w:sz w:val="21"/>
-                <w:szCs w:val="21"/>
-              </w:rPr>
-              <w:t xml:space="preserve">, shifting phases) blurs the per-card constant</w:t>
-            </w:r>
-          </w:p>
-        </w:tc>
-        <w:tc>
-          <w:tcPr/>
-          <w:p>
-            <w:pPr>
-              <w:spacing w:line="317" w:lineRule="auto" w:before="20" w:after="20"/>
-              <w:widowControl w:val="0"/>
-              <w:pStyle w:val="Compact"/>
-              <w:jc w:val="both"/>
-            </w:pPr>
-            <w:r>
-              <w:rPr>
-                <w:sz w:val="21"/>
-                <w:szCs w:val="21"/>
-              </w:rPr>
-              <w:t xml:space="preserve">Static cap loses near-optimality for LLMs</w:t>
-            </w:r>
-          </w:p>
-        </w:tc>
-        <w:tc>
-          <w:tcPr/>
-          <w:p>
-            <w:pPr>
-              <w:spacing w:line="317" w:lineRule="auto" w:before="20" w:after="20"/>
-              <w:widowControl w:val="0"/>
-              <w:pStyle w:val="Compact"/>
-              <w:jc w:val="both"/>
-            </w:pPr>
-            <w:r>
-              <w:rPr>
-                <w:sz w:val="21"/>
-                <w:szCs w:val="21"/>
-              </w:rPr>
-              <w:t xml:space="preserve">Measured first (WP1, M1); the job model predicts the optimum where the constant breaks</w:t>
+              <w:t xml:space="preserve">Production serving software (requests batched as they arrive, shifting phases) blurs the per-card constant</w:t>
+            </w:r>
+          </w:p>
+        </w:tc>
+        <w:tc>
+          <w:tcPr/>
+          <w:p>
+            <w:pPr>
+              <w:spacing w:line="317" w:lineRule="auto" w:before="20" w:after="20"/>
+              <w:widowControl w:val="0"/>
+              <w:pStyle w:val="Compact"/>
+              <w:jc w:val="both"/>
+            </w:pPr>
+            <w:r>
+              <w:rPr>
+                <w:sz w:val="21"/>
+                <w:szCs w:val="21"/>
+              </w:rPr>
+              <w:t xml:space="preserve">One fixed cap per card is no longer near-best for LLMs</w:t>
+            </w:r>
+          </w:p>
+        </w:tc>
+        <w:tc>
+          <w:tcPr/>
+          <w:p>
+            <w:pPr>
+              <w:spacing w:line="317" w:lineRule="auto" w:before="20" w:after="20"/>
+              <w:widowControl w:val="0"/>
+              <w:pStyle w:val="Compact"/>
+              <w:jc w:val="both"/>
+            </w:pPr>
+            <w:r>
+              <w:rPr>
+                <w:sz w:val="21"/>
+                <w:szCs w:val="21"/>
+              </w:rPr>
+              <w:t xml:space="preserve">Measured first (WP1, M1). The job model predicts the best cap where the constant breaks.</w:t>
             </w:r>
           </w:p>
         </w:tc>
@@ -5223,21 +4548,7 @@
                 <w:sz w:val="21"/>
                 <w:szCs w:val="21"/>
               </w:rPr>
-              <w:t xml:space="preserve">AWS EC2 gives passthrough and root; too-high cap floors are exposed via the graphics clock (L4 [1]);</w:t>
-            </w:r>
-            <w:r>
-              <w:rPr>
-                <w:sz w:val="21"/>
-                <w:szCs w:val="21"/>
-              </w:rPr>
-              <w:t xml:space="preserve"> </w:t>
-            </w:r>
-            <w:r>
-              <w:rPr>
-                <w:sz w:val="21"/>
-                <w:szCs w:val="21"/>
-              </w:rPr>
-              <w:t xml:space="preserve">named BMC-capable bare-metal vendors with dated quotes (GPU Mart and equivalents); fallback to an in-line metered PDU at the wall</w:t>
+              <w:t xml:space="preserve">AWS EC2 gives direct GPU access and full control. Where the lowest allowed cap is above the JP, limiting the clock speed reaches it instead (L4 [1]). Named bare-metal vendors with BMC metering have given dated quotes (GPU Mart and similar). Fallback: a metered power strip at the wall.</w:t>
             </w:r>
           </w:p>
         </w:tc>
@@ -5294,7 +4605,7 @@
                 <w:sz w:val="21"/>
                 <w:szCs w:val="21"/>
               </w:rPr>
-              <w:t xml:space="preserve">PI runs the WP1 bench himself on his own measurement software; the minimum-success path is one-FTE; an M.Sc. student, funded from the unspent stipend, covers the gap; WP5 proceeds on public data</w:t>
+              <w:t xml:space="preserve">The PI runs the WP1 bench himself on his own software. The minimum path needs one FTE. An M.Sc. student, funded from the unspent stipend, covers the gap. WP5 proceeds on public data.</w:t>
             </w:r>
           </w:p>
         </w:tc>
@@ -5338,7 +4649,13 @@
         <w:t xml:space="preserve"> </w:t>
       </w:r>
       <w:r>
-        <w:t xml:space="preserve">Alexander Apartsin, Senior Lecturer, Computer Science, HIT; single-PI, responsible for all five work packages, committing ~one day per week (~20 percent) over 24 months, no grant salary (§2.6).</w:t>
+        <w:t xml:space="preserve">Alexander Apartsin, Senior Lecturer, Computer Science, HIT.</w:t>
+      </w:r>
+      <w:r>
+        <w:t xml:space="preserve"> </w:t>
+      </w:r>
+      <w:r>
+        <w:t xml:space="preserve">Single PI, responsible for all five work packages, about one day per week (20 percent) over 24 months, no grant salary (§2.6).</w:t>
       </w:r>
     </w:p>
     <w:p>
@@ -5358,7 +4675,7 @@
         <w:t xml:space="preserve"> </w:t>
       </w:r>
       <w:r>
-        <w:t xml:space="preserve">The PI produced the measured foundation this project extends: study [1] delivered the ELF dataset, the power law and the Joule Point, and its measurement software, models and simulator are working code that WP1–WP3 extend directly. His engineering record is capacity-and-cost work of exactly this kind: system-sizing at Amdocs that contributed about $10M in savings, and cost-aware AI systems in industry. He has led R&amp;D teams in industry (Head of AI, Motorola Solutions Israel Innovation Center; Head of Data Science, Questar) and, as group leader, delivered the technical work and milestones of an Israel-U.S. BIRD binational grant and an Israel Innovation Authority Magneton grant. His academic thread is energy-efficient computing, from energy-efficient remote-sensing measurement [24] to the CalexNet study of efficient inference in deep models [25].</w:t>
+        <w:t xml:space="preserve">The PI produced the measured foundation this project extends: study [1] delivered the ELF dataset, the power-response law and the Joule Point, and its software, models and simulator are working code that WP1–WP3 extend directly. His engineering record is capacity-and-cost work of this kind: system-sizing at Amdocs (about $10M in savings) and cost-aware AI systems in industry. He has led industrial R&amp;D teams (Head of AI, Motorola Solutions Israel Innovation Center, and Head of Data Science, Questar) and, as group leader, delivered the technical milestones of an Israel-U.S. BIRD grant and an Israel Innovation Authority Magneton grant. Earlier work also addressed efficiency in computing: energy-efficient remote sensing [24] and efficient deep-network inference (CalexNet [25]).</w:t>
       </w:r>
     </w:p>
     <w:p>
@@ -5372,13 +4689,13 @@
           <w:b/>
           <w:bCs/>
         </w:rPr>
-        <w:t xml:space="preserve">Research personnel.</w:t>
-      </w:r>
-      <w:r>
-        <w:t xml:space="preserve"> </w:t>
-      </w:r>
-      <w:r>
-        <w:t xml:space="preserve">One postdoctoral researcher at 90% position, both years, extends the existing ELF measurement software, models and simulator under the PI's direct supervision, reported within a month of signature (נספח טז' §2.5). Profile: GPU systems and energy instrumentation, ML systems, optimization or control; hiring-slip fallback in 2.5.7.3. WP4 and WP5, the flexibility products and the policy analysis on public Noga and Authority figures, run under the PI's direction with the advisor's guidance and are designed to be shared with the Authority and Noga during the hearing window [19].</w:t>
+        <w:t xml:space="preserve">Advisor.</w:t>
+      </w:r>
+      <w:r>
+        <w:t xml:space="preserve"> </w:t>
+      </w:r>
+      <w:r>
+        <w:t xml:space="preserve">Prof. Moshe Tshuva (Afeka College of Engineering), a senior energy-systems engineer with two decades in energy management and efficiency, advises the project, unpaid, on the energy-systems and regulatory basis of the flexibility and valuation work.</w:t>
       </w:r>
     </w:p>
     <w:p>
@@ -5392,13 +4709,13 @@
           <w:b/>
           <w:bCs/>
         </w:rPr>
-        <w:t xml:space="preserve">Advisor.</w:t>
-      </w:r>
-      <w:r>
-        <w:t xml:space="preserve"> </w:t>
-      </w:r>
-      <w:r>
-        <w:t xml:space="preserve">Prof. Moshe Tshuva (Afeka College of Engineering), a senior energy-systems engineer with two decades in energy management and efficiency, advises the project, unpaid, on the energy-systems and regulatory basis of the flexibility and valuation work.</w:t>
+        <w:t xml:space="preserve">Research personnel.</w:t>
+      </w:r>
+      <w:r>
+        <w:t xml:space="preserve"> </w:t>
+      </w:r>
+      <w:r>
+        <w:t xml:space="preserve">One postdoctoral researcher at 90% position, both years, extends the ELF software, models and simulator under the PI's direct supervision, reported within a month of signature (‎2.5). Profile: GPU systems, energy instrumentation, ML systems, optimization or control. The hiring-slip fallback is in 2.5.7.3. WP4 and WP5 run under the PI's direction, guided by the advisor, for sharing with the Authority and Noga during the hearing [19].</w:t>
       </w:r>
     </w:p>
     <w:p>
@@ -5418,7 +4735,7 @@
         <w:t xml:space="preserve"> </w:t>
       </w:r>
       <w:r>
-        <w:t xml:space="preserve">The project owns no hardware and nothing waits on procurement: measurement and the WP4 demo run on rented AWS and BMC-metered servers at public list prices.</w:t>
+        <w:t xml:space="preserve">The project owns no hardware: measurement and the WP4 demo run on rented AWS and BMC-metered servers at list prices.</w:t>
       </w:r>
       <w:r>
         <w:t xml:space="preserve"> </w:t>
@@ -5454,7 +4771,7 @@
         <w:jc w:val="both"/>
       </w:pPr>
       <w:r>
-        <w:t xml:space="preserve">No other, complementary, or parallel student funding is taken or sought (נספח טז' §1.5.2, §2.10).</w:t>
+        <w:t xml:space="preserve">No other, complementary, or parallel student funding is taken or sought (‎1.5.2, §2.10).</w:t>
       </w:r>
     </w:p>
     <w:bookmarkEnd w:id="46"/>
@@ -5505,7 +4822,7 @@
         <w:t xml:space="preserve"> </w:t>
       </w:r>
       <w:r>
-        <w:t xml:space="preserve">Preprint, September 2026. DOI:</w:t>
+        <w:t xml:space="preserve">arXiv preprint, September 2026. arXiv:</w:t>
       </w:r>
       <w:r>
         <w:t xml:space="preserve"> </w:t>
@@ -5515,7 +4832,7 @@
           <w:rPr>
             <w:rStyle w:val="Hyperlink"/>
           </w:rPr>
-          <w:t xml:space="preserve">10.13140/RG.2.2.20385.36964</w:t>
+          <w:t xml:space="preserve">2609.27926</w:t>
         </w:r>
       </w:hyperlink>
       <w:r>
@@ -5552,7 +4869,7 @@
         <w:t xml:space="preserve"> </w:t>
       </w:r>
       <w:r>
-        <w:t xml:space="preserve">Press report on the Electricity Authority's temporary order: pending applications of approximately 27,000 MW, about three times Israel's average electricity consumption. https://www.jns.org/news/israel-news/israel-halts-new-data-center-grid-requests-for-140-days-amid-surge-in-demand (the Authority's order is published on gov.il).</w:t>
+        <w:t xml:space="preserve">Press report on the Electricity Authority's temporary order: pending applications of approximately 27,000 MW, about three times Israel's average power demand (about 9,000 MW). https://www.jns.org/news/israel-news/israel-halts-new-data-center-grid-requests-for-140-days-amid-surge-in-demand (the Authority's order is published on gov.il).</w:t>
       </w:r>
     </w:p>
     <w:p>
@@ -6286,7 +5603,7 @@
       </w:r>
     </w:p>
     <w:bookmarkEnd w:id="52"/>
-    <w:bookmarkStart w:id="62" w:name="X5d5bc83c2eef3c669b01ea2354df53c4eb22d2f"/>
+    <w:bookmarkStart w:id="62" w:name="X7f68e89c8a36aa61139e1c643be1bf8c67efc75"/>
     <w:p>
       <w:pPr>
         <w:keepLines w:val="0"/>
@@ -6302,7 +5619,7 @@
         <w:rPr>
           <w:color w:val="111111"/>
         </w:rPr>
-        <w:t xml:space="preserve">Appendix A: Figures (within the 5-page allowance of נספח א'1 §2.2)</w:t>
+        <w:t xml:space="preserve">Appendix A: Figures (within the 5-page allowance of ‎2.2)</w:t>
       </w:r>
     </w:p>
     <w:p>
@@ -6312,7 +5629,7 @@
         <w:jc w:val="both"/>
       </w:pPr>
       <w:r>
-        <w:t xml:space="preserve">JouleFlex · קול קורא 34/2026 · Appendix to the research proposal, permitted under נספח א'1 §2.2 (graphs, tables and</w:t>
+        <w:t xml:space="preserve">JouleFlex · קול קורא 34/2026 · Appendix to the research proposal, permitted under ‎2.2 (graphs, tables and</w:t>
       </w:r>
       <w:r>
         <w:t xml:space="preserve"> </w:t>

</xml_diff>

<commit_message>
Publish B2-readability v2: rebuilt PDF/DOCX, index, form-guide, checklist (EN 299 / HE 292)
Co-Authored-By: Claude Opus 5.5 <noreply@anthropic.com>
</commit_message>
<xml_diff>
--- a/JouleFlex-proposal-v2-2026-10-01.docx
+++ b/JouleFlex-proposal-v2-2026-10-01.docx
@@ -122,7 +122,7 @@
         <w:t xml:space="preserve">2.5.2 Abstract / תקציר</w:t>
       </w:r>
     </w:p>
-    <w:bookmarkStart w:id="22" w:name="english-300300-words"/>
+    <w:bookmarkStart w:id="22" w:name="english-299300-words"/>
     <w:p>
       <w:pPr>
         <w:keepLines w:val="0"/>
@@ -141,7 +141,7 @@
         <w:rPr>
           <w:color w:val="111111"/>
         </w:rPr>
-        <w:t xml:space="preserve">300</w:t>
+        <w:t xml:space="preserve">299</w:t>
       </w:r>
       <w:r>
         <w:rPr>
@@ -157,7 +157,7 @@
         <w:jc w:val="both"/>
       </w:pPr>
       <w:r>
-        <w:t xml:space="preserve">In July 2026 Israel's Electricity Authority froze new data-center grid connections for 140 days, after the queue reached about 27,000 MW, three times the country's average demand [2]. One way forward, proposed in the Authority's June 2026 hearing [19], is flexible connection: the system operator may curtail its consumption at peak. Most of it goes to GPUs, the chips that run AI. Today a data center adjusts by capping their power or switching some off.</w:t>
+        <w:t xml:space="preserve">In July 2026 Israel's Electricity Authority froze new data-center grid connections for 140 days. The queue had reached about 27,000 MW, three times Israel's average demand [2]. One way forward, proposed in the Authority's June 2026 hearing [19], is flexible connection: the system operator may reduce the center's power at peak. Most of that power goes to GPUs, the chips that run AI. Today a data center adjusts by capping their power or switching some off.</w:t>
       </w:r>
     </w:p>
     <w:p>
@@ -167,7 +167,7 @@
         <w:jc w:val="both"/>
       </w:pPr>
       <w:r>
-        <w:t xml:space="preserve">The PI's study [1] shows that both are wasteful. Switching GPUs off forfeits their work. Capping too hard makes jobs run so long that the GPU's fixed baseline power adds up. Capping too little spends much more energy for very little extra speed. Energy per task is therefore U-shaped. At its bottom, the Joule Point, each unit of energy does the most AI work. Measured on 20 AI models and four GPU types, it sits well below full power and cuts energy per task by 29 to 31 percent. A fleet simulation did the same work with 18 to 45 percent less energy. Capped GPUs draw less power, so more fit behind the same connection: up to about 50 percent more AI work per megawatt of GPU power. Servers and cooling draw power that capping does not cut, so the project measures the real gain at the building's meter.</w:t>
+        <w:t xml:space="preserve">The PI's study [1] shows that both are wasteful. Switching GPUs off loses their work. Capping too hard makes jobs run so long that the GPU's fixed baseline power costs more energy. Capping too little spends much more energy for little extra speed. Energy per task is therefore U-shaped. At its bottom, the Joule Point, each unit of energy does the most AI work. Measured on 20 AI models and four GPU types, it lies well below full power and cuts energy per task by 29 to 31 percent. A fleet simulation did the same work with 18 to 45 percent less energy. Capped GPUs draw less power, so more fit behind the same connection: up to about 50 percent more AI work per megawatt of GPU power. Servers and cooling draw power that capping does not cut, so the project measures the real gain at the building's meter.</w:t>
       </w:r>
     </w:p>
     <w:p>
@@ -177,7 +177,7 @@
         <w:jc w:val="both"/>
       </w:pPr>
       <w:r>
-        <w:t xml:space="preserve">Knowing this optimum turns flexibility from forced cutbacks into a design choice. This project builds the tools: control that keeps each GPU near its Joule Point and lowers power when the grid asks, pricing that rewards efficient use of flexible power, planning how many GPUs to install behind a connection, and connection scenarios showing how much of the queue flexible connections could serve, by region. This gives a measured third option between full-power connection and refusal.</w:t>
+        <w:t xml:space="preserve">Knowing this optimum turns flexibility from forced cutbacks into a design choice. This project builds the tools. Control keeps each GPU near its Joule Point and lowers power when the grid asks. Pricing rewards efficient use of flexible power. Planning sets how many GPUs to install behind a connection. Connection scenarios show, by region, how much of the queue flexible connections could serve. This gives a measured third option between full-power connection and refusal.</w:t>
       </w:r>
     </w:p>
     <w:bookmarkEnd w:id="22"/>
@@ -372,7 +372,7 @@
                 <w:sz w:val="21"/>
                 <w:szCs w:val="21"/>
               </w:rPr>
-              <w:t xml:space="preserve">A software limit on a GPU's power draw. It is set with one command and takes effect in about 0.2 seconds. The control knob of this project.</w:t>
+              <w:t xml:space="preserve">A software limit on a GPU's power draw. It is set with one command and takes effect in about 0.2 seconds. It is the control setting of this project.</w:t>
             </w:r>
           </w:p>
         </w:tc>
@@ -528,7 +528,7 @@
                 <w:sz w:val="21"/>
                 <w:szCs w:val="21"/>
               </w:rPr>
-              <w:t xml:space="preserve">A limit on a facility's total power draw that can change over time, set by a budget, a price or carbon signal, or a grid instruction.</w:t>
+              <w:t xml:space="preserve">A limit on a facility's total power draw. It can change over time, set by a budget, a price or carbon signal, or a grid instruction.</w:t>
             </w:r>
           </w:p>
         </w:tc>
@@ -567,7 +567,7 @@
                 <w:sz w:val="21"/>
                 <w:szCs w:val="21"/>
               </w:rPr>
-              <w:t xml:space="preserve">A simulator that replays the measured power-versus-rate curves of a described fleet to evaluate any policy or power envelope.</w:t>
+              <w:t xml:space="preserve">A simulator that replays the measured power-versus-speed curves of a fleet. It tests any control policy or power limit.</w:t>
             </w:r>
           </w:p>
         </w:tc>
@@ -606,7 +606,7 @@
                 <w:sz w:val="21"/>
                 <w:szCs w:val="21"/>
               </w:rPr>
-              <w:t xml:space="preserve">The PI's released dataset and measurement software: dense power-cap sweeps of 20 AI models on 4 GPUs, ~5,500 measured rows.</w:t>
+              <w:t xml:space="preserve">The PI's released dataset and measurement software: dense power-cap sweeps of 20 AI models on 4 GPUs, about 5,500 measured rows.</w:t>
             </w:r>
           </w:p>
         </w:tc>
@@ -684,7 +684,7 @@
                 <w:sz w:val="21"/>
                 <w:szCs w:val="21"/>
               </w:rPr>
-              <w:t xml:space="preserve">Grid connection capacity guaranteed at all times, versus capacity given on condition that the facility reduces power when instructed.</w:t>
+              <w:t xml:space="preserve">Firm: grid connection capacity guaranteed at all times. Flexible: capacity given on condition that the facility reduces power when instructed.</w:t>
             </w:r>
           </w:p>
         </w:tc>
@@ -723,7 +723,7 @@
                 <w:sz w:val="21"/>
                 <w:szCs w:val="21"/>
               </w:rPr>
-              <w:t xml:space="preserve">A grid connection combining a guaranteed (firm) part with a curtailable (flexible) part.</w:t>
+              <w:t xml:space="preserve">A grid connection that combines a guaranteed (firm) part with a flexible part that can be reduced on instruction.</w:t>
             </w:r>
           </w:p>
         </w:tc>
@@ -801,7 +801,7 @@
                 <w:sz w:val="21"/>
                 <w:szCs w:val="21"/>
               </w:rPr>
-              <w:t xml:space="preserve">Card: one GPU. Board power is the GPU's own draw, from its built-in meter, excluding the host server, cooling and building losses.</w:t>
+              <w:t xml:space="preserve">Card: one GPU. Board power is the GPU's own draw, from its built-in meter. It excludes the host server, cooling and building losses.</w:t>
             </w:r>
           </w:p>
         </w:tc>
@@ -840,7 +840,21 @@
                 <w:sz w:val="21"/>
                 <w:szCs w:val="21"/>
               </w:rPr>
-              <w:t xml:space="preserve">The power entering the server, read by its management controller (BMC). This is what the grid meters, before cooling and building losses.</w:t>
+              <w:t xml:space="preserve">The power entering the server, read by its management controller (BMC).</w:t>
+            </w:r>
+            <w:r>
+              <w:rPr>
+                <w:sz w:val="21"/>
+                <w:szCs w:val="21"/>
+              </w:rPr>
+              <w:t xml:space="preserve"> </w:t>
+            </w:r>
+            <w:r>
+              <w:rPr>
+                <w:sz w:val="21"/>
+                <w:szCs w:val="21"/>
+              </w:rPr>
+              <w:t xml:space="preserve">This is what the grid measures, before cooling and building losses.</w:t>
             </w:r>
           </w:p>
         </w:tc>
@@ -879,7 +893,7 @@
                 <w:sz w:val="21"/>
                 <w:szCs w:val="21"/>
               </w:rPr>
-              <w:t xml:space="preserve">The power cap actually limits the GPU (the GPU is busy enough to reach it).</w:t>
+              <w:t xml:space="preserve">The power cap really limits the GPU (the GPU is busy enough to reach it).</w:t>
             </w:r>
           </w:p>
         </w:tc>
@@ -996,7 +1010,7 @@
                 <w:sz w:val="21"/>
                 <w:szCs w:val="21"/>
               </w:rPr>
-              <w:t xml:space="preserve">A documented limit on where the law or the JP holds. Itself a deliverable.</w:t>
+              <w:t xml:space="preserve">A documented limit on where the law or the JP holds. It is itself a deliverable.</w:t>
             </w:r>
           </w:p>
         </w:tc>
@@ -1056,7 +1070,7 @@
         <w:t xml:space="preserve"> </w:t>
       </w:r>
       <w:r>
-        <w:t xml:space="preserve">In July 2026 the Electricity Authority stopped accepting new data-center connection requests for 140 days. The queue had reached about 27,000 MW, three times Israel's average demand [2].AI data centers are the fastest-growing load in that queue, and most of their power goes to GPUs (the chips that run AI).</w:t>
+        <w:t xml:space="preserve">In July 2026 the Electricity Authority stopped accepting new data-center connection requests for 140 days. The queue had reached about 27,000 MW, three times Israel's average demand [2]. AI data centers are the fastest-growing load in that queue. Most of their power goes to GPUs, the chips that run AI.</w:t>
       </w:r>
     </w:p>
     <w:p>
@@ -1076,7 +1090,7 @@
         <w:t xml:space="preserve"> </w:t>
       </w:r>
       <w:r>
-        <w:t xml:space="preserve">Today a data center adjusts its AI load by capping GPU power or by switching GPUs off. A GPU's power draw is a software setting: one command sets a cap, and within about 0.2 s the GPU uses less power and runs a little slower. Capping lets a facility fit its load to the power it has, and fit more GPUs behind one connection. Switching off forfeits work, and capping blindly throws away work too.</w:t>
+        <w:t xml:space="preserve">Today a data center adjusts its AI load by capping GPU power or by switching GPUs off. A GPU's power draw is a software setting. One command sets a cap. Within about 0.2 s the GPU uses less power and runs a little slower. Capping lets a facility fit its load to the power it has, and fit more GPUs behind one connection. Switching off loses work. Capping without measurement also wastes work.</w:t>
       </w:r>
     </w:p>
     <w:p>
@@ -1109,7 +1123,7 @@
         <w:t xml:space="preserve">power-response law</w:t>
       </w:r>
       <w:r>
-        <w:t xml:space="preserve">: when the cap is lowered, the GPU's output drops more slowly than its power. Energy per task therefore drops to a minimum, the</w:t>
+        <w:t xml:space="preserve">: when the cap is lowered, the GPU's output drops more slowly than its power. Energy per task therefore falls to a minimum, the</w:t>
       </w:r>
       <w:r>
         <w:t xml:space="preserve"> </w:t>
@@ -1122,7 +1136,7 @@
         <w:t xml:space="preserve">Joule Point (JP)</w:t>
       </w:r>
       <w:r>
-        <w:t xml:space="preserve">, and rises again below it. Airlines face the same trade-off: flying faster burns fuel much faster, but flying too slowly keeps the engines running longer, so planes cruise at the speed that uses the least fuel per kilometer. The Joule Point is the GPU's cruising speed. Measured at the GPU board, the JP sits well below rated power (TDP) and is nearly the same for every job on a given card. At the JP a GPU uses 29–31 percent less energy per task and takes about 1.2 times longer. Run at the JP, a fixed connection delivers up to about 50 percent more AI work per connected megawatt (measured A100 curve, at the chip, to be confirmed at the facility meter). Running at maximum, today's default, is the energy-worst point, and it is the point the grid is being sized for.</w:t>
+        <w:t xml:space="preserve">, and rises again below it. Airlines face the same trade-off. Flying faster burns much more fuel, but flying too slowly keeps the engines running longer. Planes therefore cruise at the speed that uses the least fuel per kilometer. The Joule Point is the GPU's cruising speed. Measured at the GPU board, the JP lies well below rated power (TDP). It is nearly the same for every job on a given card. At the JP a GPU uses 29–31 percent less energy per task and takes about 1.2 times longer. Run at the JP, a fixed connection delivers up to about 50 percent more AI work per connected megawatt. This is the measured A100 curve at the chip, to be confirmed at the facility meter. Running at maximum, today's default, is the energy-worst point. It is also the point the grid is sized for.</w:t>
       </w:r>
     </w:p>
     <w:p>
@@ -1142,7 +1156,7 @@
         <w:t xml:space="preserve"> </w:t>
       </w:r>
       <w:r>
-        <w:t xml:space="preserve">is to research, validate and develop a set of models and methods for controlling, pricing, planning and allocating power in AI data centers whose power is limited and changes over time. With them, a data center can be connected on condition of flexibility: it runs its GPUs near the Joule Point and lowers their power further when the grid asks.</w:t>
+        <w:t xml:space="preserve">is to research, validate and develop models and methods for controlling, pricing, planning and allocating power in AI data centers. These are data centers whose power supply is limited and changes over time. With these methods, a data center can be connected on condition of flexibility. It runs its GPUs near the Joule Point and lowers their power further when the grid asks.</w:t>
       </w:r>
       <w:r>
         <w:t xml:space="preserve"> </w:t>
@@ -1191,7 +1205,7 @@
         <w:t xml:space="preserve">JouleFlex</w:t>
       </w:r>
       <w:r>
-        <w:t xml:space="preserve">, an open software toolkit built on the JP (minimum-success path in 2.5.7.1). At its core is a control engine (C1). It predicts the best power cap for each job and each GPU, decides which GPU runs which job, and keeps the facility within its power limit while jobs meet their deadlines. Around it, the toolkit sets prices that reward efficient use of flexible power, instead of today's per-hour billing that pushes renters to full power (C2). It designs the fleet: for an expected workload and power limit, it picks which GPUs to buy, and how many, by weighing their cost against the revenue they earn when each runs at its estimated Joule Point (C3). And it shows, region by region, how much of the queue could be connected if part of each connection were flexible (C4). A simulator built from the measurements tests all four. C3 and C4 are studies on public data, not deployed systems, and everything is released openly (2.5.6.1).</w:t>
+        <w:t xml:space="preserve">, an open software toolkit built on the JP (minimum-success path in 2.5.7.1). Its core is a control engine (C1). It predicts the best power cap for each job and each GPU, and decides which GPU runs which job. It keeps the facility within its power limit while jobs meet their deadlines. Around it, the toolkit sets prices that reward efficient use of flexible power (C2). Today's per-hour billing instead pushes renters to full power. The toolkit designs the fleet (C3): for an expected workload and power limit, it picks which GPUs to buy, and how many. It weighs each GPU's cost against the revenue it earns at its estimated Joule Point. The toolkit also shows, region by region, how much of the queue could be connected if part of each connection were flexible (C4). A simulator built from the measurements tests all four. C3 and C4 are studies on public data, not deployed systems. Everything is released openly (2.5.6.1).</w:t>
       </w:r>
     </w:p>
     <w:bookmarkEnd w:id="26"/>
@@ -1218,7 +1232,7 @@
         <w:jc w:val="both"/>
       </w:pPr>
       <w:r>
-        <w:t xml:space="preserve">The central question is whether an AI data center can act as a flexible electrical load: one that runs efficiently, follows a power limit that changes over time, and still finishes its work on time. Four research questions follow. Each answers one knowledge gap (2.5.5.3), is worked on in the work packages named with it (2.5.5.5), and yields one deliverable (2.5.4.1).</w:t>
+        <w:t xml:space="preserve">The central question is whether an AI data center can act as a flexible electrical load. Such a load runs efficiently, follows a power limit that changes over time, and still finishes its work on time. Four research questions follow. Each answers one knowledge gap (2.5.5.3), is worked on in the work packages named with it (2.5.5.5), and produces one deliverable (2.5.4.1).</w:t>
       </w:r>
     </w:p>
     <w:p>
@@ -1242,7 +1256,7 @@
         <w:t xml:space="preserve"> </w:t>
       </w:r>
       <w:r>
-        <w:t xml:space="preserve">Can the Joule Point be predicted for any job and GPU, and can a controller keep a whole facility near it under a changing power limit while meeting deadlines? (WP1–WP3)</w:t>
+        <w:t xml:space="preserve">Can the Joule Point be predicted for any job and GPU? Can a controller keep a whole facility near it under a changing power limit while meeting deadlines? (WP1–WP3)</w:t>
       </w:r>
     </w:p>
     <w:p>
@@ -1290,7 +1304,7 @@
         <w:t xml:space="preserve"> </w:t>
       </w:r>
       <w:r>
-        <w:t xml:space="preserve">For an expected workload and a limited, changing power supply, which GPUs, and how many, give the best return once hardware cost, energy cost and revenue are counted? (WP2–WP3)</w:t>
+        <w:t xml:space="preserve">For an expected workload and a limited, changing power supply, which GPUs give the best return, and how many? The return counts hardware cost, energy cost and revenue. (WP2–WP3)</w:t>
       </w:r>
     </w:p>
     <w:p>
@@ -1314,7 +1328,7 @@
         <w:t xml:space="preserve"> </w:t>
       </w:r>
       <w:r>
-        <w:t xml:space="preserve">How much power can a facility give back to the grid, and how much of the connection queue could flexible connections serve, region by region? (WP4–WP5)</w:t>
+        <w:t xml:space="preserve">How much power can a facility give back to the grid? How much of the connection queue could flexible connections serve, region by region? (WP4–WP5)</w:t>
       </w:r>
     </w:p>
     <w:bookmarkEnd w:id="27"/>
@@ -1371,7 +1385,7 @@
         <w:t xml:space="preserve"> </w:t>
       </w:r>
       <w:r>
-        <w:t xml:space="preserve">Data centers, with AI the main growth driver, approach 945 TWh of electricity demand by 2030 [3]. On Israel's island grid, the 27,000 MW queue [2] makes connected megawatts, not energy, the binding national limit. Yet how much AI work a connected megawatt delivers is set by the energy each task uses. Today's operating decisions think in watts, not joules.</w:t>
+        <w:t xml:space="preserve">Data centers, with AI the main growth driver, approach 945 TWh of electricity demand by 2030 [3]. On Israel's island grid, the 27,000 MW queue [2] makes connected megawatts, not energy, the real national limit. Yet how much AI work a connected megawatt delivers depends on the energy each task uses. Today's operating decisions count watts, not joules.</w:t>
       </w:r>
     </w:p>
     <w:p>
@@ -1391,7 +1405,7 @@
         <w:t xml:space="preserve"> </w:t>
       </w:r>
       <w:r>
-        <w:t xml:space="preserve">The PI's study [1] (the ELF dataset) measured how energy per task depends on the power cap. Board power follows a simple empirical law in the computing rate θ,</w:t>
+        <w:t xml:space="preserve">The PI's study [1] (the ELF dataset) measured how energy per task depends on the power cap. Board power follows a simple measured law in the computing rate θ,</w:t>
       </w:r>
     </w:p>
     <w:p>
@@ -1516,7 +1530,7 @@
         <w:t xml:space="preserve">JP</w:t>
       </w:r>
       <w:r>
-        <w:t xml:space="preserve">, sits at 43 to 46 percent of rated power on the large GPUs. These are GPU board numbers. The grid meters further up a chain: the board, then the server input (adding the host's own power), then the facility (adding cooling and building losses, PUE). WP1 measures the board-to-server step. WP4 carries it to the facility megawatt the grid sees.</w:t>
+        <w:t xml:space="preserve">, lies at 43 to 46 percent of rated power on the large GPUs. These are GPU board numbers. The grid measures power further up the chain. After the board comes the server input, which adds the host's own power. Then comes the facility, which adds cooling and building losses (PUE). WP1 measures the board-to-server step. WP4 extends it to the facility megawatt the grid sees.</w:t>
       </w:r>
     </w:p>
     <w:bookmarkEnd w:id="29"/>
@@ -1575,7 +1589,7 @@
         <w:t xml:space="preserve"> </w:t>
       </w:r>
       <w:r>
-        <w:t xml:space="preserve">proved that energy is minimized at a speed below maximum [5,6,7]. ELF gives the measured form for GPU inference.</w:t>
+        <w:t xml:space="preserve">proved that energy is minimized at a speed below maximum [5,6,7]. ELF gives the measured form for GPU inference (running a trained AI model to answer requests).</w:t>
       </w:r>
       <w:r>
         <w:t xml:space="preserve"> </w:t>
@@ -1601,7 +1615,7 @@
         <w:t xml:space="preserve">Production context</w:t>
       </w:r>
       <w:r>
-        <w:t xml:space="preserve">: cluster studies [11] and public traces [12] show how jobs arrive. Energy-aware GPU schedulers [13,14] leave GPU power at its default. Method reviews [15] support our fixed measurement protocol. Recent work caps inference servers at one fixed power [20]. Other work finds capping does little during decode [23], the step where a language model writes its answer word by word and is slowed by memory, not computation. A third line runs AI data centers as grid assets that follow a facility power target [21].</w:t>
+        <w:t xml:space="preserve">: cluster studies [11] and public traces [12] show how jobs arrive. Energy-aware GPU schedulers [13,14] leave GPU power at its default. Method reviews [15] support our fixed measurement protocol. Recent work caps inference servers at one fixed power [20]. Other work finds capping does little during decode [23]. Decode is the step where a language model writes its answer word by word. It is limited by memory, not computation. A third line runs AI data centers as grid assets that follow a facility power target [21].</w:t>
       </w:r>
     </w:p>
     <w:bookmarkEnd w:id="30"/>
@@ -1642,7 +1656,7 @@
         <w:t xml:space="preserve"> </w:t>
       </w:r>
       <w:r>
-        <w:t xml:space="preserve">The Joule Point is established for single jobs at fixed settings on three GPUs (A100, A10G, L4) [1]. Whether it holds on newer hardware, on production AI software and on shared GPUs is unknown. No model yet predicts the best cap for a new job or GPU without a full measurement sweep. And no controller yet chooses job placement and power caps together under one changing power limit: the 18 to 45 percent fleet saving used a fixed placement and caps chosen afterward.</w:t>
+        <w:t xml:space="preserve">The Joule Point is established for single jobs at fixed settings on three GPUs (A100, A10G, L4) [1]. Whether it holds on newer hardware, on production AI software and on shared GPUs is unknown. No model yet predicts the best cap for a new job or GPU without a full measurement sweep. And no controller yet chooses job placement and power caps together under one changing power limit. The 18 to 45 percent fleet saving used a fixed placement, with caps chosen afterward.</w:t>
       </w:r>
     </w:p>
     <w:p>
@@ -1690,7 +1704,7 @@
         <w:t xml:space="preserve"> </w:t>
       </w:r>
       <w:r>
-        <w:t xml:space="preserve">Data centers choose GPUs as if each runs at full power and power were unlimited. No method yet picks the GPU mix that earns the most for an expected workload under a power limit, using each card's own optimum.</w:t>
+        <w:t xml:space="preserve">Data centers choose GPUs as if each ran at full power and power were unlimited. No method yet picks the GPU mix that earns the most under a power limit, using each card's own optimum.</w:t>
       </w:r>
     </w:p>
     <w:p>
@@ -1714,7 +1728,7 @@
         <w:t xml:space="preserve"> </w:t>
       </w:r>
       <w:r>
-        <w:t xml:space="preserve">All published numbers are GPU-board numbers, while the grid meters the whole facility, where server and power-supply losses add to the fixed power floor and move the optimum. How much power an AI facility can give back, how fast, for how long and at what cost has never been measured. The Authority's open hearing on the large-load connection track [19] does not yet have these numbers.</w:t>
+        <w:t xml:space="preserve">All published numbers are GPU-board numbers. The grid measures the whole facility, where server and power-supply losses add to the fixed power floor and move the optimum. How much power an AI facility can give back, how fast, for how long and at what cost has never been measured. The Authority's open hearing on the large-load connection track [19] does not yet have these numbers.</w:t>
       </w:r>
     </w:p>
     <w:bookmarkEnd w:id="31"/>
@@ -1954,7 +1968,7 @@
                 <w:sz w:val="21"/>
                 <w:szCs w:val="21"/>
               </w:rPr>
-              <w:t xml:space="preserve">WP1 re-runs the study's cap sweep (how much power and energy a GPU uses at each cap) on current GPUs (H100/L40S class) and on production serving engines (vLLM [16] and TensorRT-LLM, the software that runs AI models for users). Power is read at three points: the GPU board (NVML, the GPU's built-in meter), the host CPU (RAPL, the CPU's built-in meter), and the server input, the wall (BMC, the server's management controller). Meter error matters little: the JP is where a line from the origin touches the power curve P(θ) (dE/dθ = 0), so a meter that reads a few percent high or low leaves it unchanged. Only a fixed offset moves it, and WP1 states that caveat for absolute megawatt figures.</w:t>
+              <w:t xml:space="preserve">WP1 repeats the study's cap sweep on current GPUs (H100/L40S class) and on production serving engines. A cap sweep measures how much power and energy a GPU uses at each cap. The serving engines are vLLM [16] and TensorRT-LLM, the software that runs AI models for users. Power is read at three points: the GPU board (NVML, the GPU's built-in meter) and the host CPU (RAPL, the CPU's meter). The third is the server input, or wall (BMC, the server's management controller). Meter error matters little. The JP is where a line from the origin touches the power curve P(θ) (dE/dθ = 0). A meter that reads a few percent high or low leaves it unchanged. Only a fixed offset moves it, and WP1 states this limit for absolute megawatt figures.</w:t>
             </w:r>
             <w:r>
               <w:rPr>
@@ -2059,7 +2073,7 @@
                 <w:sz w:val="21"/>
                 <w:szCs w:val="21"/>
               </w:rPr>
-              <w:t xml:space="preserve">A job model predicts a job's best cap from the job's features. A transfer model scales a measured card's curve to a new card after one short test. It is validated by predicting each measured card from the others. Both report error bars and a range of validity. A short proof bounds how much is lost by using one cap per card.</w:t>
+              <w:t xml:space="preserve">A job model predicts a job's best cap from the job's features. A transfer model scales a measured card's curve to a new card after one short test. It is validated by predicting each measured card from the others. Both report error bars and a range of validity. A short proof gives an upper limit on the loss from using one cap per card.</w:t>
             </w:r>
             <w:r>
               <w:rPr>
@@ -2146,25 +2160,25 @@
                 <w:sz w:val="21"/>
                 <w:szCs w:val="21"/>
               </w:rPr>
-              <w:t xml:space="preserve">Decide, in real time, which job runs on which card and at what cap, to do the most useful work within a changing power limit. Then use the simulator to design the fleet: for an expected workload and power limit, compare each GPU option's cost with the revenue it earns at its estimated JP.</w:t>
-            </w:r>
-          </w:p>
-        </w:tc>
-        <w:tc>
-          <w:tcPr/>
-          <w:p>
-            <w:pPr>
-              <w:spacing w:line="317" w:lineRule="auto" w:before="20" w:after="20"/>
-              <w:widowControl w:val="0"/>
-              <w:pStyle w:val="Compact"/>
-              <w:jc w:val="both"/>
-            </w:pPr>
-            <w:r>
-              <w:rPr>
-                <w:sz w:val="21"/>
-                <w:szCs w:val="21"/>
-              </w:rPr>
-              <w:t xml:space="preserve">The controller makes both choices together, because moving a job changes the power left for the others. It is tested in a digital twin that replays the measured curves, against baselines with known exact answers. When power is tight it defers low-priority work and reports the cost. For a fixed placement, the best cap per card is already solved exactly [1]. That exact solution is the floor the joint heuristic must beat.</w:t>
+              <w:t xml:space="preserve">Decide, in real time, which job runs on which card and at what cap, to do the most useful work within a changing power limit. Then use the simulator to design the fleet. For an expected workload and power limit, compare each GPU option's cost with the revenue it earns at its estimated JP.</w:t>
+            </w:r>
+          </w:p>
+        </w:tc>
+        <w:tc>
+          <w:tcPr/>
+          <w:p>
+            <w:pPr>
+              <w:spacing w:line="317" w:lineRule="auto" w:before="20" w:after="20"/>
+              <w:widowControl w:val="0"/>
+              <w:pStyle w:val="Compact"/>
+              <w:jc w:val="both"/>
+            </w:pPr>
+            <w:r>
+              <w:rPr>
+                <w:sz w:val="21"/>
+                <w:szCs w:val="21"/>
+              </w:rPr>
+              <w:t xml:space="preserve">The controller makes both choices together, because moving a job changes the power left for the others. It is tested in a digital twin that replays the measured curves, against baselines with known exact answers. When power is tight, the controller delays low-priority work and reports the cost. For a fixed placement, the best cap per card is already solved exactly [1]. That exact solution is the floor the joint approximate method (heuristic) must beat.</w:t>
             </w:r>
             <w:r>
               <w:rPr>
@@ -2269,7 +2283,7 @@
                 <w:sz w:val="21"/>
                 <w:szCs w:val="21"/>
               </w:rPr>
-              <w:t xml:space="preserve">WP4 defines three contract terms. First, a committed power limit. Second, a flexibility offer: how many MW the facility sheds at the connection point, how fast (seconds), for how long (hours, through the evening peak), with how much notice, how many times per season, and how fast it recovers, with the work lost and the cost. Third, an auditable record of delivery. It demonstrates them on a rented metered server, so no operator site is needed, and at fleet scale in the twin under an Israeli firm-plus-flexible scenario.</w:t>
+              <w:t xml:space="preserve">WP4 defines three contract terms. First, a committed power limit. Second, a flexibility offer. It states how many MW the facility sheds (gives up) at the connection point, and how fast (seconds). It also states for how long (hours, through the evening peak), the notice needed, and how many times per season. Finally, it states how fast the facility recovers, the work lost and its cost. Third, a record of delivery that can be checked. WP4 demonstrates them on a rented metered server, so no operator site is needed. It also demonstrates them at fleet scale in the twin, under an Israeli firm-plus-flexible scenario.</w:t>
             </w:r>
             <w:r>
               <w:rPr>
@@ -2374,7 +2388,7 @@
                 <w:sz w:val="21"/>
                 <w:szCs w:val="21"/>
               </w:rPr>
-              <w:t xml:space="preserve">An incentive model shows why per-hour billing rewards the energy-worst point and which changes fix it. A simulation puts a value, in shekels per megawatt, on the flexible-connection option, using public figures: the TAOZ tariff, the Noga marginal price, and the Authority's capacity payment and curtailment right [19]. The project's energy-systems advisor (2.5.8) reviews the economics. Each rule is tested in the WP3 twin.</w:t>
+              <w:t xml:space="preserve">An incentive model shows why per-hour billing rewards the energy-worst point and which changes fix it. A simulation puts a value, in shekels per megawatt, on the flexible-connection option. It uses public figures: the TAOZ tariff, the Noga marginal price, and the Authority's capacity payment and curtailment right [19]. Curtailment means an ordered power reduction. The project's energy-systems advisor (2.5.8) reviews the economics. Each rule is tested in the WP3 twin.</w:t>
             </w:r>
             <w:r>
               <w:rPr>
@@ -2448,7 +2462,7 @@
         <w:t xml:space="preserve"> </w:t>
       </w:r>
       <w:r>
-        <w:t xml:space="preserve">Grid-following controllers [21] cut a facility to whatever power target the grid sets. JouleFlex instead runs each card at its measured best cap, and turns the flexibility that results into a contract: MW shed, ramp, hold duration and recovery, measured and audited.</w:t>
+        <w:t xml:space="preserve">Grid-following controllers [21] cut a facility to whatever power target the grid sets. JouleFlex instead runs each card at its measured best cap. It turns the resulting flexibility into a contract: MW shed, ramp (speed of change), hold duration and recovery, measured and checked.</w:t>
       </w:r>
     </w:p>
     <w:p>
@@ -2520,7 +2534,7 @@
         <w:t xml:space="preserve"> </w:t>
       </w:r>
       <w:r>
-        <w:t xml:space="preserve">Placing jobs and setting every cap at the energy minimum is one joint problem, which grid-following controllers [21] do not address. The JouleFlex engine is a first solution on measured curves.</w:t>
+        <w:t xml:space="preserve">Placing jobs and setting every cap at the energy minimum is one joint problem. Grid-following controllers [21] do not address it. The JouleFlex engine is a first solution on measured curves.</w:t>
       </w:r>
     </w:p>
     <w:bookmarkEnd w:id="34"/>
@@ -2553,7 +2567,7 @@
         <w:t xml:space="preserve"> </w:t>
       </w:r>
       <w:r>
-        <w:t xml:space="preserve">The core deliverable answers 16.2, and the methods land on three 2026 priorities (8, 16.1, 6.3). Clause by clause (Chapter 1 numbering):</w:t>
+        <w:t xml:space="preserve">The core deliverable answers 16.2, and the methods also serve three 2026 priorities (8, 16.1, 6.3). Clause by clause (Chapter 1 numbering):</w:t>
       </w:r>
     </w:p>
     <w:tbl>
@@ -2669,7 +2683,7 @@
                 <w:sz w:val="21"/>
                 <w:szCs w:val="21"/>
               </w:rPr>
-              <w:t xml:space="preserve">The core deliverable: the control engine manages a farm's power in real time, keeping each card at its best setting and the whole fleet under its committed power limit. The simulator shows how many cards fit behind a connection and how much power can be shed.</w:t>
+              <w:t xml:space="preserve">The core deliverable: the control engine manages a farm's power in real time. It keeps each card at its best setting and the whole fleet under its committed power limit. The simulator shows how many cards fit behind a connection and how much power can be shed.</w:t>
             </w:r>
           </w:p>
         </w:tc>
@@ -2744,7 +2758,7 @@
                 <w:sz w:val="21"/>
                 <w:szCs w:val="21"/>
               </w:rPr>
-              <w:t xml:space="preserve">Energy efficiency of a new industrial load class (8.1, 8.3): 29–31 percent less energy per task at the card [1] and 18–45 percent per served job at the fleet (simulation), in software on installed hardware.</w:t>
+              <w:t xml:space="preserve">Energy efficiency of a new industrial load class (8.1, 8.3): 29–31 percent less energy per task at the card [1], and 18–45 percent per served job at the fleet (simulation). Both come from software on installed hardware.</w:t>
             </w:r>
           </w:p>
         </w:tc>
@@ -2894,7 +2908,7 @@
                 <w:sz w:val="21"/>
                 <w:szCs w:val="21"/>
               </w:rPr>
-              <w:t xml:space="preserve">Demand management: a cap takes effect in about 0.2 s on one card, and the demonstration targets a 60-second ramp for a whole facility. The project supplies the ramp, hold-time and notice numbers that the Authority's hearing [19] needs to define a curtailment product for AI load.</w:t>
+              <w:t xml:space="preserve">Demand management: a cap takes effect in about 0.2 s on one card, and the demonstration aims at a 60-second ramp for a whole facility. The project supplies the ramp, hold-time and notice numbers that the Authority's hearing [19] needs to define a curtailment product for AI load.</w:t>
             </w:r>
           </w:p>
         </w:tc>
@@ -2953,7 +2967,7 @@
                 <w:sz w:val="21"/>
                 <w:szCs w:val="21"/>
               </w:rPr>
-              <w:t xml:space="preserve">Policy tools for efficient energy use (15.1): WP5 tests billing and connection rules in the twin and shows which reward the energy-optimal point. Decision support (15.3): the regulator-facing report quantifies firm-plus-flexible connections against the queue.</w:t>
+              <w:t xml:space="preserve">Policy tools for efficient energy use (15.1): WP5 tests billing and connection rules in the twin and shows which reward the energy-optimal point. Decision support (15.3): the report for regulators measures how much of the queue firm-plus-flexible connections could serve.</w:t>
             </w:r>
           </w:p>
         </w:tc>
@@ -2999,7 +3013,7 @@
         <w:t xml:space="preserve"> </w:t>
       </w:r>
       <w:r>
-        <w:t xml:space="preserve">[1] and its ELF dataset: about 5,500 instrumented measurements over 20 models and four GPUs (A100, A10G, L4 swept finely, T4 coarsely). Headline numbers: at the JP (43 to 46 percent of TDP), energy per task drops</w:t>
+        <w:t xml:space="preserve">[1] and its ELF dataset. The dataset holds about 5,500 measurements over 20 models and four GPUs (A100, A10G, L4 swept finely, T4 coarsely). Main numbers: at the JP (43 to 46 percent of TDP), energy per task drops</w:t>
       </w:r>
       <w:r>
         <w:t xml:space="preserve"> </w:t>
@@ -3044,7 +3058,7 @@
         <w:t xml:space="preserve"> </w:t>
       </w:r>
       <w:r>
-        <w:t xml:space="preserve">(191 ms measured). Supporting: the law fits with median R² = 0.99 per fixed-setting sweep (pooled per-card fits 0.88 to 0.92, Fig. A1). One fixed cap per card serves all twenty workloads, losing under one percent on average. Under strict deadlines, capping still saved 28 percent of energy while keeping 95 percent of the work's value. Under per-hour billing, the renter's cheapest choice is the most wasteful one. ELF and the code behind these numbers are openly released, so every figure is reproducible. WP1–WP3 extend them.</w:t>
+        <w:t xml:space="preserve">(191 ms measured). Supporting results: the law fits with median R² = 0.99 per fixed-setting sweep (pooled per-card fits 0.88 to 0.92, Fig. A1). One fixed cap per card serves all twenty workloads, losing under one percent on average. Under strict deadlines, capping still saved 28 percent of energy while keeping 95 percent of the work's value. Under per-hour billing, the renter's cheapest choice is the most wasteful one. ELF and the code behind these numbers are openly released, so every figure is reproducible. WP1–WP3 extend them.</w:t>
       </w:r>
     </w:p>
     <w:bookmarkEnd w:id="36"/>
@@ -3130,7 +3144,7 @@
         <w:t xml:space="preserve">planning (C3)</w:t>
       </w:r>
       <w:r>
-        <w:t xml:space="preserve">: a fleet-design tool, built on the simulator, that weighs each GPU option's cost against its expected revenue for a given workload and power limit. For</w:t>
+        <w:t xml:space="preserve">: a fleet-design tool built on the simulator. It weighs each GPU option's cost against its expected revenue for a given workload and power limit. For</w:t>
       </w:r>
       <w:r>
         <w:t xml:space="preserve"> </w:t>
@@ -3180,7 +3194,7 @@
         <w:t xml:space="preserve"> </w:t>
       </w:r>
       <w:r>
-        <w:t xml:space="preserve">The project turns a measured property of GPUs, the Joule Point, into a quantitative basis for treating AI computing as a flexible electrical load. It establishes how far the optimum holds across hardware, software and whole servers, and how much of a facility's power can be reduced, how quickly and for how long, while useful work is preserved. Today AI load is treated as fixed. These measurements, released as the open ELF-2 dataset, give the first evidence on how flexible it can be.</w:t>
+        <w:t xml:space="preserve">The project turns a measured property of GPUs, the Joule Point, into a numerical basis for treating AI computing as a flexible electrical load. It establishes how far the optimum holds across hardware, software and whole servers. It also measures how much of a facility's power can be reduced, how quickly and for how long, while useful work is preserved. Today AI load is treated as fixed. These measurements, released as the open ELF-2 dataset, give the first evidence on how flexible it can be.</w:t>
       </w:r>
     </w:p>
     <w:p>
@@ -3200,7 +3214,7 @@
         <w:t xml:space="preserve"> </w:t>
       </w:r>
       <w:r>
-        <w:t xml:space="preserve">The recent freeze on data-center connections [2] shows that grid connection is becoming a constraint on AI computing in Israel. Near its Joule Point a GPU does nearly the same work at much lower power, so the same connection can host more computing: up to about 50 percent more work per megawatt at the GPU, with the facility-level figure measured in WP1 and WP4. The same reduction can be applied on request at peak times. This is the kind of evidence that flexible-connection rules under discussion [19] depend on. Those rules envisage reduced supply for 100 to 200 hours a year, down to 60 percent of a connection, and a GPU at its Joule Point already draws about 40 percent less than its normal uncapped power. Regional scenario analysis (C4) then estimates how much of the connection queue such connections could serve. All savings and reductions quoted are relative to a GPU's normal uncapped draw.</w:t>
+        <w:t xml:space="preserve">The recent freeze on data-center connections [2] shows that grid connection is becoming a constraint on AI computing in Israel. Near its Joule Point a GPU does nearly the same work at much lower power, so the same connection can host more computing. The gain is up to about 50 percent more work per megawatt at the GPU. The facility-level figure is measured in WP1 and WP4. The same reduction can be applied on request at peak times. This is the kind of evidence that the flexible-connection rules under discussion [19] depend on. Those rules expect reduced supply for 100 to 200 hours a year, down to 60 percent of a connection. A GPU at its Joule Point already draws about 40 percent less than its normal uncapped power. Regional scenario analysis (C4) then estimates how much of the connection queue such connections could serve. All savings and reductions quoted are relative to a GPU's normal uncapped draw.</w:t>
       </w:r>
     </w:p>
     <w:p>
@@ -3220,7 +3234,7 @@
         <w:t xml:space="preserve"> </w:t>
       </w:r>
       <w:r>
-        <w:t xml:space="preserve">Operators gain lower energy per unit of work on existing hardware, through software alone: 29 to 31 percent per task, and 18 to 45 percent per served job in simulation (C1). Fleet-design methods (C3) show, before capital is committed, which GPUs give the best return under a power limit. Pricing models (C2) show how customers can be rewarded for efficient use of flexible power.</w:t>
+        <w:t xml:space="preserve">Operators gain lower energy per unit of work on existing hardware, through software alone. The gains are 29 to 31 percent per task, and 18 to 45 percent per served job in simulation (C1). Fleet-design methods (C3) show, before money is spent, which GPUs give the best return under a power limit. Pricing models (C2) show how customers can be rewarded for efficient use of flexible power.</w:t>
       </w:r>
     </w:p>
     <w:p>
@@ -3240,7 +3254,7 @@
         <w:t xml:space="preserve"> </w:t>
       </w:r>
       <w:r>
-        <w:t xml:space="preserve">The project and its open data will support multiple student projects at HIT, in computer science and other departments. These projects teach students how computing and energy are linked, preparing them for careers in AI, data centers and the energy sector.</w:t>
+        <w:t xml:space="preserve">The project and its open data will support several student projects at HIT, in computer science and other departments. These projects teach students how computing and energy are linked. They prepare students for careers in AI, data centers and the energy sector.</w:t>
       </w:r>
     </w:p>
     <w:bookmarkEnd w:id="39"/>
@@ -3411,7 +3425,7 @@
                 <w:sz w:val="21"/>
                 <w:szCs w:val="21"/>
               </w:rPr>
-              <w:t xml:space="preserve">WP1: extend the existing measurement software. Run H100/L40S and vLLM sweeps. Instrument board and server-input power.</w:t>
+              <w:t xml:space="preserve">WP1: extend the existing measurement software. Run H100/L40S and vLLM sweeps. Measure board and server-input power.</w:t>
             </w:r>
           </w:p>
         </w:tc>
@@ -3522,7 +3536,7 @@
                 <w:sz w:val="21"/>
                 <w:szCs w:val="21"/>
               </w:rPr>
-              <w:t xml:space="preserve">Server-input (BMC) wall tier validated. Validity domain documented, including the JP shift (in percentage points of TDP) at which the per-card constant breaks, set in advance.</w:t>
+              <w:t xml:space="preserve">Server-input (BMC) wall tier validated. Validity range documented. The JP shift (in percentage points of TDP) at which the per-card constant breaks is set in advance.</w:t>
             </w:r>
           </w:p>
         </w:tc>
@@ -3672,7 +3686,7 @@
                 <w:sz w:val="21"/>
                 <w:szCs w:val="21"/>
               </w:rPr>
-              <w:t xml:space="preserve">Energy per served job and on-time rate versus uncapped, single-cap and cap-only baselines. Target set in advance: at least 10 percent below cap-only at the same on-time rate (a gain over an already-capped fleet). No power overruns beyond WP1's meter noise in committed periods, and short violations in under 1 percent of intervals.</w:t>
+              <w:t xml:space="preserve">Energy per served job and on-time rate versus uncapped, single-cap and cap-only baselines. Target set in advance: at least 10 percent below cap-only at the same on-time rate (a gain over an already-capped fleet). No power overruns beyond WP1's meter noise in committed periods. Short violations in under 1 percent of intervals.</w:t>
             </w:r>
           </w:p>
         </w:tc>
@@ -3711,7 +3725,7 @@
                 <w:sz w:val="21"/>
                 <w:szCs w:val="21"/>
               </w:rPr>
-              <w:t xml:space="preserve">WP4–WP5: flexibility products, BMC-metered demonstration, incentive model, connection valuation on published Israeli data, and Israel scenario</w:t>
+              <w:t xml:space="preserve">WP4–WP5: flexibility products, BMC-metered demonstration, incentive model, connection value on published Israeli data, and Israel scenario</w:t>
             </w:r>
           </w:p>
         </w:tc>
@@ -3747,7 +3761,7 @@
                 <w:sz w:val="21"/>
                 <w:szCs w:val="21"/>
               </w:rPr>
-              <w:t xml:space="preserve">Sheddable power in MW of facility load at the connection point, and as a fraction of the measured uncapped draw. Full-power-to-JP tier: about 40 percent (exact fraction fixed by the M4 memo). JP-and-below tier: a floor set in advance of at least 15 percent of the committed JP power limit, reached within the ramp deadline at bounded SLO loss. Measured on a BMC-metered server and projected to fleet scale in the twin. Ramp within 60 seconds, hold time in hours through the evening peak, notice time, and recovery within 5 minutes, compatible with the curtailment right in the hearing [19]. Delivery-record compliance and service cost. C3 check: a twin-recommended fleet beats a same-cost uncapped design by a work margin stated in advance. Alignment condition per billing structure, confirmed in the twin. Option value per MW and break-even curtailment frequency, with sensitivity to every price input. C4 check: a scenario analysis on at least 3 transmission regions from public queue data, stating how much of each region's queue is served at each flexibility level.</w:t>
+              <w:t xml:space="preserve">Power that can be shed, in MW of facility load at the connection point, and as a fraction of the measured uncapped draw. Full-power-to-JP tier: about 40 percent (exact fraction fixed by the M4 memo). JP-and-below tier: a floor of at least 15 percent of the committed JP power limit, set in advance. It is reached within the ramp deadline at limited SLO loss. Measured on a BMC-metered server and projected to fleet scale in the twin. Ramp within 60 seconds, hold time in hours through the evening peak, notice time, and recovery within 5 minutes. These match the curtailment right in the hearing [19]. Delivery-record compliance and service cost. C3 check: a twin-recommended fleet beats a same-cost uncapped design by a work margin stated in advance. The condition under which each billing structure rewards efficient operation, confirmed in the twin. Option value per MW and break-even curtailment frequency, with sensitivity to every price input. C4 check: a scenario analysis on at least 3 transmission regions (grid areas) from public queue data. It states how much of each region's queue is served at each flexibility level.</w:t>
             </w:r>
           </w:p>
         </w:tc>
@@ -3822,7 +3836,7 @@
                 <w:sz w:val="21"/>
                 <w:szCs w:val="21"/>
               </w:rPr>
-              <w:t xml:space="preserve">Public repositories with reproducing pipelines. Metered validation. Final scientific and policy reports.</w:t>
+              <w:t xml:space="preserve">Public code repositories that reproduce every result. Metered validation. Final scientific and policy reports.</w:t>
             </w:r>
           </w:p>
         </w:tc>
@@ -3835,7 +3849,7 @@
         <w:jc w:val="both"/>
       </w:pPr>
       <w:r>
-        <w:t xml:space="preserve">The M4 preliminary memo, the M8 technical brief and the M21 policy draft are named deliverables, written in Hebrew for the Ministry, the Authority and Noga [19]. A result that shows where the method stops working also counts as a deliverable. Minimum-success path: H100/L40S validation, one serving engine, BMC wall measurement, the job and transfer models, the joint controller, and one Israeli flexibility scenario. B200-class cards, a second engine, fine-tuning and shared GPUs are extensions as access allows.</w:t>
+        <w:t xml:space="preserve">The M4 preliminary memo, the M8 technical brief and the M21 policy draft are named deliverables. They are written in Hebrew for the Ministry, the Authority and Noga [19]. A result that shows where the method stops working also counts as a deliverable. Minimum-success path: H100/L40S validation, one serving engine, BMC wall measurement, the job and transfer models, the joint controller, and one Israeli flexibility scenario. B200-class cards, a second engine, fine-tuning and shared GPUs are extensions as access allows.</w:t>
       </w:r>
     </w:p>
     <w:bookmarkEnd w:id="41"/>
@@ -4247,7 +4261,7 @@
                 <w:sz w:val="21"/>
                 <w:szCs w:val="21"/>
               </w:rPr>
-              <w:t xml:space="preserve">Postdoctoral researcher. Metered validation runs. Documentation, dissemination and publication.</w:t>
+              <w:t xml:space="preserve">Postdoctoral researcher. Metered validation runs. Documentation, publication and sharing of results.</w:t>
             </w:r>
           </w:p>
         </w:tc>
@@ -4310,7 +4324,7 @@
                 <w:sz w:val="21"/>
                 <w:szCs w:val="21"/>
               </w:rPr>
-              <w:t xml:space="preserve">Full itemization in the מפרט תקציבי</w:t>
+              <w:t xml:space="preserve">Full breakdown in the מפרט תקציבי</w:t>
             </w:r>
           </w:p>
         </w:tc>
@@ -4427,7 +4441,7 @@
                 <w:sz w:val="21"/>
                 <w:szCs w:val="21"/>
               </w:rPr>
-              <w:t xml:space="preserve">Production serving software (requests batched as they arrive, shifting phases) blurs the per-card constant</w:t>
+              <w:t xml:space="preserve">Production serving software (requests grouped as they arrive, shifting phases) weakens the per-card constant</w:t>
             </w:r>
           </w:p>
         </w:tc>
@@ -4548,7 +4562,7 @@
                 <w:sz w:val="21"/>
                 <w:szCs w:val="21"/>
               </w:rPr>
-              <w:t xml:space="preserve">AWS EC2 gives direct GPU access and full control. Where the lowest allowed cap is above the JP, limiting the clock speed reaches it instead (L4 [1]). Named bare-metal vendors with BMC metering have given dated quotes (GPU Mart and similar). Fallback: a metered power strip at the wall.</w:t>
+              <w:t xml:space="preserve">AWS EC2 gives direct GPU access and full control. Where the lowest allowed cap is above the JP, limiting the clock speed reaches it instead (L4 [1]). Named bare-metal vendors with BMC metering have given dated quotes (GPU Mart and similar). Backup: a metered power strip at the wall.</w:t>
             </w:r>
           </w:p>
         </w:tc>
@@ -4569,7 +4583,7 @@
                 <w:sz w:val="21"/>
                 <w:szCs w:val="21"/>
               </w:rPr>
-              <w:t xml:space="preserve">Postdoc recruitment slips, or the single hire is lost mid-project</w:t>
+              <w:t xml:space="preserve">Postdoc hiring is delayed, or the single hire is lost mid-project</w:t>
             </w:r>
           </w:p>
         </w:tc>
@@ -4675,7 +4689,7 @@
         <w:t xml:space="preserve"> </w:t>
       </w:r>
       <w:r>
-        <w:t xml:space="preserve">The PI produced the measured foundation this project extends: study [1] delivered the ELF dataset, the power-response law and the Joule Point, and its software, models and simulator are working code that WP1–WP3 extend directly. His engineering record is capacity-and-cost work of this kind: system-sizing at Amdocs (about $10M in savings) and cost-aware AI systems in industry. He has led industrial R&amp;D teams (Head of AI, Motorola Solutions Israel Innovation Center, and Head of Data Science, Questar) and, as group leader, delivered the technical milestones of an Israel-U.S. BIRD grant and an Israel Innovation Authority Magneton grant. Earlier work also addressed efficiency in computing: energy-efficient remote sensing [24] and efficient deep-network inference (CalexNet [25]).</w:t>
+        <w:t xml:space="preserve">The PI produced the measured foundation this project extends. Study [1] delivered the ELF dataset, the power-response law and the Joule Point. Its software, models and simulator are working code that WP1–WP3 extend directly. His engineering record is capacity-and-cost work of this kind: system-sizing at Amdocs (about $10M in savings) and cost-aware AI systems in industry. He has led industrial R&amp;D teams (Head of AI, Motorola Solutions Israel Innovation Center, and Head of Data Science, Questar). As group leader, he delivered the technical milestones of an Israel-U.S. BIRD grant and an Israel Innovation Authority Magneton grant. Earlier work also addressed efficiency in computing: energy-efficient remote sensing [24] and efficient deep-network inference (CalexNet [25]).</w:t>
       </w:r>
     </w:p>
     <w:p>
@@ -4695,7 +4709,7 @@
         <w:t xml:space="preserve"> </w:t>
       </w:r>
       <w:r>
-        <w:t xml:space="preserve">Prof. Moshe Tshuva (Afeka College of Engineering), a senior energy-systems engineer with two decades in energy management and efficiency, advises the project, unpaid, on the energy-systems and regulatory basis of the flexibility and valuation work.</w:t>
+        <w:t xml:space="preserve">Prof. Moshe Tshuva (Afeka College of Engineering) is a senior energy-systems engineer with two decades in energy management and efficiency. He advises the project, unpaid, on the energy-systems and regulatory basis of the flexibility and valuation work.</w:t>
       </w:r>
     </w:p>
     <w:p>
@@ -4715,7 +4729,7 @@
         <w:t xml:space="preserve"> </w:t>
       </w:r>
       <w:r>
-        <w:t xml:space="preserve">One postdoctoral researcher at 90% position, both years, extends the ELF software, models and simulator under the PI's direct supervision, reported within a month of signature (‎2.5). Profile: GPU systems, energy instrumentation, ML systems, optimization or control. The hiring-slip fallback is in 2.5.7.3. WP4 and WP5 run under the PI's direction, guided by the advisor, for sharing with the Authority and Noga during the hearing [19].</w:t>
+        <w:t xml:space="preserve">One postdoctoral researcher at 90% position, both years, extends the ELF software, models and simulator under the PI's direct supervision. The hire is reported within a month of signature (‎2.5). Profile: GPU systems, energy instrumentation, ML systems, optimization or control. The backup plan for a hiring delay is in 2.5.7.3. WP4 and WP5 run under the PI's direction, guided by the advisor, for sharing with the Authority and Noga during the hearing [19].</w:t>
       </w:r>
     </w:p>
     <w:p>

</xml_diff>

<commit_message>
Publish v2: switching-off rationale, objective wording; rebuilt PDF/DOCX, index, guide (EN 300 / HE 298)
Co-Authored-By: Claude Opus 5.5 <noreply@anthropic.com>
</commit_message>
<xml_diff>
--- a/JouleFlex-proposal-v2-2026-10-01.docx
+++ b/JouleFlex-proposal-v2-2026-10-01.docx
@@ -122,7 +122,7 @@
         <w:t xml:space="preserve">2.5.2 Abstract / תקציר</w:t>
       </w:r>
     </w:p>
-    <w:bookmarkStart w:id="22" w:name="english-299300-words"/>
+    <w:bookmarkStart w:id="22" w:name="english-300300-words"/>
     <w:p>
       <w:pPr>
         <w:keepLines w:val="0"/>
@@ -141,7 +141,7 @@
         <w:rPr>
           <w:color w:val="111111"/>
         </w:rPr>
-        <w:t xml:space="preserve">299</w:t>
+        <w:t xml:space="preserve">300</w:t>
       </w:r>
       <w:r>
         <w:rPr>
@@ -157,7 +157,7 @@
         <w:jc w:val="both"/>
       </w:pPr>
       <w:r>
-        <w:t xml:space="preserve">In July 2026 Israel's Electricity Authority froze new data-center grid connections for 140 days. The queue had reached about 27,000 MW, three times Israel's average demand [2]. One way forward, proposed in the Authority's June 2026 hearing [19], is flexible connection: the system operator may reduce the center's power at peak. Most of that power goes to GPUs, the chips that run AI. Today a data center adjusts by capping their power or switching some off.</w:t>
+        <w:t xml:space="preserve">In July 2026 Israel's Electricity Authority froze new data-center connections for 140 days. The queue had reached about 27,000 MW, three times Israel's average demand [2]. The Authority's June 2026 hearing [19] proposes flexible connection: the system operator may reduce a center's power at peak. Most of that power goes to GPUs, the chips that run AI. Today a data center adjusts by capping their power or switching some off.</w:t>
       </w:r>
     </w:p>
     <w:p>
@@ -167,7 +167,7 @@
         <w:jc w:val="both"/>
       </w:pPr>
       <w:r>
-        <w:t xml:space="preserve">The PI's study [1] shows that both are wasteful. Switching GPUs off loses their work. Capping too hard makes jobs run so long that the GPU's fixed baseline power costs more energy. Capping too little spends much more energy for little extra speed. Energy per task is therefore U-shaped. At its bottom, the Joule Point, each unit of energy does the most AI work. Measured on 20 AI models and four GPU types, it lies well below full power and cuts energy per task by 29 to 31 percent. A fleet simulation did the same work with 18 to 45 percent less energy. Capped GPUs draw less power, so more fit behind the same connection: up to about 50 percent more AI work per megawatt of GPU power. Servers and cooling draw power that capping does not cut, so the project measures the real gain at the building's meter.</w:t>
+        <w:t xml:space="preserve">The PI's study [1] shows that both are wasteful. Switching GPUs off leaves the rest at full power, with fewer GPUs to share the work. Capping too hard makes jobs run so long that the fixed baseline power wastes energy. Capping too little spends much more energy for little extra speed. Energy per task is therefore U-shaped. At its bottom, the Joule Point, each unit of energy does the most AI work. Measured on 20 AI models and four GPU types, it lies below full power and cuts energy per task by 29 to 31 percent. A fleet simulation did the same work with 18 to 45 percent less energy. Capped GPUs draw less power, so more fit behind the same connection: up to about 50 percent more AI work per megawatt of GPU power. Servers and cooling draw power that capping does not cut, so the project measures the real gain at the building's meter.</w:t>
       </w:r>
     </w:p>
     <w:p>
@@ -181,7 +181,7 @@
       </w:r>
     </w:p>
     <w:bookmarkEnd w:id="22"/>
-    <w:bookmarkStart w:id="23" w:name="עברית-292300-מילים"/>
+    <w:bookmarkStart w:id="23" w:name="עברית-298300-מילים"/>
     <w:p>
       <w:pPr>
         <w:keepLines w:val="0"/>
@@ -203,7 +203,7 @@
           <w:color w:val="111111"/>
           <w:rtl/>
         </w:rPr>
-        <w:t xml:space="preserve">292</w:t>
+        <w:t xml:space="preserve">298</w:t>
       </w:r>
       <w:r>
         <w:rPr>
@@ -240,7 +240,7 @@
           <w:lang w:val="he"/>
           <w:rtl/>
         </w:rPr>
-        <w:t xml:space="preserve">מחקר החוקר הראשי [1] מראה ששתי הדרכים בזבזניות. כיבוי מעבדים מוותר על העבודה שלהם. הגבלה חזקה מדי מאריכה את זמן הריצה, וצריכת הבסיס הקבועה של המעבד מצטברת. הגבלה חלשה מדי מוציאה הרבה יותר אנרגיה תמורת מעט מאוד מהירות נוספת. לכן האנרגיה למשימה יוצרת עקומה בצורת U. בתחתיתה נמצאת ה-Joule Point, הנקודה שבה כל יחידת אנרגיה מבצעת את מרב עבודת ה-AI. במדידות על 20 מודלים של AI וארבעה סוגי GPU היא נמצאה הרבה מתחת להספק המלא, והפחיתה את האנרגיה למשימה ב-29 עד 31 אחוז. סימולציית צי ביצעה עבודה זהה ב-18 עד 45 אחוז פחות אנרגיה. מעבדים מוגבלים צורכים פחות הספק, ולכן יותר מהם נכנסים מאחורי אותו חיבור: עד כ-50 אחוז יותר עבודת AI לכל מגה-וואט של הספק המעבדים. שרתים וקירור צורכים חשמל שהגבלת ההספק אינה מורידה, ולכן הפרויקט מודד את הרווח האמיתי במונה של המבנה.</w:t>
+        <w:t xml:space="preserve">מחקר החוקר הראשי [1] מראה ששתי הדרכים בזבזניות. כיבוי מעבדים משאיר פחות מעבדים לחלוקת העבודה, והנותרים ממשיכים לפעול בהספק מלא. הגבלה חזקה מדי מאריכה את זמן הריצה, וצריכת הבסיס הקבועה של המעבד מצטברת. הגבלה חלשה מדי מוציאה הרבה יותר אנרגיה תמורת מעט מאוד מהירות נוספת. לכן האנרגיה למשימה יוצרת עקומה בצורת U. בתחתיתה נמצאת ה-Joule Point, הנקודה שבה כל יחידת אנרגיה מבצעת את מרב עבודת ה-AI. במדידות על 20 מודלים של AI וארבעה סוגי GPU היא נמצאה הרבה מתחת להספק המלא, והפחיתה את האנרגיה למשימה ב-29 עד 31 אחוז. סימולציית צי ביצעה עבודה זהה ב-18 עד 45 אחוז פחות אנרגיה. מעבדים מוגבלים צורכים פחות הספק, ולכן יותר מהם נכנסים מאחורי אותו חיבור: עד כ-50 אחוז יותר עבודת AI לכל מגה-וואט של הספק המעבדים. שרתים וקירור צורכים חשמל שהגבלת ההספק אינה מורידה, ולכן הפרויקט מודד את הרווח האמיתי במונה של המבנה.</w:t>
       </w:r>
     </w:p>
     <w:p>
@@ -1090,7 +1090,7 @@
         <w:t xml:space="preserve"> </w:t>
       </w:r>
       <w:r>
-        <w:t xml:space="preserve">Today a data center adjusts its AI load by capping GPU power or by switching GPUs off. A GPU's power draw is a software setting. One command sets a cap. Within about 0.2 s the GPU uses less power and runs a little slower. Capping lets a facility fit its load to the power it has, and fit more GPUs behind one connection. Switching off loses work. Capping without measurement also wastes work.</w:t>
+        <w:t xml:space="preserve">Today a data center adjusts its AI load by capping GPU power or by switching GPUs off. A GPU's power draw is a software setting. One command sets a cap. Within about 0.2 s the GPU uses less power and runs a little slower. Capping lets a facility fit its load to the power it has, and fit more GPUs behind one connection. Switching GPUs off leaves fewer GPUs to share the work, and the rest still run at full power, the least efficient setting. Capping without measurement also wastes work.</w:t>
       </w:r>
     </w:p>
     <w:p>
@@ -1156,7 +1156,7 @@
         <w:t xml:space="preserve"> </w:t>
       </w:r>
       <w:r>
-        <w:t xml:space="preserve">is to research, validate and develop models and methods for controlling, pricing, planning and allocating power in AI data centers. These are data centers whose power supply is limited and changes over time. With these methods, a data center can be connected on condition of flexibility. It runs its GPUs near the Joule Point and lowers their power further when the grid asks.</w:t>
+        <w:t xml:space="preserve">is to research, validate and develop models and methods for controlling, pricing, planning and allocating power in AI data centers, based on the Joule Point concept. These are data centers whose power supply is limited and changes over time. With these methods, a data center can be connected on condition of flexibility. It runs its GPUs near the Joule Point and lowers their power further when the grid asks.</w:t>
       </w:r>
       <w:r>
         <w:t xml:space="preserve"> </w:t>

</xml_diff>

<commit_message>
Publish v2: deliverables in future tense
Co-Authored-By: Claude Opus 5.5 <noreply@anthropic.com>
</commit_message>
<xml_diff>
--- a/JouleFlex-proposal-v2-2026-10-01.docx
+++ b/JouleFlex-proposal-v2-2026-10-01.docx
@@ -1192,7 +1192,7 @@
         <w:t xml:space="preserve"> </w:t>
       </w:r>
       <w:r>
-        <w:t xml:space="preserve">Within 24 months the project delivers</w:t>
+        <w:t xml:space="preserve">Within 24 months the project will deliver</w:t>
       </w:r>
       <w:r>
         <w:t xml:space="preserve"> </w:t>
@@ -1205,7 +1205,7 @@
         <w:t xml:space="preserve">JouleFlex</w:t>
       </w:r>
       <w:r>
-        <w:t xml:space="preserve">, an open software toolkit built on the JP (minimum-success path in 2.5.7.1). Its core is a control engine (C1). It predicts the best power cap for each job and each GPU, and decides which GPU runs which job. It keeps the facility within its power limit while jobs meet their deadlines. Around it, the toolkit sets prices that reward efficient use of flexible power (C2). Today's per-hour billing instead pushes renters to full power. The toolkit designs the fleet (C3): for an expected workload and power limit, it picks which GPUs to buy, and how many. It weighs each GPU's cost against the revenue it earns at its estimated Joule Point. The toolkit also shows, region by region, how much of the queue could be connected if part of each connection were flexible (C4). A simulator built from the measurements tests all four. C3 and C4 are studies on public data, not deployed systems. Everything is released openly (2.5.6.1).</w:t>
+        <w:t xml:space="preserve">, an open software toolkit built on the JP (minimum-success path in 2.5.7.1). Its core will be a control engine (C1). It will predict the best power cap for each job and each GPU, and decide which GPU runs which job. It will keep the facility within its power limit while jobs meet their deadlines. Around it, the toolkit will set prices that reward efficient use of flexible power (C2). Today's per-hour billing instead pushes renters to full power. The toolkit will design the fleet (C3): for an expected workload and power limit, it will pick which GPUs to buy, and how many. It will weigh each GPU's cost against the revenue it earns at its estimated Joule Point. The toolkit will also show, region by region, how much of the queue could be connected if part of each connection were flexible (C4). A simulator built from the measurements will test all four. C3 and C4 will be studies on public data, not deployed systems. Everything will be released openly (2.5.6.1).</w:t>
       </w:r>
     </w:p>
     <w:bookmarkEnd w:id="26"/>

</xml_diff>

<commit_message>
Publish v2: C4 allocation reframing; fix corrupted Hebrew citations (2.5.9, Appendices A/B); EN 300 / HE 299
Co-Authored-By: Claude Opus 5.5 <noreply@anthropic.com>
</commit_message>
<xml_diff>
--- a/JouleFlex-proposal-v2-2026-10-01.docx
+++ b/JouleFlex-proposal-v2-2026-10-01.docx
@@ -177,11 +177,11 @@
         <w:jc w:val="both"/>
       </w:pPr>
       <w:r>
-        <w:t xml:space="preserve">Knowing this optimum turns flexibility from forced cutbacks into a design choice. This project builds the tools. Control keeps each GPU near its Joule Point and lowers power when the grid asks. Pricing rewards efficient use of flexible power. Planning sets how many GPUs to install behind a connection. Connection scenarios show, by region, how much of the queue flexible connections could serve. This gives a measured third option between full-power connection and refusal.</w:t>
+        <w:t xml:space="preserve">Knowing this optimum turns flexibility from forced cutbacks into a design choice. This project builds the tools. Control keeps each GPU near its Joule Point and lowers power when the grid asks. Pricing rewards efficient use of flexible power. Planning sets how many GPUs to install behind a connection. Allocation shares limited power among data centers by how efficiently each one uses it. This gives a measured third option between full-power connection and refusal.</w:t>
       </w:r>
     </w:p>
     <w:bookmarkEnd w:id="22"/>
-    <w:bookmarkStart w:id="23" w:name="עברית-298300-מילים"/>
+    <w:bookmarkStart w:id="23" w:name="עברית-299300-מילים"/>
     <w:p>
       <w:pPr>
         <w:keepLines w:val="0"/>
@@ -203,7 +203,7 @@
           <w:color w:val="111111"/>
           <w:rtl/>
         </w:rPr>
-        <w:t xml:space="preserve">298</w:t>
+        <w:t xml:space="preserve">299</w:t>
       </w:r>
       <w:r>
         <w:rPr>
@@ -255,7 +255,7 @@
           <w:lang w:val="he"/>
           <w:rtl/>
         </w:rPr>
-        <w:t xml:space="preserve">הכרת הנקודה המיטבית הופכת את הגמישות מקיצוץ כפוי לבחירה תכנונית. פרויקט זה בונה את הכלים לכך: בקרה שמחזיקה כל מעבד קרוב ל-Joule Point ומורידה את ההספק כשמנהל המערכת מבקש, תמחור שמתגמל שימוש יעיל בהספק גמיש, תכנון של מספר המעבדים שכדאי להתקין מאחורי חיבור נתון, ותרחישים שמראים כמה מצבר הבקשות ניתן לאשר עם ניהול גמיש של הצריכה, לפי אזור. כך נוצרת אפשרות שלישית ומדודה בין חיבור במלוא ההספק לבין סירוב.</w:t>
+        <w:t xml:space="preserve">הכרת הנקודה המיטבית הופכת את הגמישות מקיצוץ כפוי לבחירה תכנונית. פרויקט זה בונה את הכלים לכך: בקרה שמחזיקה כל מעבד קרוב ל-Joule Point ומורידה את ההספק כשמנהל המערכת מבקש, תמחור שמתגמל שימוש יעיל בהספק גמיש, תכנון של מספר המעבדים שכדאי להתקין מאחורי חיבור נתון, ושיטות להקצאת הספק מוגבל בין כמה חוות שרתים לפי יעילות השימוש באנרגיה של כל אחת. כך נוצרת אפשרות שלישית ומדודה בין חיבור במלוא ההספק לבין סירוב.</w:t>
       </w:r>
     </w:p>
     <w:bookmarkEnd w:id="23"/>
@@ -1205,7 +1205,7 @@
         <w:t xml:space="preserve">JouleFlex</w:t>
       </w:r>
       <w:r>
-        <w:t xml:space="preserve">, an open software toolkit built on the JP (minimum-success path in 2.5.7.1). Its core will be a control engine (C1). It will predict the best power cap for each job and each GPU, and decide which GPU runs which job. It will keep the facility within its power limit while jobs meet their deadlines. Around it, the toolkit will set prices that reward efficient use of flexible power (C2). Today's per-hour billing instead pushes renters to full power. The toolkit will design the fleet (C3): for an expected workload and power limit, it will pick which GPUs to buy, and how many. It will weigh each GPU's cost against the revenue it earns at its estimated Joule Point. The toolkit will also show, region by region, how much of the queue could be connected if part of each connection were flexible (C4). A simulator built from the measurements will test all four. C3 and C4 will be studies on public data, not deployed systems. Everything will be released openly (2.5.6.1).</w:t>
+        <w:t xml:space="preserve">, an open software toolkit built on the JP (minimum-success path in 2.5.7.1). Its core will be a control engine (C1). It will predict the best power cap for each job and each GPU, and decide which GPU runs which job. It will keep the facility within its power limit while jobs meet their deadlines. Around it, the toolkit will set prices that reward efficient use of flexible power (C2). Today's per-hour billing instead pushes renters to full power. The toolkit will design the fleet (C3): for an expected workload and power limit, it will pick which GPUs to buy, and how many. It will weigh each GPU's cost against the revenue it earns at its estimated Joule Point. The toolkit will also allocate limited power among several data centers (C4). It will weigh each center's fleet, how close it runs to its Joule Point, and practical limits such as location, so the grid gets the most useful AI work per megawatt. A simulator built from the measurements will test all four. C3 and C4 will be studies on public data, not deployed systems. Everything will be released openly (2.5.6.1).</w:t>
       </w:r>
     </w:p>
     <w:bookmarkEnd w:id="26"/>
@@ -1328,7 +1328,7 @@
         <w:t xml:space="preserve"> </w:t>
       </w:r>
       <w:r>
-        <w:t xml:space="preserve">How much power can a facility give back to the grid? How much of the connection queue could flexible connections serve, region by region? (WP4–WP5)</w:t>
+        <w:t xml:space="preserve">How should limited power be shared among several data centers, given each one's fleet, how efficiently it uses energy, and practical constraints such as location? How much power can each give back on request? (WP4–WP5)</w:t>
       </w:r>
     </w:p>
     <w:bookmarkEnd w:id="27"/>
@@ -1722,13 +1722,13 @@
           <w:b/>
           <w:bCs/>
         </w:rPr>
-        <w:t xml:space="preserve">Allocation (C4): flexibility is unmeasured.</w:t>
-      </w:r>
-      <w:r>
-        <w:t xml:space="preserve"> </w:t>
-      </w:r>
-      <w:r>
-        <w:t xml:space="preserve">All published numbers are GPU-board numbers. The grid measures the whole facility, where server and power-supply losses add to the fixed power floor and move the optimum. How much power an AI facility can give back, how fast, for how long and at what cost has never been measured. The Authority's open hearing on the large-load connection track [19] does not yet have these numbers.</w:t>
+        <w:t xml:space="preserve">Allocation (C4): power is shared without knowing its value.</w:t>
+      </w:r>
+      <w:r>
+        <w:t xml:space="preserve"> </w:t>
+      </w:r>
+      <w:r>
+        <w:t xml:space="preserve">No method yet compares data centers by how much useful AI work each megawatt would produce, or by how much power each can give back, how fast and for how long. Published numbers are GPU-board numbers, while the grid measures whole facilities, where server and power-supply losses add to the fixed power floor. The Authority's open hearing on the large-load connection track [19] does not yet have these numbers.</w:t>
       </w:r>
     </w:p>
     <w:bookmarkEnd w:id="31"/>
@@ -2370,7 +2370,7 @@
                 <w:sz w:val="21"/>
                 <w:szCs w:val="21"/>
               </w:rPr>
-              <w:t xml:space="preserve">Test, in the simulator, which pricing and connection rules reward efficient operation, and release everything openly.</w:t>
+              <w:t xml:space="preserve">Test, in the simulator, which pricing rules reward efficient operation and how to share limited power among several data centers. Release everything openly.</w:t>
             </w:r>
           </w:p>
         </w:tc>
@@ -3157,7 +3157,7 @@
         <w:t xml:space="preserve">allocation (C4)</w:t>
       </w:r>
       <w:r>
-        <w:t xml:space="preserve">: connection scenarios by region. The pricing and allocation results also appear in a policy report. Appendix Table A1 lists each piece and who uses it. Everything is released openly on delivery, crediting the Ministry's R&amp;D program under call 34/2026 [18].</w:t>
+        <w:t xml:space="preserve">: methods to share limited power among several data centers. The pricing and allocation results also appear in a policy report. Appendix Table A1 lists each piece and who uses it. Everything is released openly on delivery, crediting the Ministry's R&amp;D program under call 34/2026 [18].</w:t>
       </w:r>
     </w:p>
     <w:bookmarkEnd w:id="38"/>
@@ -3214,7 +3214,7 @@
         <w:t xml:space="preserve"> </w:t>
       </w:r>
       <w:r>
-        <w:t xml:space="preserve">The recent freeze on data-center connections [2] shows that grid connection is becoming a constraint on AI computing in Israel. Near its Joule Point a GPU does nearly the same work at much lower power, so the same connection can host more computing. The gain is up to about 50 percent more work per megawatt at the GPU. The facility-level figure is measured in WP1 and WP4. The same reduction can be applied on request at peak times. This is the kind of evidence that the flexible-connection rules under discussion [19] depend on. Those rules expect reduced supply for 100 to 200 hours a year, down to 60 percent of a connection. A GPU at its Joule Point already draws about 40 percent less than its normal uncapped power. Regional scenario analysis (C4) then estimates how much of the connection queue such connections could serve. All savings and reductions quoted are relative to a GPU's normal uncapped draw.</w:t>
+        <w:t xml:space="preserve">The recent freeze on data-center connections [2] shows that grid connection is becoming a constraint on AI computing in Israel. Near its Joule Point a GPU does nearly the same work at much lower power, so the same connection can host more computing. The gain is up to about 50 percent more work per megawatt at the GPU. The facility-level figure is measured in WP1 and WP4. The same reduction can be applied on request at peak times. This is the kind of evidence that the flexible-connection rules under discussion [19] depend on. Those rules expect reduced supply for 100 to 200 hours a year, down to 60 percent of a connection. A GPU at its Joule Point already draws about 40 percent less than its normal uncapped power. Allocation methods (C4) then show how limited power can be shared among data centers to get the most useful AI work from it. All savings and reductions quoted are relative to a GPU's normal uncapped draw.</w:t>
       </w:r>
     </w:p>
     <w:p>
@@ -3761,7 +3761,7 @@
                 <w:sz w:val="21"/>
                 <w:szCs w:val="21"/>
               </w:rPr>
-              <w:t xml:space="preserve">Power that can be shed, in MW of facility load at the connection point, and as a fraction of the measured uncapped draw. Full-power-to-JP tier: about 40 percent (exact fraction fixed by the M4 memo). JP-and-below tier: a floor of at least 15 percent of the committed JP power limit, set in advance. It is reached within the ramp deadline at limited SLO loss. Measured on a BMC-metered server and projected to fleet scale in the twin. Ramp within 60 seconds, hold time in hours through the evening peak, notice time, and recovery within 5 minutes. These match the curtailment right in the hearing [19]. Delivery-record compliance and service cost. C3 check: a twin-recommended fleet beats a same-cost uncapped design by a work margin stated in advance. The condition under which each billing structure rewards efficient operation, confirmed in the twin. Option value per MW and break-even curtailment frequency, with sensitivity to every price input. C4 check: a scenario analysis on at least 3 transmission regions (grid areas) from public queue data. It states how much of each region's queue is served at each flexibility level.</w:t>
+              <w:t xml:space="preserve">Power that can be shed, in MW of facility load at the connection point, and as a fraction of the measured uncapped draw. Full-power-to-JP tier: about 40 percent (exact fraction fixed by the M4 memo). JP-and-below tier: a floor of at least 15 percent of the committed JP power limit, set in advance. It is reached within the ramp deadline at limited SLO loss. Measured on a BMC-metered server and projected to fleet scale in the twin. Ramp within 60 seconds, hold time in hours through the evening peak, notice time, and recovery within 5 minutes. These match the curtailment right in the hearing [19]. Delivery-record compliance and service cost. C3 check: a twin-recommended fleet beats a same-cost uncapped design by a work margin stated in advance. The condition under which each billing structure rewards efficient operation, confirmed in the twin. Option value per MW and break-even curtailment frequency, with sensitivity to every price input. C4 check: a fixed power budget is allocated among several simulated data centers with different fleets. Useful AI work per megawatt is reported for each allocation rule.</w:t>
             </w:r>
           </w:p>
         </w:tc>
@@ -4785,7 +4785,7 @@
         <w:jc w:val="both"/>
       </w:pPr>
       <w:r>
-        <w:t xml:space="preserve">No other, complementary, or parallel student funding is taken or sought (‎1.5.2, §2.10).</w:t>
+        <w:t xml:space="preserve">No other, complementary, or parallel student funding is taken or sought (נספח טז'‎ §1.5.2, §2.10).</w:t>
       </w:r>
     </w:p>
     <w:bookmarkEnd w:id="46"/>
@@ -5617,7 +5617,7 @@
       </w:r>
     </w:p>
     <w:bookmarkEnd w:id="52"/>
-    <w:bookmarkStart w:id="62" w:name="X7f68e89c8a36aa61139e1c643be1bf8c67efc75"/>
+    <w:bookmarkStart w:id="62" w:name="X5d5bc83c2eef3c669b01ea2354df53c4eb22d2f"/>
     <w:p>
       <w:pPr>
         <w:keepLines w:val="0"/>
@@ -5633,7 +5633,7 @@
         <w:rPr>
           <w:color w:val="111111"/>
         </w:rPr>
-        <w:t xml:space="preserve">Appendix A: Figures (within the 5-page allowance of ‎2.2)</w:t>
+        <w:t xml:space="preserve">Appendix A: Figures (within the 5-page allowance of נספח א'1‎ §2.2)</w:t>
       </w:r>
     </w:p>
     <w:p>
@@ -5643,7 +5643,7 @@
         <w:jc w:val="both"/>
       </w:pPr>
       <w:r>
-        <w:t xml:space="preserve">JouleFlex · קול קורא 34/2026 · Appendix to the research proposal, permitted under ‎2.2 (graphs, tables and</w:t>
+        <w:t xml:space="preserve">JouleFlex · קול קורא 34/2026 · Appendix to the research proposal, permitted under נספח א'1‎ §2.2 (graphs, tables and</w:t>
       </w:r>
       <w:r>
         <w:t xml:space="preserve"> </w:t>

</xml_diff>

<commit_message>
Publish 12pt-compliant PDFs and aligned tables/figures/captions (v1 and v2)
Co-Authored-By: Claude Opus 5.5 <noreply@anthropic.com>
</commit_message>
<xml_diff>
--- a/JouleFlex-proposal-v2-2026-10-01.docx
+++ b/JouleFlex-proposal-v2-2026-10-01.docx
@@ -450,7 +450,7 @@
                 <w:sz w:val="21"/>
                 <w:szCs w:val="21"/>
               </w:rPr>
-              <w:t xml:space="preserve">The power cap at which energy per task is lowest for a given card. Measured at 43–46% of TDP on large GPUs.</w:t>
+              <w:t xml:space="preserve">The power cap at which energy per task is lowest for a given card. Measured at 43 to 46 percent of TDP on large GPUs.</w:t>
             </w:r>
           </w:p>
         </w:tc>
@@ -1136,7 +1136,7 @@
         <w:t xml:space="preserve">Joule Point (JP)</w:t>
       </w:r>
       <w:r>
-        <w:t xml:space="preserve">, and rises again below it. Airlines face the same trade-off. Flying faster burns much more fuel, but flying too slowly keeps the engines running longer. Planes therefore cruise at the speed that uses the least fuel per kilometer. The Joule Point is the GPU's cruising speed. Measured at the GPU board, the JP lies well below rated power (TDP). It is nearly the same for every job on a given card. At the JP a GPU uses 29–31 percent less energy per task and takes about 1.2 times longer. Run at the JP, a fixed connection delivers up to about 50 percent more AI work per connected megawatt. This is the measured A100 curve at the chip, to be confirmed at the facility meter. Running at maximum, today's default, is the energy-worst point. It is also the point the grid is sized for.</w:t>
+        <w:t xml:space="preserve">, and rises again below it. Airlines face the same trade-off. Flying faster burns much more fuel, but flying too slowly keeps the engines running longer. Planes therefore cruise at the speed that uses the least fuel per kilometer. The Joule Point is the GPU's cruising speed. Measured at the GPU board, the JP lies well below rated power (TDP). It is nearly the same for every job on a given card. At the JP a GPU uses 29–31 percent less energy per task and takes about 1.2 times longer. Run at the JP, a fixed connection delivers up to about 50 percent more AI work per connected megawatt (Fig. A3). This is the measured A100 curve at the chip, to be confirmed at the facility meter. Running at maximum, today's default, is the energy-worst point. It is also the point the grid is sized for.</w:t>
       </w:r>
     </w:p>
     <w:p>
@@ -2758,7 +2758,7 @@
                 <w:sz w:val="21"/>
                 <w:szCs w:val="21"/>
               </w:rPr>
-              <w:t xml:space="preserve">Energy efficiency of a new industrial load class (8.1, 8.3): 29–31 percent less energy per task at the card [1], and 18–45 percent per served job at the fleet (simulation). Both come from software on installed hardware.</w:t>
+              <w:t xml:space="preserve">Energy efficiency of a new industrial load class (8.1, 8.3): 29 to 31 percent less energy per task at the card [1], and 18 to 45 percent per served job at the fleet (simulation). Both come from software on installed hardware.</w:t>
             </w:r>
           </w:p>
         </w:tc>
@@ -2967,7 +2967,7 @@
                 <w:sz w:val="21"/>
                 <w:szCs w:val="21"/>
               </w:rPr>
-              <w:t xml:space="preserve">Policy tools for efficient energy use (15.1): WP5 tests billing and connection rules in the twin and shows which reward the energy-optimal point. Decision support (15.3): the report for regulators measures how much of the queue firm-plus-flexible connections could serve.</w:t>
+              <w:t xml:space="preserve">Policy tools for efficient energy use (15.1): WP5 tests billing and connection rules in the twin and shows which reward the energy-optimal point. Decision support (15.3): the policy report shows how limited power can be shared among data centers (C4), and how much power a flexible connection can give back.</w:t>
             </w:r>
           </w:p>
         </w:tc>
@@ -3029,7 +3029,7 @@
         <w:t xml:space="preserve"> </w:t>
       </w:r>
       <w:r>
-        <w:t xml:space="preserve">while jobs run 1.2 times longer. In a fleet simulation on the measured curves, energy per served job drops</w:t>
+        <w:t xml:space="preserve">while jobs run 1.2 times longer (Fig. A2). In a fleet simulation on the measured curves, energy per served job drops</w:t>
       </w:r>
       <w:r>
         <w:t xml:space="preserve"> </w:t>
@@ -3058,7 +3058,7 @@
         <w:t xml:space="preserve"> </w:t>
       </w:r>
       <w:r>
-        <w:t xml:space="preserve">(191 ms measured). Supporting results: the law fits with median R² = 0.99 per fixed-setting sweep (pooled per-card fits 0.88 to 0.92, Fig. A1). One fixed cap per card serves all twenty workloads, losing under one percent on average. Under strict deadlines, capping still saved 28 percent of energy while keeping 95 percent of the work's value. Under per-hour billing, the renter's cheapest choice is the most wasteful one. ELF and the code behind these numbers are openly released, so every figure is reproducible. WP1–WP3 extend them.</w:t>
+        <w:t xml:space="preserve">(191 ms measured). Supporting results: the law fits with median R² = 0.99 per fixed-setting sweep (pooled per-card fits 0.88 to 0.92, Fig. A1). One fixed cap per card serves all twenty workloads, losing under one percent on average. Under strict deadlines, capping still saved 28 percent of energy while keeping 95 percent of the work's value. ELF and the code behind these numbers are openly released, so every figure is reproducible. WP1–WP3 extend them.</w:t>
       </w:r>
     </w:p>
     <w:bookmarkEnd w:id="36"/>
@@ -3157,7 +3157,7 @@
         <w:t xml:space="preserve">allocation (C4)</w:t>
       </w:r>
       <w:r>
-        <w:t xml:space="preserve">: methods to share limited power among several data centers. The pricing and allocation results also appear in a policy report. Appendix Table A1 lists each piece and who uses it. Everything is released openly on delivery, crediting the Ministry's R&amp;D program under call 34/2026 [18].</w:t>
+        <w:t xml:space="preserve">: methods to share limited power among several data centers. The pricing and allocation results also appear in a policy report. Appendix Table A1 lists the five software and data artifacts and who uses them. Everything is released openly on delivery, crediting the Ministry's R&amp;D program under call 34/2026 [18].</w:t>
       </w:r>
     </w:p>
     <w:bookmarkEnd w:id="38"/>
@@ -3214,7 +3214,7 @@
         <w:t xml:space="preserve"> </w:t>
       </w:r>
       <w:r>
-        <w:t xml:space="preserve">The recent freeze on data-center connections [2] shows that grid connection is becoming a constraint on AI computing in Israel. Near its Joule Point a GPU does nearly the same work at much lower power, so the same connection can host more computing. The gain is up to about 50 percent more work per megawatt at the GPU. The facility-level figure is measured in WP1 and WP4. The same reduction can be applied on request at peak times. This is the kind of evidence that the flexible-connection rules under discussion [19] depend on. Those rules expect reduced supply for 100 to 200 hours a year, down to 60 percent of a connection. A GPU at its Joule Point already draws about 40 percent less than its normal uncapped power. Allocation methods (C4) then show how limited power can be shared among data centers to get the most useful AI work from it. All savings and reductions quoted are relative to a GPU's normal uncapped draw.</w:t>
+        <w:t xml:space="preserve">The recent freeze on data-center connections [2] shows that grid connection is becoming a constraint on AI computing in Israel. Near its Joule Point a GPU does nearly the same work at much lower power, so the same connection can host more computing. The gain is up to about 50 percent more work per megawatt at the GPU. The facility-level figure is measured in WP1 and WP4. The same reduction can be applied on request at peak times. This is the kind of evidence that the flexible-connection rules under discussion [19] depend on. Those rules expect reduced supply for 100 to 200 hours a year, down to 60 percent of a connection. A GPU at its Joule Point already draws about 40 percent less than its normal uncapped power. Allocation methods (C4) then show how limited power can be shared among data centers to get the most useful AI work from it.</w:t>
       </w:r>
     </w:p>
     <w:p>
@@ -3234,7 +3234,7 @@
         <w:t xml:space="preserve"> </w:t>
       </w:r>
       <w:r>
-        <w:t xml:space="preserve">Operators gain lower energy per unit of work on existing hardware, through software alone. The gains are 29 to 31 percent per task, and 18 to 45 percent per served job in simulation (C1). Fleet-design methods (C3) show, before money is spent, which GPUs give the best return under a power limit. Pricing models (C2) show how customers can be rewarded for efficient use of flexible power.</w:t>
+        <w:t xml:space="preserve">Operators gain lower energy per unit of work on existing hardware, through software alone (C1, 2.5.5.8). Fleet-design methods (C3) show, before money is spent, which GPUs give the best return under a power limit. Pricing models (C2) show how customers can be rewarded for efficient use of flexible power.</w:t>
       </w:r>
     </w:p>
     <w:p>
@@ -4324,7 +4324,7 @@
                 <w:sz w:val="21"/>
                 <w:szCs w:val="21"/>
               </w:rPr>
-              <w:t xml:space="preserve">Full breakdown in the מפרט תקציבי</w:t>
+              <w:t xml:space="preserve">Full breakdown in Appendix C (budget specification, Hebrew)</w:t>
             </w:r>
           </w:p>
         </w:tc>
@@ -5714,19 +5714,7 @@
         <w:t xml:space="preserve"> </w:t>
       </w:r>
       <w:r>
-        <w:t xml:space="preserve">The response law is a card property. One panel per GPU (A100, A10G, L4); each dot</w:t>
-      </w:r>
-      <w:r>
-        <w:t xml:space="preserve"> </w:t>
-      </w:r>
-      <w:r>
-        <w:t xml:space="preserve">is a measured operating point for one of the 20 workloads in the loaded regime, rate normalized to the workload's own</w:t>
-      </w:r>
-      <w:r>
-        <w:t xml:space="preserve"> </w:t>
-      </w:r>
-      <w:r>
-        <w:t xml:space="preserve">maximum and power to the card's TDP. All workloads follow a single fitted law per card,</w:t>
+        <w:t xml:space="preserve">The power curve belongs to the card, not the job. One panel per GPU (A100, A10G, L4). Each dot is one measured operating point for one of the 20 workloads. Rate is scaled to the workload's own maximum, and power to the card's TDP. All 20 workloads on a card follow one fitted law,</w:t>
       </w:r>
       <w:r>
         <w:t xml:space="preserve"> </w:t>
@@ -5811,12 +5799,6 @@
         <w:t xml:space="preserve"> </w:t>
       </w:r>
       <w:r>
-        <w:t xml:space="preserve">per-card</w:t>
-      </w:r>
-      <w:r>
-        <w:t xml:space="preserve"> </w:t>
-      </w:r>
-      <w:r>
         <w:rPr>
           <w:i/>
           <w:iCs/>
@@ -5833,13 +5815,7 @@
         <w:t xml:space="preserve"> </w:t>
       </w:r>
       <w:r>
-        <w:t xml:space="preserve">of 0.88 to 0.92; per-sweep fits higher, median 0.99), showing the exponent travels with the card rather than the model. This</w:t>
-      </w:r>
-      <w:r>
-        <w:t xml:space="preserve"> </w:t>
-      </w:r>
-      <w:r>
-        <w:t xml:space="preserve">is the empirical basis for the one-time per-card characterization that WP2 turns into a transfer model.</w:t>
+        <w:t xml:space="preserve">0.88 to 0.92 per card, median 0.99 per sweep). This is why one short test per card is enough, which WP2 turns into the transfer model.</w:t>
       </w:r>
     </w:p>
     <w:p>
@@ -5904,31 +5880,7 @@
         <w:t xml:space="preserve"> </w:t>
       </w:r>
       <w:r>
-        <w:t xml:space="preserve">Every card has an energy U-shape. Energy per inference, normalized to each card's</w:t>
-      </w:r>
-      <w:r>
-        <w:t xml:space="preserve"> </w:t>
-      </w:r>
-      <w:r>
-        <w:t xml:space="preserve">own uncapped value, against board draw as a fraction of TDP; the dot marks the JP, the shaded band one standard</w:t>
-      </w:r>
-      <w:r>
-        <w:t xml:space="preserve"> </w:t>
-      </w:r>
-      <w:r>
-        <w:t xml:space="preserve">deviation over repetitions. On the large GPUs the minimum sits at 43–46 percent of TDP and capping to it cuts energy per</w:t>
-      </w:r>
-      <w:r>
-        <w:t xml:space="preserve"> </w:t>
-      </w:r>
-      <w:r>
-        <w:t xml:space="preserve">inference by 29–31 percent; on the L4 the interior minimum lies below the power cap's reachable floor and is exposed by</w:t>
-      </w:r>
-      <w:r>
-        <w:t xml:space="preserve"> </w:t>
-      </w:r>
-      <w:r>
-        <w:t xml:space="preserve">the graphics clock instead, mapping which actuator applies to which card class.</w:t>
+        <w:t xml:space="preserve">Every card has an energy U-shape. Energy per inference, relative to each card's uncapped value, against board power as a percent of TDP. The dot marks the Joule Point, and the shaded band is one standard deviation over repeats. On the large GPUs the minimum lies at 43 to 46 percent of TDP, and capping to it cuts energy per inference by 29 to 31 percent. On the L4 the power cap cannot go low enough, so the minimum is reached by lowering the clock speed instead.</w:t>
       </w:r>
     </w:p>
     <w:p>
@@ -5993,25 +5945,7 @@
         <w:t xml:space="preserve"> </w:t>
       </w:r>
       <w:r>
-        <w:t xml:space="preserve">When power, not capital, binds, the JP is the interior optimum. Behind a</w:t>
-      </w:r>
-      <w:r>
-        <w:t xml:space="preserve"> </w:t>
-      </w:r>
-      <w:r>
-        <w:t xml:space="preserve">fixed 1 MW feed (A100, ViT-B/32 at batch 64), installing more GPUs forces each to a deeper cap, shifting the megawatt</w:t>
-      </w:r>
-      <w:r>
-        <w:t xml:space="preserve"> </w:t>
-      </w:r>
-      <w:r>
-        <w:t xml:space="preserve">from useful dynamic compute (blue) to the static idle floor (grey). Served inferences per megawatt (red) peak at the</w:t>
-      </w:r>
-      <w:r>
-        <w:t xml:space="preserve"> </w:t>
-      </w:r>
-      <w:r>
-        <w:t xml:space="preserve">JP, near 5,500 installed cards, about 50 percent above the uncapped configuration. This is the capacity lever the Israel demonstration (WP4) operationalizes: under a rationed connection, efficiency becomes throughput. The same measured curves, allocated exactly across a fleet, dominate uncapped operation at every power budget from 100 down to 40 percent of total TDP; the preliminary measured-curve fleet simulation result appears in section 2.5.5.8.</w:t>
+        <w:t xml:space="preserve">When power is the limit, the Joule Point is the best operating point. Behind a fixed 1 MW connection (A100, ViT-B/32, batch 64), each extra card forces a deeper cap on all cards. Blue is power doing useful work, grey the fixed idle power. Inferences served per megawatt (red) peak at the Joule Point, near 5,500 cards, about 50 percent above the uncapped layout. Per-request latency there is 1.4 times the uncapped value (orange). The 1.2 times figure in the text is the runtime per task at the JP. This is the fleet-design question of C3 (WP3): how many cards to install behind a fixed connection.</w:t>
       </w:r>
     </w:p>
     <w:bookmarkEnd w:id="62"/>
@@ -6158,25 +6092,25 @@
                 <w:sz w:val="21"/>
                 <w:szCs w:val="21"/>
               </w:rPr>
-              <w:t xml:space="preserve">An open dataset: power, throughput and latency at every operating point, board to wall, on current GPUs and production serving software</w:t>
-            </w:r>
-          </w:p>
-        </w:tc>
-        <w:tc>
-          <w:tcPr/>
-          <w:p>
-            <w:pPr>
-              <w:spacing w:line="317" w:lineRule="auto" w:before="20" w:after="20"/>
-              <w:widowControl w:val="0"/>
-              <w:pStyle w:val="Compact"/>
-              <w:jc w:val="both"/>
-            </w:pPr>
-            <w:r>
-              <w:rPr>
-                <w:sz w:val="21"/>
-                <w:szCs w:val="21"/>
-              </w:rPr>
-              <w:t xml:space="preserve">Researchers and vendors, as ground truth; every other deliverable is built and validated on it</w:t>
+              <w:t xml:space="preserve">An open dataset: power, throughput and latency at every operating point, from the GPU board to the server input, on current GPUs and production serving software</w:t>
+            </w:r>
+          </w:p>
+        </w:tc>
+        <w:tc>
+          <w:tcPr/>
+          <w:p>
+            <w:pPr>
+              <w:spacing w:line="317" w:lineRule="auto" w:before="20" w:after="20"/>
+              <w:widowControl w:val="0"/>
+              <w:pStyle w:val="Compact"/>
+              <w:jc w:val="both"/>
+            </w:pPr>
+            <w:r>
+              <w:rPr>
+                <w:sz w:val="21"/>
+                <w:szCs w:val="21"/>
+              </w:rPr>
+              <w:t xml:space="preserve">Researchers and vendors, as ground truth. Every other artifact is built and validated on it</w:t>
             </w:r>
           </w:p>
         </w:tc>
@@ -6217,7 +6151,7 @@
                 <w:sz w:val="21"/>
                 <w:szCs w:val="21"/>
               </w:rPr>
-              <w:t xml:space="preserve">Software plus protocol: a one-test procedure and the two fitted models placing the JP of a job or of a new, unmeasured card within the validated hardware domain, in hours</w:t>
+              <w:t xml:space="preserve">Software plus a protocol: one short test and two fitted models that find the Joule Point of a new job or a new card within hours, inside the range of hardware the project has validated</w:t>
             </w:r>
           </w:p>
         </w:tc>
@@ -6276,25 +6210,25 @@
                 <w:sz w:val="21"/>
                 <w:szCs w:val="21"/>
               </w:rPr>
-              <w:t xml:space="preserve">An open-source control engine that assigns jobs and sets caps to keep a fleet inside its envelope, evaluated in the twin and demonstrated on a metered rented server before any deployment</w:t>
-            </w:r>
-          </w:p>
-        </w:tc>
-        <w:tc>
-          <w:tcPr/>
-          <w:p>
-            <w:pPr>
-              <w:spacing w:line="317" w:lineRule="auto" w:before="20" w:after="20"/>
-              <w:widowControl w:val="0"/>
-              <w:pStyle w:val="Compact"/>
-              <w:jc w:val="both"/>
-            </w:pPr>
-            <w:r>
-              <w:rPr>
-                <w:sz w:val="21"/>
-                <w:szCs w:val="21"/>
-              </w:rPr>
-              <w:t xml:space="preserve">An AI data-center manager, to cut energy per job and honor a committed envelope; its report doubles as the compliance record</w:t>
+              <w:t xml:space="preserve">An open-source control engine that assigns jobs and sets caps to keep a fleet inside its power limit, evaluated in the twin and demonstrated on a metered rented server before any deployment</w:t>
+            </w:r>
+          </w:p>
+        </w:tc>
+        <w:tc>
+          <w:tcPr/>
+          <w:p>
+            <w:pPr>
+              <w:spacing w:line="317" w:lineRule="auto" w:before="20" w:after="20"/>
+              <w:widowControl w:val="0"/>
+              <w:pStyle w:val="Compact"/>
+              <w:jc w:val="both"/>
+            </w:pPr>
+            <w:r>
+              <w:rPr>
+                <w:sz w:val="21"/>
+                <w:szCs w:val="21"/>
+              </w:rPr>
+              <w:t xml:space="preserve">An AI data-center manager, to cut energy per job and keep a committed power limit. Its report also serves as the compliance record</w:t>
             </w:r>
           </w:p>
         </w:tc>
@@ -6335,25 +6269,25 @@
                 <w:sz w:val="21"/>
                 <w:szCs w:val="21"/>
               </w:rPr>
-              <w:t xml:space="preserve">A simulator replaying the measured curves of a described fleet and job mix, evaluating any policy or envelope scenario exactly before hardware is touched</w:t>
-            </w:r>
-          </w:p>
-        </w:tc>
-        <w:tc>
-          <w:tcPr/>
-          <w:p>
-            <w:pPr>
-              <w:spacing w:line="317" w:lineRule="auto" w:before="20" w:after="20"/>
-              <w:widowControl w:val="0"/>
-              <w:pStyle w:val="Compact"/>
-              <w:jc w:val="both"/>
-            </w:pPr>
-            <w:r>
-              <w:rPr>
-                <w:sz w:val="21"/>
-                <w:szCs w:val="21"/>
-              </w:rPr>
-              <w:t xml:space="preserve">An operator testing policies before deployment; a planner or regulator asking what a proposed facility could deliver and shed under a given connection</w:t>
+              <w:t xml:space="preserve">A simulator replaying the measured curves of a described fleet and job mix, evaluating any policy or power-limit scenario exactly before hardware is touched</w:t>
+            </w:r>
+          </w:p>
+        </w:tc>
+        <w:tc>
+          <w:tcPr/>
+          <w:p>
+            <w:pPr>
+              <w:spacing w:line="317" w:lineRule="auto" w:before="20" w:after="20"/>
+              <w:widowControl w:val="0"/>
+              <w:pStyle w:val="Compact"/>
+              <w:jc w:val="both"/>
+            </w:pPr>
+            <w:r>
+              <w:rPr>
+                <w:sz w:val="21"/>
+                <w:szCs w:val="21"/>
+              </w:rPr>
+              <w:t xml:space="preserve">An operator testing policies before deployment. A planner or regulator asking what a proposed facility could deliver and shed under a given connection</w:t>
             </w:r>
           </w:p>
         </w:tc>
@@ -6394,7 +6328,7 @@
                 <w:sz w:val="21"/>
                 <w:szCs w:val="21"/>
               </w:rPr>
-              <w:t xml:space="preserve">A blueprint: open formats for the envelope commitment, the flexibility offer and the delivery record, plus a regulator-facing report quantifying firm-plus-flexible connections against the national queue</w:t>
+              <w:t xml:space="preserve">A blueprint: open formats for the power-limit commitment, the flexibility offer and the delivery record, plus a policy report: pricing rules that reward efficient use of flexible power (C2) and methods to share limited power among data centers (C4)</w:t>
             </w:r>
           </w:p>
         </w:tc>
@@ -6425,25 +6359,7 @@
         <w:jc w:val="both"/>
       </w:pPr>
       <w:r>
-        <w:t xml:space="preserve">Table A1.</w:t>
-      </w:r>
-      <w:r>
-        <w:t xml:space="preserve"> </w:t>
-      </w:r>
-      <w:r>
-        <w:t xml:space="preserve">The chain of use is direct: ELF-2 calibrates the models, the models feed the</w:t>
-      </w:r>
-      <w:r>
-        <w:t xml:space="preserve"> </w:t>
-      </w:r>
-      <w:r>
-        <w:t xml:space="preserve">controller, the twin proves the controller before deployment, and the grid interface turns the controlled facility</w:t>
-      </w:r>
-      <w:r>
-        <w:t xml:space="preserve"> </w:t>
-      </w:r>
-      <w:r>
-        <w:t xml:space="preserve">into something the regulator can contract with.</w:t>
+        <w:t xml:space="preserve">The chain of use is direct: ELF-2 calibrates the models, the models feed the controller, the simulator tests the controller before deployment, and the grid interface links the controlled facility to the grid's flexibility rules.</w:t>
       </w:r>
     </w:p>
     <w:bookmarkEnd w:id="63"/>

</xml_diff>